<commit_message>
docs: integrate Timefold review and configurable Community benchmark design
</commit_message>
<xml_diff>
--- a/docs/timefold-audit/Timefold_Audit.docx
+++ b/docs/timefold-audit/Timefold_Audit.docx
@@ -65,7 +65,7 @@
         <w:keepLines w:val="0"/>
       </w:pPr>
       <w:r>
-        <w:t>This report is a complete rewrite of the earlier audit. It retains TF01 through TF14 for traceability, integrates their explanations into the relevant chapters, and expands TF07 into a benchmark implementation specification. It proposes runtime changes but implements none. No new performance campaign, production savings estimate, or capacity certification accompanies this revision.</w:t>
+        <w:t>This report retains TF01 through TF14, integrates CR01 through CR11 from the supplied second review into the relevant chapters, and specifies a configurable Community Edition benchmark design. Correctness, benchmark foundations, and allocation profiling precede performance changes. Campaign coverage, per-solve allowances, and execution resources are separate decisions. It proposes runtime changes but implements none. No new performance campaign, production savings estimate, or capacity certification accompanies this revision.</w:t>
       </w:r>
     </w:p>
     <w:p>
@@ -452,6 +452,65 @@
           </w:p>
         </w:tc>
       </w:tr>
+      <w:tr>
+        <w:trPr>
+          <w:cantSplit/>
+        </w:trPr>
+        <w:tc>
+          <w:tcPr>
+            <w:tcW w:type="dxa" w:w="2160"/>
+            <w:vAlign w:val="center"/>
+            <w:tcMar>
+              <w:top w:w="100" w:type="dxa"/>
+              <w:left w:w="100" w:type="dxa"/>
+              <w:bottom w:w="100" w:type="dxa"/>
+              <w:right w:w="100" w:type="dxa"/>
+            </w:tcMar>
+            <w:shd w:fill="F4F8FB"/>
+          </w:tcPr>
+          <w:p>
+            <w:pPr>
+              <w:widowControl/>
+              <w:spacing w:after="40" w:before="40" w:line="250" w:lineRule="auto"/>
+            </w:pPr>
+            <w:r>
+              <w:rPr>
+                <w:b/>
+                <w:color w:val="000000"/>
+                <w:sz w:val="20"/>
+              </w:rPr>
+              <w:t>Edition and configuration</w:t>
+            </w:r>
+          </w:p>
+        </w:tc>
+        <w:tc>
+          <w:tcPr>
+            <w:tcW w:type="dxa" w:w="7920"/>
+            <w:vAlign w:val="center"/>
+            <w:tcMar>
+              <w:top w:w="100" w:type="dxa"/>
+              <w:left w:w="100" w:type="dxa"/>
+              <w:bottom w:w="100" w:type="dxa"/>
+              <w:right w:w="100" w:type="dxa"/>
+            </w:tcMar>
+            <w:shd w:fill="F4F8FB"/>
+          </w:tcPr>
+          <w:p>
+            <w:pPr>
+              <w:widowControl/>
+              <w:spacing w:after="40" w:before="40" w:line="250" w:lineRule="auto"/>
+            </w:pPr>
+            <w:r>
+              <w:rPr>
+                <w:b w:val="0"/>
+                <w:color w:val="000000"/>
+                <w:sz w:val="20"/>
+              </w:rPr>
+              <w:t>Use Community Edition only. One versioned JSON file declares all adjustable campaign parameters; the CLI selects the file and operation. Examples are design guidance, not implemented runner interfaces.</w:t>
+            </w:r>
+          </w:p>
+        </w:tc>
+      </w:tr>
     </w:tbl>
     <w:p>
       <w:pPr>
@@ -519,7 +578,7 @@
         <w:keepLines w:val="0"/>
       </w:pPr>
       <w:r>
-        <w:t>The installed solver is 2.6.0. The local guide describes 2.7-era functionality. Live official checks on 6 October returned a 2.7.0 benchmarking page and 2.7.1 performance and local-search pages. Latest URLs are therefore navigation aids, not immutable version evidence. Proposed APIs and XML must be compiled and exercised against the selected installed version. An upgrade is a separate treatment, not an invisible prerequisite for this report.</w:t>
+        <w:t>The installed solver is 2.6.0. The local guide describes 2.7-era functionality. Earlier official checks on 6 October returned a 2.7.0 benchmarking page and 2.7.1 performance and local-search pages. This revision also checked the official algorithm and score overview pages, labeled 2.7.1. Latest URLs are therefore navigation aids, not immutable version evidence. Proposed APIs and XML must be compiled and exercised against the selected installed version. An upgrade is a separate treatment, not an invisible prerequisite for this report.</w:t>
       </w:r>
     </w:p>
     <w:p>
@@ -559,7 +618,7 @@
         <w:keepLines w:val="0"/>
       </w:pPr>
       <w:r>
-        <w:t>Daily optimization starts from an assigned, validated schedule. DailySolver builds a fresh solver and copied plan for each phase. The reference phase minimizes overtime before cost. The fairness phase fixes the reference overtime target and permits cost up to the policy ceiling, normally two percent above reference cost. The application independently checks the result before preview and again before guarded application. Ordinary preview allocates ten seconds to reference and the remainder of a nominal fifteen seconds to fairness. Absence repair is a separate workload. See C03 through C06.</w:t>
+        <w:t>Daily optimization starts from an assigned, validated schedule. DailySolver reuses its SolverFactory and builds a fresh solver and copied plan for each phase. Preserve one factory per effective configuration and independent planning state per solve. The reference phase minimizes overtime before cost. The fairness phase fixes the reference overtime target and permits cost up to the policy ceiling, normally two percent above reference cost. The application independently checks the result before preview and again before guarded application. Ordinary preview allocates ten seconds to reference and the remainder of a nominal fifteen seconds to fairness. Absence repair is a separate workload. See C03 through C06.</w:t>
       </w:r>
     </w:p>
     <w:p>
@@ -728,7 +787,7 @@
         <w:t xml:space="preserve">Guidance and change: </w:t>
       </w:r>
       <w:r>
-        <w:t xml:space="preserve">Construction heuristics create an initial assignment; local search improves an existing one. For v1 of the extracted boundary, explicitly declare whether the endpoint accepts assigned plans only. Reject unassigned or partially assigned input until a supported construction path is implemented. If cold planning is required, add construction and coverage validation, then benchmark cold, partial, feasible warm, and infeasible repair inputs separately. </w:t>
+        <w:t xml:space="preserve">Construction heuristics create an initial assignment; local search improves an existing one. For v1 of the extracted boundary, explicitly declare whether the endpoint accepts assigned plans only. Reject unassigned or partially assigned input until a supported construction path is implemented. If cold planning is required, implement the CR02 overconstrained model, construction, and coverage validation, then benchmark cold, partial, feasible warm, and infeasible repair inputs separately. A construction phase alone does not define the treatment of work that cannot be placed. </w:t>
       </w:r>
       <w:hyperlink r:id="rId13">
         <w:r>
@@ -773,7 +832,7 @@
         <w:pStyle w:val="Heading2"/>
       </w:pPr>
       <w:r>
-        <w:t>TF03 Validate the problem before building maps or copies</w:t>
+        <w:t>CR02 Model unplaceable work without losing demand</w:t>
       </w:r>
     </w:p>
     <w:p>
@@ -787,7 +846,7 @@
         <w:t xml:space="preserve">Current behavior: </w:t>
       </w:r>
       <w:r>
-        <w:t>Direct core tests show duplicate technician IDs passing route validation while overwriting one segment-map key, duplicate visit IDs collapsing during PlanCopies.copy, and a NaN rate producing zero cost. Database keys and booking rate validation reduce exposure in current workflows; these tests do not establish HTTP exploitability. Evidence: C07 through C09. Classification: High, reproduced core boundary defects.</w:t>
+        <w:t>TechRoute does not allow unassigned list values; visits outside routes have no coverage penalty, while timing failures receive categorical hard penalties. Repair returns SKIPPED when no eligible full schedule is found. Evidence: R04 through R06 and TF02/TF06. Classification: Medium, source-confirmed modeling gap; the TF02 core omission is separately reproduced.</w:t>
       </w:r>
     </w:p>
     <w:p>
@@ -801,7 +860,7 @@
         <w:t xml:space="preserve">Consequence: </w:t>
       </w:r>
       <w:r>
-        <w:t>Identity corruption changes the problem before the solver sees it. Once two jobs become one map entry, successful optimization of the smaller problem cannot recover the lost job. A fabricated zero cost can also dominate a valid candidate in ranking. Null checks alone cannot establish uniqueness, numeric validity, or membership consistency.</w:t>
+        <w:t>A cold input or absence can need a useful partial diagnostic even when no complete schedule exists. Search must not improve its score by dropping work or trade a broken customer promise for one more assignment.</w:t>
       </w:r>
     </w:p>
     <w:p>
@@ -815,7 +874,94 @@
         <w:t xml:space="preserve">Guidance and change: </w:t>
       </w:r>
       <w:r>
-        <w:t xml:space="preserve">Timefold modeling depends on stable identities and a consistent relationship between facts, entities, and planning values. Add a validated input DTO and one problem validator before any ID-indexed copying. Require unique IDs, canonical visit membership, consistent assignments, finite nonnegative rates, valid durations and limits, valid windows, and complete required directed legs. Reject unsafe key delimiters or replace concatenated string keys with typed directed pairs. </w:t>
+        <w:t xml:space="preserve">The guide documents overconstrained planning: allow unassigned list values with allowsUnassignedValues and score them explicitly, including unassigned values in the relevant Constraint Streams selection. Define a versioned lexicographic ordering of hard feasibility, assignment coverage, then the phase-specific overtime, fairness, and cost priorities. This requires more levels than the current three-level model, such as a compatible Bendable score, or a separately proven equivalent ordering. Specify pinning, construction, and unassignment moves against 2.6.0 before accepting cold inputs. </w:t>
+      </w:r>
+      <w:hyperlink r:id="rId14">
+        <w:r>
+          <w:rPr>
+            <w:color w:val="205781"/>
+          </w:rPr>
+          <w:t>Guide section 11.3</w:t>
+        </w:r>
+      </w:hyperlink>
+      <w:r/>
+    </w:p>
+    <w:p>
+      <w:pPr>
+        <w:keepLines w:val="0"/>
+      </w:pPr>
+      <w:r>
+        <w:rPr>
+          <w:b/>
+        </w:rPr>
+        <w:t xml:space="preserve">Why this helps: </w:t>
+      </w:r>
+      <w:r>
+        <w:t>Repair can identify unresolved demand while preserving feasibility of assigned work. It changes score and fairness-reference semantics, so old score traces cannot be merged with new ones. Partial results are diagnostic proposals only; ordinary preview and guarded application still require complete independently validated coverage and all policy conditions.</w:t>
+      </w:r>
+    </w:p>
+    <w:p>
+      <w:pPr>
+        <w:keepLines w:val="0"/>
+      </w:pPr>
+      <w:r>
+        <w:rPr>
+          <w:b/>
+        </w:rPr>
+        <w:t xml:space="preserve">Acceptance: </w:t>
+      </w:r>
+      <w:r>
+        <w:t>An unplaceable visit appears exactly once in the explicit unassigned set and contributes a nonzero coverage penalty. Assigned plus unassigned identities equal input demand with no duplicates. Zero hard score is insufficient for application. Test feasible cold construction, impossible pinned work, partial repair, and reference/target compatibility; reject partial proposals on the apply path.</w:t>
+      </w:r>
+    </w:p>
+    <w:p>
+      <w:pPr>
+        <w:pStyle w:val="Heading2"/>
+      </w:pPr>
+      <w:r>
+        <w:t>CR09 Define the indexed dataset and directed road contract</w:t>
+      </w:r>
+    </w:p>
+    <w:p>
+      <w:pPr>
+        <w:keepLines w:val="0"/>
+      </w:pPr>
+      <w:r>
+        <w:rPr>
+          <w:b/>
+        </w:rPr>
+        <w:t xml:space="preserve">Current behavior: </w:t>
+      </w:r>
+      <w:r>
+        <w:t>Daily preparation requests ordered road pairs for two endpoints per technician plus every visit and stores them under concatenated string keys. With T technicians and V visits the candidate matrix grows as (2T + V) squared; T=50 and V=300 gives 160,000 candidate entries, before any provider-specific omissions. Evidence: R17 and R18. Classification: High, source-confirmed boundary design input; serialized size and parsing costs are unmeasured.</w:t>
+      </w:r>
+    </w:p>
+    <w:p>
+      <w:pPr>
+        <w:keepLines w:val="0"/>
+      </w:pPr>
+      <w:r>
+        <w:rPr>
+          <w:b/>
+        </w:rPr>
+        <w:t xml:space="preserve">Consequence: </w:t>
+      </w:r>
+      <w:r>
+        <w:t>Many directions, such as entering a departure endpoint, cannot be used. String keys also couple the external payload to the scoring lookup representation. A sparse payload is unsafe unless it includes every leg that the configured move families may request, not just legs in the initial routes.</w:t>
+      </w:r>
+    </w:p>
+    <w:p>
+      <w:pPr>
+        <w:keepLines w:val="0"/>
+      </w:pPr>
+      <w:r>
+        <w:rPr>
+          <w:b/>
+        </w:rPr>
+        <w:t xml:space="preserve">Guidance and change: </w:t>
+      </w:r>
+      <w:r>
+        <w:t xml:space="preserve">Decide the versioned wire contract before TF03. Serialize stable technician, visit, and location IDs with integer indices, units, routing provider/profile/version identity, and a content hash. Use either a dense directed matrix with explicit dimensions and unusable entries, or sparse directed records with an explicit completeness rule. Origin-to-destination and reverse legs are distinct; departure, return, self-leg, missing and unreachable semantics must be declared. Derive required pairs from eligibility and allowed moves. Decode validated external arrays or records into efficient internal primitive arrays or typed indexed maps. JSON cannot promise primitive storage or zero-copy parsing. </w:t>
       </w:r>
       <w:hyperlink r:id="rId14">
         <w:r>
@@ -838,6 +984,93 @@
         <w:t xml:space="preserve">Why this helps: </w:t>
       </w:r>
       <w:r>
+        <w:t>Indices remove delimiter ambiguity and support later efficient lookup without prescribing a wasteful full matrix. Dense storage has predictable access and memory cost; sparse storage saves bytes but needs missing-pair checks and can cost more per lookup. Measure payload bytes, decode time, memory, and lookup allocation before selecting a format.</w:t>
+      </w:r>
+    </w:p>
+    <w:p>
+      <w:pPr>
+        <w:keepLines w:val="0"/>
+      </w:pPr>
+      <w:r>
+        <w:rPr>
+          <w:b/>
+        </w:rPr>
+        <w:t xml:space="preserve">Acceptance: </w:t>
+      </w:r>
+      <w:r>
+        <w:t>Reject duplicate IDs, out-of-range indices, inconsistent dimensions, duplicate directed pairs, nonfinite or negative values, and absent required legs before copying. Never substitute zero travel for missing roads. Round trips preserve ordering, units, identity, facts, and the canonical hash. Layer C measures serialization, validation, and preparation at the intended fleet sizes within a declared request budget.</w:t>
+      </w:r>
+    </w:p>
+    <w:p>
+      <w:pPr>
+        <w:pStyle w:val="Heading2"/>
+      </w:pPr>
+      <w:r>
+        <w:t>TF03 Validate the problem before building maps or copies</w:t>
+      </w:r>
+    </w:p>
+    <w:p>
+      <w:pPr>
+        <w:keepLines w:val="0"/>
+      </w:pPr>
+      <w:r>
+        <w:rPr>
+          <w:b/>
+        </w:rPr>
+        <w:t xml:space="preserve">Current behavior: </w:t>
+      </w:r>
+      <w:r>
+        <w:t>Direct core tests show duplicate technician IDs passing route validation while overwriting one segment-map key, duplicate visit IDs collapsing during PlanCopies.copy, and a NaN rate producing zero cost. Database keys and booking rate validation reduce exposure in current workflows; these tests do not establish HTTP exploitability. Evidence: C07 through C09. Classification: High, reproduced core boundary defects.</w:t>
+      </w:r>
+    </w:p>
+    <w:p>
+      <w:pPr>
+        <w:keepLines w:val="0"/>
+      </w:pPr>
+      <w:r>
+        <w:rPr>
+          <w:b/>
+        </w:rPr>
+        <w:t xml:space="preserve">Consequence: </w:t>
+      </w:r>
+      <w:r>
+        <w:t>Identity corruption changes the problem before the solver sees it. Once two jobs become one map entry, successful optimization of the smaller problem cannot recover the lost job. A fabricated zero cost can also dominate a valid candidate in ranking. Null checks alone cannot establish uniqueness, numeric validity, or membership consistency.</w:t>
+      </w:r>
+    </w:p>
+    <w:p>
+      <w:pPr>
+        <w:keepLines w:val="0"/>
+      </w:pPr>
+      <w:r>
+        <w:rPr>
+          <w:b/>
+        </w:rPr>
+        <w:t xml:space="preserve">Guidance and change: </w:t>
+      </w:r>
+      <w:r>
+        <w:t xml:space="preserve">Timefold modeling depends on stable identities and a consistent relationship between facts, entities, and planning values. Add a validated input DTO and one problem validator before any ID-indexed copying. Validate the CR09 wire contract first, then require unique IDs, canonical visit membership, consistent assignments, finite nonnegative rates, valid durations and limits, valid windows, and complete required directed legs. External serialization and internal lookup structures are separate layers; index validation precedes construction of either. Retained legacy string-key inputs still need delimiter validation on an explicit compatibility path. </w:t>
+      </w:r>
+      <w:hyperlink r:id="rId14">
+        <w:r>
+          <w:rPr>
+            <w:color w:val="205781"/>
+          </w:rPr>
+          <w:t>Guide chapter 10</w:t>
+        </w:r>
+      </w:hyperlink>
+      <w:r/>
+    </w:p>
+    <w:p>
+      <w:pPr>
+        <w:keepLines w:val="0"/>
+      </w:pPr>
+      <w:r>
+        <w:rPr>
+          <w:b/>
+        </w:rPr>
+        <w:t xml:space="preserve">Why this helps: </w:t>
+      </w:r>
+      <w:r>
         <w:t>Validation preserves the requested problem and produces actionable errors before expensive solving. It also makes benchmark fixtures trustworthy. It costs preparation time, which belongs outside isolated solve timing but inside end-to-end latency. Missing rates, legs, or capacities must remain explicit errors, never zero, false, or empty defaults.</w:t>
       </w:r>
     </w:p>
@@ -989,7 +1222,7 @@
         <w:t xml:space="preserve">Guidance and change: </w:t>
       </w:r>
       <w:r>
-        <w:t xml:space="preserve">Timefold lifecycle integration supports managed solving and early termination. Establish one monotonic deadline at admission, propagate its remaining budget through preparation and solving, reserve validation time, and define cancellation cleanup. SolverManager is an available building block; a bounded equivalent adapter is also viable. Move durable transactions to the caller and keep their critical sections short. </w:t>
+        <w:t xml:space="preserve">Timefold lifecycle integration supports managed solving and early termination. Establish one monotonic deadline at admission. Check its remaining budget during preparation and caller work; derive each solver allowance from remaining time minus a measured validation/response reserve. Use solver termination and cancellation cleanup for search, resolving CR01 before installing request state around daily solving. Do not propagate request-clock checks into scoring. SolverManager is an available building block; a bounded equivalent adapter is also viable. Move durable transactions to the caller and keep their critical sections short. </w:t>
       </w:r>
       <w:hyperlink r:id="rId16">
         <w:r>
@@ -1012,7 +1245,7 @@
         <w:t xml:space="preserve">Why this helps: </w:t>
       </w:r>
       <w:r>
-        <w:t>The caller can reason about resource occupancy and response limits. A stopped request no longer leaves unexplained background work consuming admission slots. Asynchronous submission alone does not solve this: waiting synchronously for the final result or ignoring cancellation preserves the original problem.</w:t>
+        <w:t>The caller can reason about resource occupancy and response limits. Cancellation has observable cleanup and resource-release ownership. Termination is cooperative: long moves, score evaluations, scheduling, or GC can delay observation, so a spent limit or terminateEarly is not an exact wall-clock bound. Reserve time and measure overruns and cleanup instead of promising exact expiry. Asynchronous submission alone does not solve this: waiting synchronously for the final result or ignoring cancellation preserves the original problem.</w:t>
       </w:r>
     </w:p>
     <w:p>
@@ -1027,6 +1260,93 @@
       </w:r>
       <w:r>
         <w:t>Inject queue delay, slow routing, validation delay, cancellation, and deadline expiry. Confirm that these consume the original budget, cleanup releases capacity, and only independently validated partial results can be returned where the contract permits them. Measure complete latency and cleanup, not just solveMs.</w:t>
+      </w:r>
+    </w:p>
+    <w:p>
+      <w:pPr>
+        <w:pStyle w:val="Heading2"/>
+      </w:pPr>
+      <w:r>
+        <w:t>CR01 Keep request clock checks outside scoring</w:t>
+      </w:r>
+    </w:p>
+    <w:p>
+      <w:pPr>
+        <w:keepLines w:val="0"/>
+      </w:pPr>
+      <w:r>
+        <w:rPr>
+          <w:b/>
+        </w:rPr>
+        <w:t xml:space="preserve">Current behavior: </w:t>
+      </w:r>
+      <w:r>
+        <w:t>RouteTimingSearch calls SearchDeadline.checkpoint within interval, option, and segment loops. The thread-local exploration budget reserves one second and throws Expired on exhaustion. Current daily solves do not install that deadline, so these calls do nothing there. Evidence: R01 through R03. Classification: High, source-confirmed interaction with the TF05 proposal, not a reproduced current daily failure.</w:t>
+      </w:r>
+    </w:p>
+    <w:p>
+      <w:pPr>
+        <w:keepLines w:val="0"/>
+      </w:pPr>
+      <w:r>
+        <w:rPr>
+          <w:b/>
+        </w:rPr>
+        <w:t xml:space="preserve">Consequence: </w:t>
+      </w:r>
+      <w:r>
+        <w:t>Wrapping daily solving in SearchDeadline.within would allow request expiry to throw from score calculation. Moving the solve to another thread can instead lose the thread-local checks. Both make score behavior depend on execution context and undermine predictable best-solution retrieval.</w:t>
+      </w:r>
+    </w:p>
+    <w:p>
+      <w:pPr>
+        <w:keepLines w:val="0"/>
+      </w:pPr>
+      <w:r>
+        <w:rPr>
+          <w:b/>
+        </w:rPr>
+        <w:t xml:space="preserve">Guidance and change: </w:t>
+      </w:r>
+      <w:r>
+        <w:t xml:space="preserve">Keep scoring deterministic for a given solution and fact revision. Remove these checkpoints from the scoring path, or use an explicit non-scoring evaluation mode, while retaining appropriate request checks in booking, routing, and caller preparation. Set a solver spent allowance after reserving validation time; wire cancellation to terminateEarly or the supported SolverManager termination method. Solver and phase termination are cooperative, not forced interruption of an arbitrary score evaluation. </w:t>
+      </w:r>
+      <w:hyperlink r:id="rId16">
+        <w:r>
+          <w:rPr>
+            <w:color w:val="205781"/>
+          </w:rPr>
+          <w:t>Guide chapter 25</w:t>
+        </w:r>
+      </w:hyperlink>
+      <w:r/>
+    </w:p>
+    <w:p>
+      <w:pPr>
+        <w:keepLines w:val="0"/>
+      </w:pPr>
+      <w:r>
+        <w:rPr>
+          <w:b/>
+        </w:rPr>
+        <w:t xml:space="preserve">Why this helps: </w:t>
+      </w:r>
+      <w:r>
+        <w:t>Search can stop normally with a best-so-far solution rather than fail inside the score director. It also keeps future worker threads free of hidden request state. A best solution may still be partial or infeasible; caller validation decides whether it can be returned or applied.</w:t>
+      </w:r>
+    </w:p>
+    <w:p>
+      <w:pPr>
+        <w:keepLines w:val="0"/>
+      </w:pPr>
+      <w:r>
+        <w:rPr>
+          <w:b/>
+        </w:rPr>
+        <w:t xml:space="preserve">Acceptance: </w:t>
+      </w:r>
+      <w:r>
+        <w:t>Test 100 ms, one-second, and normal allowances, cancellation, delayed evaluations, and caller versus worker-thread execution. No Expired originates from daily scoring. Record actual duration and cleanup overshoot, returning a validated eligible proposal or explicit incomplete/cancelled outcome; expiration never bypasses validation.</w:t>
       </w:r>
     </w:p>
     <w:p>
@@ -1171,7 +1491,7 @@
         <w:t xml:space="preserve">Guidance and change: </w:t>
       </w:r>
       <w:r>
-        <w:t xml:space="preserve">The guide calls this a score trap and recommends reflecting the degree of violation where meaningful. Add quantitative lateness and capacity-excess penalties while retaining strict feasibility. Keep categorical violations such as missing qualifications explicit. Do not turn a hard customer promise into a soft preference. </w:t>
+        <w:t xml:space="preserve">The guide calls this a score trap and recommends reflecting the degree of violation where meaningful. Use CR02 to distinguish explicitly unassigned demand from infeasible assigned work. Add quantitative lateness and capacity-excess penalties while retaining strict feasibility. Keep categorical violations such as missing qualifications explicit. Do not turn a hard customer promise into a soft preference. </w:t>
       </w:r>
       <w:hyperlink r:id="rId17">
         <w:r>
@@ -1353,7 +1673,7 @@
         <w:t xml:space="preserve">Why this helps: </w:t>
       </w:r>
       <w:r>
-        <w:t>A constrained prototype tests whether Timefold improves the actual booking decision under the same deadline. The tradeoff is model and integration complexity. Managed Field Service Routing is a separate product evaluation involving its API, model fit, and commercial terms; this report does not treat it as a tested replacement.</w:t>
+        <w:t>A constrained prototype tests whether Timefold improves the actual booking decision under the same deadline. The tradeoff is model and integration complexity. Community booking recommendations can enumerate feasible insertions on copied schedules, rank independently validated candidates, and explain the business deltas. This report does not require a managed product or an Enterprise recommendation API.</w:t>
       </w:r>
     </w:p>
     <w:p>
@@ -1552,7 +1872,7 @@
         <w:t xml:space="preserve">Acceptance: </w:t>
       </w:r>
       <w:r>
-        <w:t>Upgrade checks exercise all variants, loaded version provenance, score equivalence, unknown metrics, and termination labels. Nullability remains explicit; unavailable measurements are never replaced with zero.</w:t>
+        <w:t>Upgrade checks exercise all variants, loaded version provenance, score equivalence, unknown metrics, and termination labels. Nullability remains explicit; unavailable measurements are never replaced with zero. Public, preview, and internal dependencies must be recorded separately under CR10; public placement does not imply stability for a preview API.</w:t>
       </w:r>
     </w:p>
     <w:p>
@@ -1602,7 +1922,7 @@
         <w:t xml:space="preserve">Guidance and change: </w:t>
       </w:r>
       <w:r>
-        <w:t xml:space="preserve">Timefold's score model formalizes priorities, but the business choices belong to WaterFlex. Correct the canonical policy and linked experiment explanations together when implementing remediation. Distinguish booking ties from daily fairness headroom, state that return travel counts, and explain bounded completion. </w:t>
+        <w:t xml:space="preserve">Timefold's score model formalizes priorities, but the business choices belong to WaterFlex. Correct the canonical policy and linked experiment explanations together when implementing remediation. Distinguish booking ties from daily fairness headroom, state that return travel counts, and explain bounded completion. Document CR04: a reduction from ninety overtime minutes to twenty is still rejected because current policy requires zero candidate overtime. A separate business decision would be needed to expose such a proposal. </w:t>
       </w:r>
       <w:hyperlink r:id="rId15">
         <w:r>
@@ -1644,18 +1964,10 @@
     </w:p>
     <w:p>
       <w:pPr>
-        <w:pStyle w:val="Heading1"/>
-      </w:pPr>
-      <w:r>
-        <w:t>Computational improvements worth measuring</w:t>
-      </w:r>
-    </w:p>
-    <w:p>
-      <w:pPr>
         <w:pStyle w:val="Heading2"/>
       </w:pPr>
       <w:r>
-        <w:t>TF13 Prepare invariant route facts once</w:t>
+        <w:t>CR03 Skip fairness work that acceptance policy must reject</w:t>
       </w:r>
     </w:p>
     <w:p>
@@ -1669,7 +1981,7 @@
         <w:t xml:space="preserve">Current behavior: </w:t>
       </w:r>
       <w:r>
-        <w:t>RouteScoringFacts.evaluate constructs a temporary DayPlan for each route evaluation. That constructor prepares demanded-service data that the timing path does not need. Capacity and eligibility are recomputed, and RouteTimeline sorts absences and rebuilds availability, including work repeated in its infeasible fallback. Evidence: C10 and C12. Classification: Medium, source-confirmed redundant preparation; speed benefit unmeasured.</w:t>
+        <w:t>The fairness phase runs when its reference validates, even if the reference overtime target is nonzero. SchedulingPolicy.compare prohibits any nonzero candidate overtime. The target violation adds overtime deviation in minutes to excess cents on one hard level. Evidence: R07 through R09. Classification: Medium, source-confirmed policy interaction and mixed-unit weighting; CPU savings are unmeasured.</w:t>
       </w:r>
     </w:p>
     <w:p>
@@ -1683,7 +1995,7 @@
         <w:t xml:space="preserve">Consequence: </w:t>
       </w:r>
       <w:r>
-        <w:t>Local search evaluates many tentative moves. Work that is small once can become expensive when repeated for every changed route. These preparations depend mainly on fixed facts such as shifts and absences rather than on the proposed visit order.</w:t>
+        <w:t>A fairness solve preserving a nonzero overtime target cannot produce an accepted schedule under current policy. Combining cents and minutes assigns one cent the same numerical weight as one minute while repairing target violations. Splitting them into named constraints alone preserves that summed weighting and does not solve the ordering problem.</w:t>
       </w:r>
     </w:p>
     <w:p>
@@ -1697,7 +2009,278 @@
         <w:t xml:space="preserve">Guidance and change: </w:t>
       </w:r>
       <w:r>
-        <w:t xml:space="preserve">The performance guide recommends removing unnecessary score work and using incremental calculation. Prepare immutable per-technician availability, capacity, eligibility, and routing context before solving. Pass a compact timing context instead of constructing a temporary planning solution. Precompute only values independent of assignment; paid time and route feasibility still depend on the move. </w:t>
+        <w:t xml:space="preserve">Evaluate policy eligibility before fairness. If the validated reference retains nonzero overtime and fairness must preserve it, skip fairness with a recorded policy reason, retaining the reference diagnostic and unchanged accepted baseline. If a future fairness model can reduce overtime, this skip rule needs reevaluation. Use separate named constraints for explanation and explicitly define either normalized weights or separate lexicographic levels for the repair direction. Preserve zero feasibility boundaries and version changed score semantics. </w:t>
+      </w:r>
+      <w:hyperlink r:id="rId15">
+        <w:r>
+          <w:rPr>
+            <w:color w:val="205781"/>
+          </w:rPr>
+          <w:t>Guide chapter 12</w:t>
+        </w:r>
+      </w:hyperlink>
+      <w:r/>
+    </w:p>
+    <w:p>
+      <w:pPr>
+        <w:keepLines w:val="0"/>
+      </w:pPr>
+      <w:r>
+        <w:rPr>
+          <w:b/>
+        </w:rPr>
+        <w:t xml:space="preserve">Why this helps: </w:t>
+      </w:r>
+      <w:r>
+        <w:t>Skipping impossible acceptance saves allowance without relaxing policy; explicit weighting makes repair priorities reviewable. Extra score levels increase model and migration complexity. Measure skipped-phase CPU and outcomes instead of assuming the full five seconds is saved on every request.</w:t>
+      </w:r>
+    </w:p>
+    <w:p>
+      <w:pPr>
+        <w:keepLines w:val="0"/>
+      </w:pPr>
+      <w:r>
+        <w:rPr>
+          <w:b/>
+        </w:rPr>
+        <w:t xml:space="preserve">Acceptance: </w:t>
+      </w:r>
+      <w:r>
+        <w:t>A validated nonzero-overtime reference records a fairness skip and starts no fairness solver under the preserved-target model. Zero-overtime references still run eligible fairness. Isolate minute and cent constraints and prove the chosen weights or level ordering with tradeoff cases; policy acceptance tests remain unchanged.</w:t>
+      </w:r>
+    </w:p>
+    <w:p>
+      <w:pPr>
+        <w:pStyle w:val="Heading2"/>
+      </w:pPr>
+      <w:r>
+        <w:t>CR04 Explain the consequence of zero overtime acceptance</w:t>
+      </w:r>
+    </w:p>
+    <w:p>
+      <w:pPr>
+        <w:keepLines w:val="0"/>
+      </w:pPr>
+      <w:r>
+        <w:rPr>
+          <w:b/>
+        </w:rPr>
+        <w:t xml:space="preserve">Current behavior: </w:t>
+      </w:r>
+      <w:r>
+        <w:t>The reference minimizes overtime first, but SchedulingPolicy.compare still rejects a candidate with any overtime. Evidence: R07 and R08. Classification: Low, source-confirmed policy consequence.</w:t>
+      </w:r>
+    </w:p>
+    <w:p>
+      <w:pPr>
+        <w:keepLines w:val="0"/>
+      </w:pPr>
+      <w:r>
+        <w:rPr>
+          <w:b/>
+        </w:rPr>
+        <w:t xml:space="preserve">Consequence: </w:t>
+      </w:r>
+      <w:r>
+        <w:t>A substantial partial overtime reduction can produce no applicable preview. This is the current business rule, not proof that the solver found no improvement.</w:t>
+      </w:r>
+    </w:p>
+    <w:p>
+      <w:pPr>
+        <w:keepLines w:val="0"/>
+      </w:pPr>
+      <w:r>
+        <w:rPr>
+          <w:b/>
+        </w:rPr>
+        <w:t xml:space="preserve">Guidance and change: </w:t>
+      </w:r>
+      <w:r>
+        <w:t xml:space="preserve">Include this consequence in TF11 policy documentation and outcome examples. Keep partial reductions as diagnostics if useful, with explicit rejection reasons. Offering them for application requires a separate policy decision and validation contract. </w:t>
+      </w:r>
+      <w:hyperlink r:id="rId15">
+        <w:r>
+          <w:rPr>
+            <w:color w:val="205781"/>
+          </w:rPr>
+          <w:t>Guide chapter 12</w:t>
+        </w:r>
+      </w:hyperlink>
+      <w:r/>
+    </w:p>
+    <w:p>
+      <w:pPr>
+        <w:keepLines w:val="0"/>
+      </w:pPr>
+      <w:r>
+        <w:rPr>
+          <w:b/>
+        </w:rPr>
+        <w:t xml:space="preserve">Why this helps: </w:t>
+      </w:r>
+      <w:r>
+        <w:t>Dispatchers and benchmark analysts can distinguish useful search progress from policy eligibility without silently relaxing promises. Diagnostic presentation adds maintenance work and must not imply an applicable schedule.</w:t>
+      </w:r>
+    </w:p>
+    <w:p>
+      <w:pPr>
+        <w:keepLines w:val="0"/>
+      </w:pPr>
+      <w:r>
+        <w:rPr>
+          <w:b/>
+        </w:rPr>
+        <w:t xml:space="preserve">Acceptance: </w:t>
+      </w:r>
+      <w:r>
+        <w:t>A baseline with ninety overtime minutes and candidate with twenty records an improvement diagnostic and policy rejection, with the accepted baseline unchanged. The zero-overtime candidate follows ordinary acceptance checks.</w:t>
+      </w:r>
+    </w:p>
+    <w:p>
+      <w:pPr>
+        <w:pStyle w:val="Heading2"/>
+      </w:pPr>
+      <w:r>
+        <w:t>CR05 Make overnight failures observable</w:t>
+      </w:r>
+    </w:p>
+    <w:p>
+      <w:pPr>
+        <w:keepLines w:val="0"/>
+      </w:pPr>
+      <w:r>
+        <w:rPr>
+          <w:b/>
+        </w:rPr>
+        <w:t xml:space="preserve">Current behavior: </w:t>
+      </w:r>
+      <w:r>
+        <w:t>OptimizationService.overnight catches and discards every exception for each metro/day. Evidence: R11. Classification: Low, source-confirmed observability gap.</w:t>
+      </w:r>
+    </w:p>
+    <w:p>
+      <w:pPr>
+        <w:keepLines w:val="0"/>
+      </w:pPr>
+      <w:r>
+        <w:rPr>
+          <w:b/>
+        </w:rPr>
+        <w:t xml:space="preserve">Consequence: </w:t>
+      </w:r>
+      <w:r>
+        <w:t>Routing, schema, solver, and future transport failures leave the day unchanged without an actionable failure record. Aggregate success counts can therefore hide missing optimization work.</w:t>
+      </w:r>
+    </w:p>
+    <w:p>
+      <w:pPr>
+        <w:keepLines w:val="0"/>
+      </w:pPr>
+      <w:r>
+        <w:rPr>
+          <w:b/>
+        </w:rPr>
+        <w:t xml:space="preserve">Guidance and change: </w:t>
+      </w:r>
+      <w:r>
+        <w:t xml:space="preserve">Preserve isolation of days while recording metro, service date, attempt identity, failure class, elapsed time, and safe error context. Publish attempted/succeeded/skipped/failed counts with alertable failure rates. Distinguish policy skips from execution failures and protect customer data in logs. This follows lifecycle diagnostics in </w:t>
+      </w:r>
+      <w:hyperlink r:id="rId20">
+        <w:r>
+          <w:rPr>
+            <w:color w:val="205781"/>
+          </w:rPr>
+          <w:t>Guide chapter 32</w:t>
+        </w:r>
+      </w:hyperlink>
+      <w:r>
+        <w:t>.</w:t>
+      </w:r>
+    </w:p>
+    <w:p>
+      <w:pPr>
+        <w:keepLines w:val="0"/>
+      </w:pPr>
+      <w:r>
+        <w:rPr>
+          <w:b/>
+        </w:rPr>
+        <w:t xml:space="preserve">Why this helps: </w:t>
+      </w:r>
+      <w:r>
+        <w:t>Operators can investigate and explicitly retry failed days without blocking unaffected days. Telemetry adds storage and operational ownership; it must not introduce hidden automatic retries or new apply authority.</w:t>
+      </w:r>
+    </w:p>
+    <w:p>
+      <w:pPr>
+        <w:keepLines w:val="0"/>
+      </w:pPr>
+      <w:r>
+        <w:rPr>
+          <w:b/>
+        </w:rPr>
+        <w:t xml:space="preserve">Acceptance: </w:t>
+      </w:r>
+      <w:r>
+        <w:t>An injected failure creates a failed-day receipt and increments telemetry, leaves that day unchanged, and allows remaining days to run. Correlation IDs connect caller/service failures without disclosing credentials.</w:t>
+      </w:r>
+    </w:p>
+    <w:p>
+      <w:pPr>
+        <w:pStyle w:val="Heading1"/>
+      </w:pPr>
+      <w:r>
+        <w:t>Computational improvements worth measuring</w:t>
+      </w:r>
+    </w:p>
+    <w:p>
+      <w:pPr>
+        <w:pStyle w:val="Heading2"/>
+      </w:pPr>
+      <w:r>
+        <w:t>CR07 Profile and separate the route timing changes</w:t>
+      </w:r>
+    </w:p>
+    <w:p>
+      <w:pPr>
+        <w:keepLines w:val="0"/>
+      </w:pPr>
+      <w:r>
+        <w:rPr>
+          <w:b/>
+        </w:rPr>
+        <w:t xml:space="preserve">Current behavior: </w:t>
+      </w:r>
+      <w:r>
+        <w:t>Scoring constructs directed-leg string keys, uses Instant/Duration arithmetic, and builds arrival maps and segment copies that scalar score consumers do not read. With absences, candidate return-point exploration copies maps repeatedly. TF13 describes separate invariant preparation. Evidence: R01, R13, and R14. Classification: Medium, source-confirmed opportunity; dominance and performance effects are unmeasured.</w:t>
+      </w:r>
+    </w:p>
+    <w:p>
+      <w:pPr>
+        <w:keepLines w:val="0"/>
+      </w:pPr>
+      <w:r>
+        <w:rPr>
+          <w:b/>
+        </w:rPr>
+        <w:t xml:space="preserve">Consequence: </w:t>
+      </w:r>
+      <w:r>
+        <w:t>Allocation, hashing, and object copying may constrain move throughput, but source inspection cannot rank them against fleet aggregation or exact decimal arithmetic. Removing explanation data without preserving the independent validator would weaken correctness evidence.</w:t>
+      </w:r>
+    </w:p>
+    <w:p>
+      <w:pPr>
+        <w:keepLines w:val="0"/>
+      </w:pPr>
+      <w:r>
+        <w:rPr>
+          <w:b/>
+        </w:rPr>
+        <w:t xml:space="preserve">Guidance and change: </w:t>
+      </w:r>
+      <w:r>
+        <w:t xml:space="preserve">Establish a warmed throughput baseline and use JFR allocation/CPU/GC sampling or a compatible external profiler in separate diagnostic runs. First measure indexed road lookup, then score-only scalar evaluation versus an explanation path, and primitive time arithmetic as independent treatments. Retain the current independent RouteEvaluator as an oracle. Time offsets need declared epoch, units, overflow bounds, exclusive windows, absences, cross-midnight behavior, and America/Chicago DST conversion at the boundary. </w:t>
       </w:r>
       <w:hyperlink r:id="rId17">
         <w:r>
@@ -1720,7 +2303,7 @@
         <w:t xml:space="preserve">Why this helps: </w:t>
       </w:r>
       <w:r>
-        <w:t>Fewer allocations and repeated sorts leave more of the same time allowance for useful evaluation. The tradeoff is invalidation complexity: rates, buffers, absences, shifts, skills, and routing identity must rebuild the appropriate facts. Precomputed dense road matrices may waste memory when the problem needs only sparse directed pairs.</w:t>
+        <w:t>Measured allocation and CPU shares identify worthwhile work. A score-only path can avoid arrival maps while the selected result still gets full explanations and validation. Primitive arithmetic can reduce objects but introduces unit and boundary risks; no speedup or unchanged search quality is guaranteed.</w:t>
       </w:r>
     </w:p>
     <w:p>
@@ -1734,7 +2317,181 @@
         <w:t xml:space="preserve">Acceptance: </w:t>
       </w:r>
       <w:r>
-        <w:t>Differentially compare feasible and infeasible timing, overlapping absences, return travel, qualifications, missing legs, changed buffers, and clone isolation. Measure preparation time, allocations, move throughput, and accepted quality separately. Implement this before more invasive timing-state compression because equivalence is easier to establish.</w:t>
+        <w:t>Each treatment independently passes randomized move/undo and exhaustive fixture equivalence for feasibility, penalty, overtime, paid time, meters, exact cents, and selected-result arrivals. Include DST, return travel, absence blocks, and missing legs. Report preparation and explanation cost, bytes allocated, GC, score throughput, and equal-budget accepted quality with identical instrumentation.</w:t>
+      </w:r>
+    </w:p>
+    <w:p>
+      <w:pPr>
+        <w:pStyle w:val="Heading2"/>
+      </w:pPr>
+      <w:r>
+        <w:t>TF13 Prepare invariant route facts once</w:t>
+      </w:r>
+    </w:p>
+    <w:p>
+      <w:pPr>
+        <w:keepLines w:val="0"/>
+      </w:pPr>
+      <w:r>
+        <w:rPr>
+          <w:b/>
+        </w:rPr>
+        <w:t xml:space="preserve">Current behavior: </w:t>
+      </w:r>
+      <w:r>
+        <w:t>RouteScoringFacts.evaluate constructs a temporary DayPlan for each route evaluation. That constructor prepares demanded-service data that the timing path does not need. Capacity and eligibility are recomputed, and RouteTimeline sorts absences and rebuilds availability, including work repeated in its infeasible fallback. Evidence: C10 and C12. Classification: Medium, source-confirmed redundant preparation; speed benefit unmeasured.</w:t>
+      </w:r>
+    </w:p>
+    <w:p>
+      <w:pPr>
+        <w:keepLines w:val="0"/>
+      </w:pPr>
+      <w:r>
+        <w:rPr>
+          <w:b/>
+        </w:rPr>
+        <w:t xml:space="preserve">Consequence: </w:t>
+      </w:r>
+      <w:r>
+        <w:t>Local search evaluates many tentative moves. Work that is small once can become expensive when repeated for every changed route. These preparations depend mainly on fixed facts such as shifts and absences rather than on the proposed visit order.</w:t>
+      </w:r>
+    </w:p>
+    <w:p>
+      <w:pPr>
+        <w:keepLines w:val="0"/>
+      </w:pPr>
+      <w:r>
+        <w:rPr>
+          <w:b/>
+        </w:rPr>
+        <w:t xml:space="preserve">Guidance and change: </w:t>
+      </w:r>
+      <w:r>
+        <w:t xml:space="preserve">The performance guide recommends removing unnecessary score work and using incremental calculation. Prepare immutable per-technician availability, capacity, eligibility, and routing context before solving. Pass a compact timing context instead of constructing a temporary planning solution. Precompute only values independent of assignment; paid time and route feasibility still depend on the move. </w:t>
+      </w:r>
+      <w:hyperlink r:id="rId17">
+        <w:r>
+          <w:rPr>
+            <w:color w:val="205781"/>
+          </w:rPr>
+          <w:t>Guide sections 16.2 and 16.3</w:t>
+        </w:r>
+      </w:hyperlink>
+      <w:r/>
+    </w:p>
+    <w:p>
+      <w:pPr>
+        <w:keepLines w:val="0"/>
+      </w:pPr>
+      <w:r>
+        <w:rPr>
+          <w:b/>
+        </w:rPr>
+        <w:t xml:space="preserve">Why this helps: </w:t>
+      </w:r>
+      <w:r>
+        <w:t>Fewer allocations and repeated sorts leave more of the same time allowance for useful evaluation. The tradeoff is invalidation complexity: rates, buffers, absences, shifts, skills, and routing identity must rebuild the appropriate facts. Precomputed dense road matrices may waste memory when the problem needs only sparse directed pairs.</w:t>
+      </w:r>
+    </w:p>
+    <w:p>
+      <w:pPr>
+        <w:keepLines w:val="0"/>
+      </w:pPr>
+      <w:r>
+        <w:rPr>
+          <w:b/>
+        </w:rPr>
+        <w:t xml:space="preserve">Acceptance: </w:t>
+      </w:r>
+      <w:r>
+        <w:t>Differentially compare feasible and infeasible timing, overlapping absences, return travel, qualifications, missing legs, changed buffers, and clone isolation. Measure preparation time, allocations, move throughput, and accepted quality separately. Profile CR07 and this preparation separately before choosing their order; their likely costs are not established by source inspection. Keep separate equivalence checks for each change.</w:t>
+      </w:r>
+    </w:p>
+    <w:p>
+      <w:pPr>
+        <w:pStyle w:val="Heading2"/>
+      </w:pPr>
+      <w:r>
+        <w:t>CR08 Choose score representation after the numeric contract</w:t>
+      </w:r>
+    </w:p>
+    <w:p>
+      <w:pPr>
+        <w:keepLines w:val="0"/>
+      </w:pPr>
+      <w:r>
+        <w:rPr>
+          <w:b/>
+        </w:rPr>
+        <w:t xml:space="preserve">Current behavior: </w:t>
+      </w:r>
+      <w:r>
+        <w:t>DayPlan uses HardMediumSoftBigDecimalScore and fairness computes DECIMAL128 weighted variance. Evidence: R15 and R16. Classification: Medium, unmeasured opportunity after TF04.</w:t>
+      </w:r>
+    </w:p>
+    <w:p>
+      <w:pPr>
+        <w:keepLines w:val="0"/>
+      </w:pPr>
+      <w:r>
+        <w:rPr>
+          <w:b/>
+        </w:rPr>
+        <w:t xml:space="preserve">Consequence: </w:t>
+      </w:r>
+      <w:r>
+        <w:t>Decimal calculation may allocate and consume CPU on every score update, but changing representation can alter ties, fairness ceilings, and overflow behavior. Allocation profiling must establish its contribution first.</w:t>
+      </w:r>
+    </w:p>
+    <w:p>
+      <w:pPr>
+        <w:keepLines w:val="0"/>
+      </w:pPr>
+      <w:r>
+        <w:rPr>
+          <w:b/>
+        </w:rPr>
+        <w:t xml:space="preserve">Guidance and change: </w:t>
+      </w:r>
+      <w:r>
+        <w:t xml:space="preserve">Define exact cents and required fairness precision before proposing scaled integer scoring. In Timefold 2.x, HardMediumSoftScore is long-based; HardMediumSoftLongScore is a removed 1.x name. Inspect the pinned 2.6.0 API and migration guidance rather than copying that name from the second review. If CR02 adds assignment coverage, select a compatible multi-level representation, such as BendableScore or BendableBigDecimalScore, instead of squeezing four priorities into three. Measure score representation independently of TF12 reversible aggregation. </w:t>
+      </w:r>
+      <w:hyperlink r:id="rId15">
+        <w:r>
+          <w:rPr>
+            <w:color w:val="205781"/>
+          </w:rPr>
+          <w:t>Guide chapter 12</w:t>
+        </w:r>
+      </w:hyperlink>
+      <w:r/>
+    </w:p>
+    <w:p>
+      <w:pPr>
+        <w:keepLines w:val="0"/>
+      </w:pPr>
+      <w:r>
+        <w:rPr>
+          <w:b/>
+        </w:rPr>
+        <w:t xml:space="preserve">Why this helps: </w:t>
+      </w:r>
+      <w:r>
+        <w:t>A measured representation change may reduce cost without replacing business semantics. Scaling introduces explicit quantization and overflow bounds; any changed tie tolerance is a policy revision. Algebraically equivalent formulas need not produce identical decimal rounding.</w:t>
+      </w:r>
+    </w:p>
+    <w:p>
+      <w:pPr>
+        <w:keepLines w:val="0"/>
+      </w:pPr>
+      <w:r>
+        <w:rPr>
+          <w:b/>
+        </w:rPr>
+        <w:t xml:space="preserve">Acceptance: </w:t>
+      </w:r>
+      <w:r>
+        <w:t>Verify pairwise ranking against an exact decimal oracle, ceiling boundaries, negative scores, aggregate bounds and overflow, and declared tie precision. Representation-only and aggregate-only treatments each pass equivalence before combination; compare allocation and throughput with accepted quality separately.</w:t>
       </w:r>
     </w:p>
     <w:p>
@@ -1944,7 +2701,7 @@
         <w:t xml:space="preserve">Guidance and change: </w:t>
       </w:r>
       <w:r>
-        <w:t xml:space="preserve">Begin with bounded parallelism across independent metro/day snapshots or requests, counting all CPU consumers. Separately evaluate a small routing worker pool after confirming GraphHopper thread safety, single-flight cache behavior, cancellation, and routing identity. Enterprise move threads require safe rebasing and fixed worker counts for reproducibility. Partitioned search requires constraints that do not cross partitions. </w:t>
+        <w:t xml:space="preserve">Begin with bounded parallelism across independent metro/day snapshots or requests, counting all CPU consumers. Separately evaluate a small routing worker pool after confirming GraphHopper thread safety, single-flight cache behavior, cancellation, and routing identity. Use separate single-threaded Community solver instances and bounded independent JVM cases. Enterprise move evaluation and partitioned search are outside this Community design; custom multithreaded move evaluation and a solver fork remain deferred. </w:t>
       </w:r>
       <w:hyperlink r:id="rId21">
         <w:r>
@@ -1967,7 +2724,7 @@
         <w:t xml:space="preserve">Why this helps: </w:t>
       </w:r>
       <w:r>
-        <w:t>Independent jobs retain the full optimization objective. More threads can reduce individual latency or improve throughput, but can also slow every request through shared caches, memory bandwidth, GC, and queueing. A dedicated client process does not fix an unscoped database query. Quarkus, native images, Enterprise node sharing, and multi-bet solving are separate experiments with deployment or licensing costs, not architectural prerequisites.</w:t>
+        <w:t>Independent jobs retain the full optimization objective. More threads can reduce individual latency or improve throughput, but can also slow every request through shared caches, memory bandwidth, GC, and queueing. A dedicated client process does not fix an unscoped database query. Framework and native-image changes are separate deployment experiments. Community parallel independent solves preserve the complete objective but cannot promise Enterprise-equivalent throughput or diagnostics.</w:t>
       </w:r>
     </w:p>
     <w:p>
@@ -1982,6 +2739,180 @@
       </w:r>
       <w:r>
         <w:t>Use the same binary and snapshots for serial versus concurrent studies, record total CPU and memory limits, and measure throughput together with p95 latency and quality. No thread count or framework switch should be selected from vendor charts or a run on a different revision.</w:t>
+      </w:r>
+    </w:p>
+    <w:p>
+      <w:pPr>
+        <w:pStyle w:val="Heading2"/>
+      </w:pPr>
+      <w:r>
+        <w:t>CR10 Keep every proposed configuration on Community Edition</w:t>
+      </w:r>
+    </w:p>
+    <w:p>
+      <w:pPr>
+        <w:keepLines w:val="0"/>
+      </w:pPr>
+      <w:r>
+        <w:rPr>
+          <w:b/>
+        </w:rPr>
+        <w:t xml:space="preserve">Current behavior: </w:t>
+      </w:r>
+      <w:r>
+        <w:t>SolverExperiment enables no Enterprise features but uses internal diagnostics; the guide lists score analysis, Recommendation API, nearby selection, multithreaded solving, partitioned search, constraint profiling, and multistage moves as Enterprise features. Evidence: R10 and local guide section 62.2. Classification: Low, source-confirmed edition gap in the previous recommendations.</w:t>
+      </w:r>
+    </w:p>
+    <w:p>
+      <w:pPr>
+        <w:keepLines w:val="0"/>
+      </w:pPr>
+      <w:r>
+        <w:rPr>
+          <w:b/>
+        </w:rPr>
+        <w:t xml:space="preserve">Consequence: </w:t>
+      </w:r>
+      <w:r>
+        <w:t>A design assuming those capabilities could fail to build with the current edition or silently add a commercial dependency. Feature names and public packages alone do not establish Community availability or stable compatibility.</w:t>
+      </w:r>
+    </w:p>
+    <w:p>
+      <w:pPr>
+        <w:keepLines w:val="0"/>
+      </w:pPr>
+      <w:r>
+        <w:rPr>
+          <w:b/>
+        </w:rPr>
+        <w:t xml:space="preserve">Guidance and change: </w:t>
+      </w:r>
+      <w:r>
+        <w:t xml:space="preserve">Use Community Edition as a fixed constraint, with no purchase evaluation in the sequence. Retain custom booking insertion/refinement and independent candidate validation. For ordering, evaluate application-owned directed-road estimates and bounded top-k generation, with exhaustive ordering/coverage checks; do not configure Enterprise nearby selection. Produce business explanations from independent violations, coverage, overtime, cents, and policy reasons. Use available Community benchmark statistics, ConstraintVerifier, JFR, and external allocation profiling. Supported public solution/score facilities require version and edition checks; do not assume Enterprise Score Analysis or constraint profiling exists. </w:t>
+      </w:r>
+      <w:hyperlink r:id="rId20">
+        <w:r>
+          <w:rPr>
+            <w:color w:val="205781"/>
+          </w:rPr>
+          <w:t>Guide chapter 32</w:t>
+        </w:r>
+      </w:hyperlink>
+      <w:r/>
+    </w:p>
+    <w:p>
+      <w:pPr>
+        <w:keepLines w:val="0"/>
+      </w:pPr>
+      <w:r>
+        <w:rPr>
+          <w:b/>
+        </w:rPr>
+        <w:t xml:space="preserve">Why this helps: </w:t>
+      </w:r>
+      <w:r>
+        <w:t>The plan remains implementable without a license purchase. Community application explanations and external profilers provide useful evidence but have their own maintenance costs and do not reproduce all Enterprise diagnostics. Parallel independent solves remain available without custom parallel scoring.</w:t>
+      </w:r>
+    </w:p>
+    <w:p>
+      <w:pPr>
+        <w:keepLines w:val="0"/>
+      </w:pPr>
+      <w:r>
+        <w:rPr>
+          <w:b/>
+        </w:rPr>
+        <w:t xml:space="preserve">Acceptance: </w:t>
+      </w:r>
+      <w:r>
+        <w:t>Record artifact, version, edition, and API status for every dependency. Public solver/factory/configuration and supported benchmark APIs form the engine boundary; preview APIs require an opt-in compatibility gate, and DefaultSolver, phase scopes, and internal score-director access remain exact-version diagnostic adapters under TF09. Verify advanced move selectors against the pinned release rather than treating all XML settings as equally stable. A Community-only smoke build exercises every proposed treatment; reject Enterprise properties. Defer custom multithreaded move evaluation and forks until evidence and a separate design justify them.</w:t>
+      </w:r>
+    </w:p>
+    <w:p>
+      <w:pPr>
+        <w:pStyle w:val="Heading2"/>
+      </w:pPr>
+      <w:r>
+        <w:t>CR11 Defer shadow variable remodeling until timing remains dominant</w:t>
+      </w:r>
+    </w:p>
+    <w:p>
+      <w:pPr>
+        <w:keepLines w:val="0"/>
+      </w:pPr>
+      <w:r>
+        <w:rPr>
+          <w:b/>
+        </w:rPr>
+        <w:t xml:space="preserve">Current behavior: </w:t>
+      </w:r>
+      <w:r>
+        <w:t>A route-changing move causes the Constraint Streams map node to recompute route timing, including a dynamic program over availability blocks. Evidence: R19 and R01. Classification: Low, unmeasured modeling opportunity.</w:t>
+      </w:r>
+    </w:p>
+    <w:p>
+      <w:pPr>
+        <w:keepLines w:val="0"/>
+      </w:pPr>
+      <w:r>
+        <w:rPr>
+          <w:b/>
+        </w:rPr>
+        <w:t xml:space="preserve">Consequence: </w:t>
+      </w:r>
+      <w:r>
+        <w:t>A late-route move may recompute earlier timing, but routes can be short and the dynamic program couples return choices across a route. Incremental per-visit arrivals are not automatically equivalent to this policy.</w:t>
+      </w:r>
+    </w:p>
+    <w:p>
+      <w:pPr>
+        <w:keepLines w:val="0"/>
+      </w:pPr>
+      <w:r>
+        <w:rPr>
+          <w:b/>
+        </w:rPr>
+        <w:t xml:space="preserve">Guidance and change: </w:t>
+      </w:r>
+      <w:r>
+        <w:t xml:space="preserve">Reconsider shadow variables only after profiling CR07, TF13, and TF12 changes. Timefold 2.x uses declarative custom shadow variables; the legacy VariableListener API was removed and is not a remodeling option for 2.6.0. Check public/preview status in the selected release. Preserve global block/return decisions and supported list-variable lifecycle behavior. </w:t>
+      </w:r>
+      <w:hyperlink r:id="rId14">
+        <w:r>
+          <w:rPr>
+            <w:color w:val="205781"/>
+          </w:rPr>
+          <w:t>Guide section 10.8</w:t>
+        </w:r>
+      </w:hyperlink>
+      <w:r/>
+    </w:p>
+    <w:p>
+      <w:pPr>
+        <w:keepLines w:val="0"/>
+      </w:pPr>
+      <w:r>
+        <w:rPr>
+          <w:b/>
+        </w:rPr>
+        <w:t xml:space="preserve">Why this helps: </w:t>
+      </w:r>
+      <w:r>
+        <w:t>Incremental arrivals may reduce repeated work on longer routes; the cost is a new model with more invalidation, pinning, and undo invariants. Profiled timing dominance is a prerequisite, not evidence of eventual speedup.</w:t>
+      </w:r>
+    </w:p>
+    <w:p>
+      <w:pPr>
+        <w:keepLines w:val="0"/>
+      </w:pPr>
+      <w:r>
+        <w:rPr>
+          <w:b/>
+        </w:rPr>
+        <w:t xml:space="preserve">Acceptance: </w:t>
+      </w:r>
+      <w:r>
+        <w:t>Record the remaining timing CPU share and route-length sensitivity before starting. Prove equivalence for moves, undo, absences, return points, pinning, clone isolation, and infeasible repair under assertion modes. Adopt only after matched quality and performance evidence.</w:t>
       </w:r>
     </w:p>
     <w:p>
@@ -2525,7 +3456,7 @@
         <w:t xml:space="preserve">Configuration example: </w:t>
       </w:r>
       <w:r>
-        <w:t>A Layer A reference batch uses warmUpSecondsSpentLimit=60, parallelBenchmarkCount=1, subSingleCount=5, environmentMode=NO_ASSERT, spentLimit=10s, and the TABU change/swap configuration. A matched batch uses LA change/swap. Sixty seconds is a provisional campaign default pending calibration. These are native property names described in guide sections 31.2 and 31.7; a full XML file must be validated against 2.6.0 before use. The warmup allowance applies to the benchmark invocation, not automatically to every treatment path or dataset. Separate batches and explicit warmup coverage prevent that assumption.</w:t>
+        <w:t>A Layer A reference case may use parallelBenchmarkCount=1, explicit seeds, environmentMode=NO_ASSERT, spentLimit=10s, and TABU change/swap, paired with LA change/swap. The campaign JSON declares warmup and repetitions; these example values are not mandatory budgets. Each fresh JVM warms its own measured paths, even when multiple independent JVM cases run in parallel. These are native property names described in guide sections 31.2 and 31.7; a full XML file must be validated against 2.6.0 before use. The warmup allowance applies to the benchmark invocation, not automatically to every treatment path or dataset. Separate batches and explicit warmup coverage prevent that assumption.</w:t>
       </w:r>
     </w:p>
     <w:p>
@@ -2607,7 +3538,7 @@
         <w:keepLines w:val="0"/>
       </w:pPr>
       <w:r>
-        <w:t>For an initial tuning corpus, use twelve independent datasets: two fleet sizes, 20 and 50; three scenario families, clustered, dispersed, and absence; and two dataset seeds per family/size. Prepare another twelve with different dataset seeds as a sealed confirmation corpus. Each generator output must demonstrate its declared structure, not merely have a different hash. This is a tractable first design, not a claim of population coverage. Add mixed-skill, tight-window, near-capacity, and real-day cohorts before deployment decisions beyond the covered families.</w:t>
+        <w:t>One worked corpus example contains twelve independent datasets: two fleet sizes, 20 and 50; three scenario families, clustered, dispersed, and absence; and two dataset seeds per family/size. In that example another twelve with different dataset seeds form a sealed confirmation corpus. Dataset families, fleet sizes, and all seed lists are explicit configuration, not required counts. Each generator output must demonstrate its declared structure, not merely have a different hash. This is a tractable first design, not a claim of population coverage. Add mixed-skill, tight-window, near-capacity, and real-day cohorts before deployment decisions beyond the covered families.</w:t>
       </w:r>
     </w:p>
     <w:p>
@@ -2662,7 +3593,7 @@
         <w:rPr>
           <w:b/>
         </w:rPr>
-        <w:t xml:space="preserve">Proposed pilot: </w:t>
+        <w:t xml:space="preserve">Worked example: </w:t>
       </w:r>
       <w:r>
         <w:t>Compare 0.2, 30, and 60 seconds of warmup on two representative fixed datasets, each for TABU and LA and both reference and fairness paths, with three fresh JVM repetitions and a ten-second measured probe. This gives 72 observations. Use an explicit seed schedule and balanced execution order. Keep warmup output separate, record compilation/GC activity and interval throughput, and inspect whether later warmup changes the measured distribution.</w:t>
@@ -2673,7 +3604,7 @@
         <w:keepLines w:val="0"/>
       </w:pPr>
       <w:r>
-        <w:t>The decision rule for this pilot is a project default, not a Timefold requirement: provisionally accept sixty seconds only when the 30-versus-60-second probe medians differ by no more than five percent in move throughput within each tested path and interval traces show no persistent startup trend. Three forks are a diagnostic screen, not statistical proof of stationarity. If the screen fails or is ambiguous, extend warmup to 120 seconds and add repetitions before the main campaign; retain the failed calibration. A changed algorithm, JVM, heap, or dataset scale can require recalibration.</w:t>
+        <w:t>The decision rule for this pilot is an illustrative configurable analysis rule, not a production default or Timefold requirement: provisionally accept sixty seconds only when the 30-versus-60-second probe medians differ by no more than five percent in move throughput within each tested path and interval traces show no persistent startup trend. Three forks are a diagnostic screen, not statistical proof of stationarity. If the screen fails or is ambiguous, explicitly configure another calibration attempt, for example 120 seconds with more repetitions, and retain the failed attempt. Do not silently select experiments or auto-retry. A changed algorithm, JVM, heap, or dataset scale can require recalibration.</w:t>
       </w:r>
     </w:p>
     <w:p>
@@ -2681,7 +3612,7 @@
         <w:keepLines w:val="0"/>
       </w:pPr>
       <w:r>
-        <w:t>For main batches, warm the same code paths and phase as the measurements with disposable copies, then reload clean inputs. Fix and record process lifetime and ordering. The default protocol runs one worker batch at a time with no move threads and no nested benchmark parallelism. Record CPU model, topology, affinity, heap, GC, JDK, loaded dependencies, OS, and competing activity. Existing SerialGC/two-logical-processor results form a separate cohort; do not call those settings inherently wrong, but do not equate them with a different deployment runtime.</w:t>
+        <w:t>For main batches, warm the same code paths and phase as the measurements with disposable copies, then reload clean inputs. Fix and record process lifetime and ordering. Keep parallel independent JVM cases configurable. For every fresh JVM require path-specific warmup, bounded heap/CPU allocation, and move threads disabled; set native internal parallelism to one to avoid nested benchmark parallelism. Calibrate outer concurrency, comparing only matching concurrency/runtime configurations. Record CPU model, topology, affinity, heap, GC, JDK, loaded dependencies, OS, and competing activity. Existing SerialGC/two-logical-processor results form a separate cohort; do not call those settings inherently wrong, but do not equate them with a different deployment runtime.</w:t>
       </w:r>
     </w:p>
     <w:p>
@@ -2689,7 +3620,7 @@
         <w:keepLines w:val="0"/>
       </w:pPr>
       <w:r>
-        <w:t>Cold-start measurements deliberately include startup and the first request, without warmup. Warm-service tests reuse a service process after the accepted warmup. Scheduler-cache-cold tests explicitly clear only the documented scheduler caches and record provider state as unchanged/unknown unless a separate controlled provider instance is reset. Complete latency must state whether process startup, dataset loading, and network transport are included.</w:t>
+        <w:t>Record the deployment model explicitly. A long-lived warmed-service study requires warmup; a scale-to-zero Layer C cold-start cohort deliberately includes startup and the first request without warmup. Do not substitute cold-start measurements for warmed solver comparisons. Warm-service tests reuse a service process after the accepted warmup. Scheduler-cache-cold tests explicitly clear only the documented scheduler caches and record provider state as unchanged/unknown unless a separate controlled provider instance is reset. Complete latency must state whether process startup, dataset loading, and network transport are included.</w:t>
       </w:r>
     </w:p>
     <w:p>
@@ -3285,7 +4216,7 @@
         <w:keepLines w:val="0"/>
       </w:pPr>
       <w:r>
-        <w:t>Use native BEST_SCORE, MOVE_EVALUATION_SPEED, and SCORE_CALCULATION_SPEED statistics where supported by the pinned benchmark artifact. Store effective enabled statistics because defaults can change. Add per-move-type and constraint-match diagnostics in separate diagnostic batches. Detailed tracing and constraint profiling can perturb timing; compare with the same instrumentation or keep the diagnostic cohort separate. The local guide explains these distinctions in sections 31.4 through 31.6 and 16.11.</w:t>
+        <w:t>Use native BEST_SCORE, MOVE_EVALUATION_SPEED, and SCORE_CALCULATION_SPEED statistics where supported by the pinned benchmark artifact. Store effective enabled statistics because defaults can change. Add only pinned-version Community diagnostics in separate batches. Per-move-type data or internal constraint-match access requires an exact-version adapter; Enterprise constraint profiling and Score Analysis are excluded. Detailed tracing and constraint profiling can perturb timing; compare with the same instrumentation or keep the diagnostic cohort separate. The local guide explains these distinctions in sections 31.4 through 31.6 and 16.11.</w:t>
       </w:r>
     </w:p>
     <w:p>
@@ -3337,7 +4268,7 @@
         <w:keepLines w:val="0"/>
       </w:pPr>
       <w:r>
-        <w:t>Compute per-dataset paired effects after averaging the repeated seeds and forks within that dataset. Report each dataset, scenario-family summaries, and an equal-dataset overall summary. For the sealed confirmation, calculate a 95 percent paired cluster-bootstrap interval by resampling whole datasets, retaining all their paired repetitions, with 10,000 bootstrap draws and a recorded bootstrap seed of 20261006. This is a proposed WaterFlex analysis method, not a statistical guarantee supplied by native Benchmarker. With twelve synthetic datasets, inference remains exploratory and applies to that corpus.</w:t>
+        <w:t>Compute per-dataset paired effects after averaging the repeated seeds and forks within that dataset. Report each dataset, scenario-family summaries, and an equal-dataset overall summary. For the sealed confirmation, calculate a 95 percent paired cluster-bootstrap interval by resampling whole datasets, retaining all their paired repetitions, with draw count, interval level, and bootstrap seed declared in the JSON. A worked analysis example uses 10,000 draws, 95 percent confidence, and seed 20261006. This is a proposed WaterFlex analysis method, not a statistical guarantee supplied by native Benchmarker. With a small synthetic corpus, such as twelve datasets, inference remains exploratory and applies to that corpus; more seeds do not increase independent dataset coverage.</w:t>
       </w:r>
     </w:p>
     <w:p>
@@ -3369,7 +4300,7 @@
         <w:pStyle w:val="Heading2"/>
       </w:pPr>
       <w:r>
-        <w:t>Proposed configuration and evidence contracts</w:t>
+        <w:t>One versioned JSON file owns campaign parameters</w:t>
       </w:r>
     </w:p>
     <w:p>
@@ -3377,7 +4308,15 @@
         <w:keepLines w:val="0"/>
       </w:pPr>
       <w:r>
-        <w:t>The following is a version 2 design, not syntax accepted by today's version 1 runner. Keep the current parser and archives readable. Add a new strict schema and explicit migration/import path; never reinterpret an old seed as a dataset seed or old warmup as a calibrated policy.</w:t>
+        <w:t>The proposed schemaVersion=2 interface is design guidance; today's version 1 runner does not implement it. Preserve existing configurations and archives through an explicit version dispatch and migration/import path. Never reinterpret an old solver seed as a dataset seed or historical warmup as calibrated behavior. The companion evidence/fourth-review/campaign-example.json demonstrates a complete parameter inventory, not a file runnable by run_experiment.py.</w:t>
+      </w:r>
+    </w:p>
+    <w:p>
+      <w:pPr>
+        <w:keepLines w:val="0"/>
+      </w:pPr>
+      <w:r>
+        <w:t>The CLI selects the configuration file and operation, such as validate, dry-run, run, resume, or analyze. It does not override seed, budget, heap, CPU, load, or analysis settings. One JSON file must contain every adjustable parameter, including fully expanded profile values; no mutable external profile alias may silently change a campaign. Immutable dataset files can be referenced by path and hash. Credentials stay in the existing secret mechanism or environment and never enter this JSON or its archived resolution.</w:t>
       </w:r>
     </w:p>
     <w:tbl>
@@ -3488,7 +4427,7 @@
                 <w:color w:val="000000"/>
                 <w:sz w:val="20"/>
               </w:rPr>
-              <w:t>Campaign</w:t>
+              <w:t>Campaign identity</w:t>
             </w:r>
           </w:p>
         </w:tc>
@@ -3515,7 +4454,7 @@
                 <w:color w:val="000000"/>
                 <w:sz w:val="20"/>
               </w:rPr>
-              <w:t>schemaVersion=2; campaign ID; layer; control and treatment configuration IDs; corpus manifest hash; phase and target identity; measured budgets; dataset IDs; effective solver seeds; fork count; saved execution order; warmup policy; runtime profile; instrumentation profile; failure policy.</w:t>
+              <w:t>Schema version, campaign ID, purpose, Community edition, layer, deployment model, control/treatment IDs, scoring version, dataset paths/hashes or generator version and dataset seeds, scenario families, initial-state classes and tuning/held-out roles.</w:t>
             </w:r>
           </w:p>
         </w:tc>
@@ -3547,7 +4486,7 @@
                 <w:color w:val="000000"/>
                 <w:sz w:val="20"/>
               </w:rPr>
-              <w:t>Dataset</w:t>
+              <w:t>Search and allowance</w:t>
             </w:r>
           </w:p>
         </w:tc>
@@ -3574,7 +4513,7 @@
                 <w:color w:val="000000"/>
                 <w:sz w:val="20"/>
               </w:rPr>
-              <w:t>schema version; dataset ID and content hash; generator/version/dataset seed or snapshot provenance; initial-state class; all technicians, visits, assignments, windows, absences, skills, rates, policy, directed legs, routing identity, and calendar reference. No solver seed hidden in the dataset identity.</w:t>
+              <w:t>Algorithms, acceptor/forager settings, move families/weights/bounds, effective solver seed list, process repetitions, phase/total budgets, phase allocation and unused-time transfer, validation reserve, fixed-budget and phase termination policies with every window/ratio/threshold.</w:t>
             </w:r>
           </w:p>
         </w:tc>
@@ -3606,7 +4545,7 @@
                 <w:color w:val="000000"/>
                 <w:sz w:val="20"/>
               </w:rPr>
-              <w:t>Batch</w:t>
+              <w:t>Execution resources</w:t>
             </w:r>
           </w:p>
         </w:tc>
@@ -3633,7 +4572,7 @@
                 <w:color w:val="000000"/>
                 <w:sz w:val="20"/>
               </w:rPr>
-              <w:t>One treatment, phase, budget, and JVM fork; selected datasets and solver repetitions; explicit warmup coverage; process ID, resource allocation, actual runtime flags, launch time, and observed loaded versions.</w:t>
+              <w:t>Outer parallel cases, CPU allocation and affinity policy, warmup/calibration policy and coverage, JVM path/version, heap min/max, GC, ActiveProcessorCount and flags, process lifetime and environment mode. No move threads or nested native parallelism.</w:t>
             </w:r>
           </w:p>
         </w:tc>
@@ -3665,7 +4604,7 @@
                 <w:color w:val="000000"/>
                 <w:sz w:val="20"/>
               </w:rPr>
-              <w:t>Result</w:t>
+              <w:t>Measurement and analysis</w:t>
             </w:r>
           </w:p>
         </w:tc>
@@ -3692,7 +4631,7 @@
                 <w:color w:val="000000"/>
                 <w:sz w:val="20"/>
               </w:rPr>
-              <w:t>Case/attempt IDs; input/config/target/runtime hashes; effective seed and fork; outcome; raw score with phase semantics; independent validation; reference and accepted business metrics; actual phase durations; raw trace/output paths and hashes; explicit reason for unavailable metrics.</w:t>
+              <w:t>Instrumentation and sampling settings, metric availability, diagnostic cohort, pair keys, outcome rules, uncertainty method/draws/seed/level, scenario groups, promotion tolerances, execution-order seed and explicit failure/resume behavior.</w:t>
             </w:r>
           </w:p>
         </w:tc>
@@ -3724,7 +4663,7 @@
                 <w:color w:val="000000"/>
                 <w:sz w:val="20"/>
               </w:rPr>
-              <w:t>Archive</w:t>
+              <w:t>Application and output</w:t>
             </w:r>
           </w:p>
         </w:tc>
@@ -3751,7 +4690,66 @@
                 <w:color w:val="000000"/>
                 <w:sz w:val="20"/>
               </w:rPr>
-              <w:t>Frozen artifacts; original and resolved configurations; corpus manifest; ordered cases/batches; started/completed/failed/interrupted receipts; native output; raw normalized rows; separate analysis version and decision record.</w:t>
+              <w:t>Load mode, request count/rate/concurrency, cache state, endpoint operation, timeout and cancellation observations, output location, optional campaign cutoff declared null when disabled. Layer-inapplicable fields use explicit applicability rules rather than fabricated data.</w:t>
+            </w:r>
+          </w:p>
+        </w:tc>
+      </w:tr>
+      <w:tr>
+        <w:trPr>
+          <w:cantSplit/>
+        </w:trPr>
+        <w:tc>
+          <w:tcPr>
+            <w:tcW w:type="dxa" w:w="1584"/>
+            <w:vAlign w:val="center"/>
+            <w:tcMar>
+              <w:top w:w="100" w:type="dxa"/>
+              <w:left w:w="100" w:type="dxa"/>
+              <w:bottom w:w="100" w:type="dxa"/>
+              <w:right w:w="100" w:type="dxa"/>
+            </w:tcMar>
+            <w:shd w:fill="F4F8FB"/>
+          </w:tcPr>
+          <w:p>
+            <w:pPr>
+              <w:widowControl/>
+              <w:spacing w:after="40" w:before="40" w:line="250" w:lineRule="auto"/>
+            </w:pPr>
+            <w:r>
+              <w:rPr>
+                <w:b/>
+                <w:color w:val="000000"/>
+                <w:sz w:val="20"/>
+              </w:rPr>
+              <w:t>Dataset and result</w:t>
+            </w:r>
+          </w:p>
+        </w:tc>
+        <w:tc>
+          <w:tcPr>
+            <w:tcW w:type="dxa" w:w="8496"/>
+            <w:vAlign w:val="center"/>
+            <w:tcMar>
+              <w:top w:w="100" w:type="dxa"/>
+              <w:left w:w="100" w:type="dxa"/>
+              <w:bottom w:w="100" w:type="dxa"/>
+              <w:right w:w="100" w:type="dxa"/>
+            </w:tcMar>
+            <w:shd w:fill="F4F8FB"/>
+          </w:tcPr>
+          <w:p>
+            <w:pPr>
+              <w:widowControl/>
+              <w:spacing w:after="40" w:before="40" w:line="250" w:lineRule="auto"/>
+            </w:pPr>
+            <w:r>
+              <w:rPr>
+                <w:b w:val="0"/>
+                <w:color w:val="000000"/>
+                <w:sz w:val="20"/>
+              </w:rPr>
+              <w:t>Indexed directed-road contract from CR09; canonical input/config/target hashes; attempt/case identity, effective seed, outcome and reason, validation, reference/accepted metrics, actual phase/CPU durations, raw output and trace hashes. Unknown measurements are null with a reason.</w:t>
             </w:r>
           </w:p>
         </w:tc>
@@ -3767,13 +4765,45 @@
         <w:keepLines w:val="0"/>
       </w:pPr>
       <w:r>
+        <w:t>Archive the original JSON bytes and a fully resolved configuration before dispatch, plus canonical configuration hashes and a deterministic expanded case order. In a separate runtime receipt record discovered hardware/topology, actual affinity/CPU limits, effective JVM flags, loaded dependency/JDK versions, artifact hashes, OS and competing activity. The configuration states requested resources; receipts state what actually ran. Unsupported settings fail explicitly instead of being ignored.</w:t>
+      </w:r>
+    </w:p>
+    <w:p>
+      <w:pPr>
+        <w:keepLines w:val="0"/>
+      </w:pPr>
+      <w:r>
+        <w:t>Validate all required objects, arrays, finite numbers, units, positive budgets, nonnegative overhead estimates, unique identities, seed types, phase allocation, directed-leg completeness, and target compatibility before copying. Reject unknown fields, duplicate JSON keys, nonfinite JSON numbers, unsupported versions, and missing required values. Declare optional cutoff and genuinely unavailable metrics nullable with reasons; missing scheduling facts never become zero or empty data. Community edition and nativeParallelBenchmarkCount=1 with moveThreads=NONE are acceptance conditions, not upgrade hints.</w:t>
+      </w:r>
+    </w:p>
+    <w:p>
+      <w:pPr>
+        <w:keepLines w:val="0"/>
+      </w:pPr>
+      <w:r>
+        <w:t>Resume may reuse only complete hash-verified comparison blocks under identical resolved configuration, artifacts, inputs, runtime cohort, and calibration. A restart warms its fresh JVM again. Retain partial native batches and failures, and put explicit reruns in new attempts without double counting. Preserve the measurement lock and do not overlap campaigns with unrelated heavy work.</w:t>
+      </w:r>
+    </w:p>
+    <w:p>
+      <w:pPr>
+        <w:pStyle w:val="Heading2"/>
+      </w:pPr>
+      <w:r>
+        <w:t>CR06 Evaluate termination by algorithm and phase</w:t>
+      </w:r>
+    </w:p>
+    <w:p>
+      <w:pPr>
+        <w:keepLines w:val="0"/>
+      </w:pPr>
+      <w:r>
         <w:rPr>
           <w:b/>
         </w:rPr>
-        <w:t xml:space="preserve">Example resolved campaign: </w:t>
-      </w:r>
-      <w:r>
-        <w:t>schemaVersion=2, layer=solver, phase=reference, control=tabu-change-swap, treatments=[tabu-change-swap, la-change-swap], corpus=tuning-12, measuredBudgetsMs=[10000,60000], solverSeeds=[17,23,41,59,83], forks=2, warmupSeconds=60, parallelBatches=1, nativeParallelBenchmarkCount=1, moveThreads=NONE, and instrumentation=quality-basic. Hash the resolved settings and the expanded order. The example uses named profiles whose complete settings must be stored alongside it, not mutable aliases resolved later.</w:t>
+        <w:t xml:space="preserve">Current behavior: </w:t>
+      </w:r>
+      <w:r>
+        <w:t>Production TABU uses spent allowances; CURRENT_CAPPED also preserves a step cap. No current configuration applies diminished returns or unimproved time. Evidence: R10 and R12. Classification: Medium, unmeasured opportunity.</w:t>
       </w:r>
     </w:p>
     <w:p>
@@ -3781,7 +4811,13 @@
         <w:keepLines w:val="0"/>
       </w:pPr>
       <w:r>
-        <w:t>Implement the corpus validator before SolutionFileIO. Validate finite numbers, unique identities, required arrays and collection lookups, route coverage, and target compatibility before copying. Unknown fields, duplicate JSON keys, missing required values, and unsupported versions fail explicitly. Not-applicable fairness targets or unavailable metrics use declared nullable fields with reasons; no fake empty arrays or zero values stand in for scheduling data.</w:t>
+        <w:rPr>
+          <w:b/>
+        </w:rPr>
+        <w:t xml:space="preserve">Consequence: </w:t>
+      </w:r>
+      <w:r>
+        <w:t>Some solves may spend allowance after useful progress stalls, but a plateau does not prove convergence. Early stopping can lose a later improvement, change fairness targets, and alter complete-pipeline quality. Step counts and CPU seconds are different measures.</w:t>
       </w:r>
     </w:p>
     <w:p>
@@ -3789,31 +4825,90 @@
         <w:keepLines w:val="0"/>
       </w:pPr>
       <w:r>
-        <w:t>Fingerprint all score-relevant facts and initial assignments. The current ad hoc fingerprint is not a complete future dataset contract: it omits some facts such as monetary rates and initial route ordering. Canonical serialization must include policy and phase target and preserve meaningful sequence order. Verify that changing one relevant fact changes the fingerprint, and that read/write round trips preserve semantics and identity.</w:t>
-      </w:r>
+        <w:rPr>
+          <w:b/>
+        </w:rPr>
+        <w:t xml:space="preserve">Guidance and change: </w:t>
+      </w:r>
+      <w:r>
+        <w:t xml:space="preserve">Retain a fixed-budget control for each algorithm and phase. Cross termination policy with TABU and LA and with reference, fairness, and repair where eligible. Test a local-search diminished-returns window/ratio and an unimproved-time threshold inside an overall spent allowance. Configure windows relative to the allowance; the guide's thirty-second diminished-returns default is longer than a fifteen-second pipeline. The guide shows OR composition of diminished returns with a spent limit and also documents local-search phase configuration. Do not claim that any step cap universally disables diminished returns, or that every combination and scope is valid: distinguish explicit core composition from framework auto-configuration and compile/check effective settings against 2.6.0. A solver-level spent cap can bound the enclosing solve while local search uses its own termination; preserve existing caps when applying overrides. Pinned core factory bytecode was inspected for configuration construction, without executing proposed treatments. </w:t>
+      </w:r>
+      <w:hyperlink r:id="rId23">
+        <w:r>
+          <w:rPr>
+            <w:color w:val="205781"/>
+          </w:rPr>
+          <w:t>Guide section 37.2.4</w:t>
+        </w:r>
+      </w:hyperlink>
+      <w:r/>
     </w:p>
     <w:p>
       <w:pPr>
         <w:keepLines w:val="0"/>
       </w:pPr>
       <w:r>
-        <w:t>Pair the native raw outputs with independent validation receipts before declaring completion. Resume may reuse only complete, hash-verified batches under identical artifacts, inputs, runtime profile, and calibration policy. Partially completed native batches remain partial; an explicit rerun is a new attempt, and analysis must not double count old and new rows. A process restart requires warmup again. Preserve the existing measurement lock and prohibit overlapping Layer A/B campaigns with unrelated heavy work.</w:t>
+        <w:rPr>
+          <w:b/>
+        </w:rPr>
+        <w:t xml:space="preserve">Why this helps: </w:t>
+      </w:r>
+      <w:r>
+        <w:t>An eligible policy may reduce resource occupancy on particular workloads. It cannot guarantee convergence or unchanged quality, and a policy selected on TABU cannot be assumed best for LA, a new neighborhood, or another phase. Keep policy parameters in the JSON and treat selection as a measured interaction.</w:t>
       </w:r>
     </w:p>
     <w:p>
       <w:pPr>
-        <w:pStyle w:val="Heading2"/>
-      </w:pPr>
-      <w:r>
-        <w:t>Staged campaigns and explicit time allowances</w:t>
+        <w:keepLines w:val="0"/>
+      </w:pPr>
+      <w:r>
+        <w:rPr>
+          <w:b/>
+        </w:rPr>
+        <w:t xml:space="preserve">Acceptance: </w:t>
+      </w:r>
+      <w:r>
+        <w:t>Community-only configuration smoke checks prove solver/phase scope, preserved caps, applicable termination reason and unknown-reason handling. Compare valid accepted cost, fairness, coverage, incomplete/failure rates, CPU seconds, elapsed time, and p95 request cleanup with the corresponding fixed-budget control. Measure cooperative overshoot and keep late-improvement cases visible. Choose parameters on tuning data and confirm on held-out datasets before changing defaults.</w:t>
       </w:r>
     </w:p>
     <w:p>
       <w:pPr>
+        <w:pStyle w:val="Heading2"/>
+      </w:pPr>
+      <w:r>
+        <w:t>Coverage allowance and resources are separate decisions</w:t>
+      </w:r>
+    </w:p>
+    <w:p>
+      <w:pPr>
         <w:keepLines w:val="0"/>
       </w:pPr>
       <w:r>
-        <w:t>These matrices are proposed starting campaigns. Counts are mathematical expansion, not measured work. Time allowances assume sequential batches and full configured durations. Startup, dataset loading, native report generation, validation, and calibration retries add overhead. Early termination may use less time. Do not reuse the current 2.5-second per-case overhead estimate after changing process lifetime and warmup.</w:t>
+        <w:t>Coverage is the selected datasets, algorithms, moves, termination policies, seeds, repetitions, phases and budgets. Per-solve allowance is the time each selected solve may consume; phase allocation and validation reserve define its usable search portion. Execution resources are CPU, heap and concurrency. Raising parallel cases does not increase dataset coverage or shorten the configured solve allowance, and longer solving is a different comparison from more repetitions.</w:t>
+      </w:r>
+    </w:p>
+    <w:p>
+      <w:pPr>
+        <w:keepLines w:val="0"/>
+      </w:pPr>
+      <w:r>
+        <w:t>Short daytime studies can explicitly choose fewer tuning datasets or seeds and production allowances, with calibrated outer concurrency. Longer overnight studies can explicitly expand coverage or include longer allowances. Both use the same schema and operations; no required preset, automatic campaign selection, mandatory stage count, or fixed total duration is imposed. Production-budget evidence remains primary for production decisions. Longer-budget results answer separate sensitivity or overnight questions and cannot establish fifteen-second endpoint quality.</w:t>
+      </w:r>
+    </w:p>
+    <w:p>
+      <w:pPr>
+        <w:keepLines w:val="0"/>
+      </w:pPr>
+      <w:r>
+        <w:t>Dry-run expands the JSON into a saved matrix without solving. Report cases, fresh JVMs, comparison blocks, required fairness-reference setup, budget cohorts, warmup coverage, resource demand, and both nominal allowances and overhead estimates. For one rectangular phase cohort, N = A x M x T x D x S x R x B, where A is algorithm configurations, M is move packages, T termination policies, D datasets, S solver seeds, R process repetitions, and B budget values. For uneven matrices, sum valid expanded cases instead of multiplying incompatible factors. Do not count a move package twice if it is already part of A.</w:t>
+      </w:r>
+    </w:p>
+    <w:p>
+      <w:pPr>
+        <w:keepLines w:val="0"/>
+      </w:pPr>
+      <w:r>
+        <w:t>Nominal solve allowance is the sum of configured per-case budgets, counting the combined pipeline once rather than twice for its phases. Warmup allowance is the sum over fresh JVMs of their path-specific warmup. Add preparation, startup, validation, export/reporting, reference setup, and analysis overhead separately. Serial allowance is their sum. Dividing parallelizable case work by P gives an optimistic estimate, not a completion guarantee; serial overhead, uneven cases, contention, GC, cooperative overshoot, and early termination change observed wall time. Use a calibration pilot to refine estimates and retain both requested and observed times.</w:t>
       </w:r>
     </w:p>
     <w:tbl>
@@ -3893,7 +4988,7 @@
                 <w:color w:val="000000"/>
                 <w:sz w:val="20"/>
               </w:rPr>
-              <w:t>Matrix and purpose</w:t>
+              <w:t>Worked example only</w:t>
             </w:r>
           </w:p>
         </w:tc>
@@ -3921,7 +5016,7 @@
                 <w:color w:val="000000"/>
                 <w:sz w:val="20"/>
               </w:rPr>
-              <w:t>Count and nominal allowance</w:t>
+              <w:t>Calculated nominal allowances</w:t>
             </w:r>
           </w:p>
         </w:tc>
@@ -3953,7 +5048,7 @@
                 <w:color w:val="000000"/>
                 <w:sz w:val="20"/>
               </w:rPr>
-              <w:t>0 Correctness and smoke</w:t>
+              <w:t>Production reference</w:t>
             </w:r>
           </w:p>
         </w:tc>
@@ -3980,7 +5075,7 @@
                 <w:color w:val="000000"/>
                 <w:sz w:val="20"/>
               </w:rPr>
-              <w:t>All selected configurations on tiny feasible/invalid/repair cases; verify imports, caps, copies, and receipts.</w:t>
+              <w:t>2 algorithms x 3 termination policies x 4 datasets x 2 solver seeds x 2 repetitions x one 10-second budget; one fresh JVM per case, 30-second warmup and 4 seconds estimated startup/preparation/validation/reporting per case.</w:t>
             </w:r>
           </w:p>
         </w:tc>
@@ -4007,7 +5102,7 @@
                 <w:color w:val="000000"/>
                 <w:sz w:val="20"/>
               </w:rPr>
-              <w:t>Test suite plus short smoke only. Never report its scores as quality evidence.</w:t>
+              <w:t>96 observations; 960 seconds solving + 2,880 seconds warmup + 384 seconds overhead = 4,224 seconds serial; optimistic 2-worker estimate 2,112 seconds or 35.2 minutes.</w:t>
             </w:r>
           </w:p>
         </w:tc>
@@ -4039,7 +5134,7 @@
                 <w:color w:val="000000"/>
                 <w:sz w:val="20"/>
               </w:rPr>
-              <w:t>1 Warmup calibration</w:t>
+              <w:t>Separate longer reference</w:t>
             </w:r>
           </w:p>
         </w:tc>
@@ -4066,7 +5161,7 @@
                 <w:color w:val="000000"/>
                 <w:sz w:val="20"/>
               </w:rPr>
-              <w:t>2 methods x 2 phases x 2 representative datasets x 3 warmups x 3 fresh JVMs; one 10-second probe each.</w:t>
+              <w:t>Same coverage and runtime, explicitly replace the budget list with one 60-second allowance in another registered configuration.</w:t>
             </w:r>
           </w:p>
         </w:tc>
@@ -4093,351 +5188,7 @@
                 <w:color w:val="000000"/>
                 <w:sz w:val="20"/>
               </w:rPr>
-              <w:t>72 observations; 12 minutes measured solving plus 36.08 minutes warmup, about 48.08 minutes before overhead.</w:t>
-            </w:r>
-          </w:p>
-        </w:tc>
-      </w:tr>
-      <w:tr>
-        <w:trPr>
-          <w:cantSplit/>
-        </w:trPr>
-        <w:tc>
-          <w:tcPr>
-            <w:tcW w:type="dxa" w:w="2016"/>
-            <w:vAlign w:val="center"/>
-            <w:tcMar>
-              <w:top w:w="100" w:type="dxa"/>
-              <w:left w:w="100" w:type="dxa"/>
-              <w:bottom w:w="100" w:type="dxa"/>
-              <w:right w:w="100" w:type="dxa"/>
-            </w:tcMar>
-            <w:shd w:fill="FFFFFF"/>
-          </w:tcPr>
-          <w:p>
-            <w:pPr>
-              <w:widowControl/>
-              <w:spacing w:after="40" w:before="40" w:line="250" w:lineRule="auto"/>
-            </w:pPr>
-            <w:r>
-              <w:rPr>
-                <w:b/>
-                <w:color w:val="000000"/>
-                <w:sz w:val="20"/>
-              </w:rPr>
-              <w:t>2 Matched acceptance screen</w:t>
-            </w:r>
-          </w:p>
-        </w:tc>
-        <w:tc>
-          <w:tcPr>
-            <w:tcW w:type="dxa" w:w="4608"/>
-            <w:vAlign w:val="center"/>
-            <w:tcMar>
-              <w:top w:w="100" w:type="dxa"/>
-              <w:left w:w="100" w:type="dxa"/>
-              <w:bottom w:w="100" w:type="dxa"/>
-              <w:right w:w="100" w:type="dxa"/>
-            </w:tcMar>
-            <w:shd w:fill="FFFFFF"/>
-          </w:tcPr>
-          <w:p>
-            <w:pPr>
-              <w:widowControl/>
-              <w:spacing w:after="40" w:before="40" w:line="250" w:lineRule="auto"/>
-            </w:pPr>
-            <w:r>
-              <w:rPr>
-                <w:b w:val="0"/>
-                <w:color w:val="000000"/>
-                <w:sz w:val="20"/>
-              </w:rPr>
-              <w:t>2 methods x 12 tuning datasets x 5 solver seeds x 2 forks x 2 budgets, separately for reference at 10/60 seconds and fairness at 5/30 seconds.</w:t>
-            </w:r>
-          </w:p>
-        </w:tc>
-        <w:tc>
-          <w:tcPr>
-            <w:tcW w:type="dxa" w:w="3456"/>
-            <w:vAlign w:val="center"/>
-            <w:tcMar>
-              <w:top w:w="100" w:type="dxa"/>
-              <w:left w:w="100" w:type="dxa"/>
-              <w:bottom w:w="100" w:type="dxa"/>
-              <w:right w:w="100" w:type="dxa"/>
-            </w:tcMar>
-            <w:shd w:fill="FFFFFF"/>
-          </w:tcPr>
-          <w:p>
-            <w:pPr>
-              <w:widowControl/>
-              <w:spacing w:after="40" w:before="40" w:line="250" w:lineRule="auto"/>
-            </w:pPr>
-            <w:r>
-              <w:rPr>
-                <w:b w:val="0"/>
-                <w:color w:val="000000"/>
-                <w:sz w:val="20"/>
-              </w:rPr>
-              <w:t>960 observations total; 7 hours solving plus 16 minutes warmup across 16 batches.</w:t>
-            </w:r>
-          </w:p>
-        </w:tc>
-      </w:tr>
-      <w:tr>
-        <w:trPr>
-          <w:cantSplit/>
-        </w:trPr>
-        <w:tc>
-          <w:tcPr>
-            <w:tcW w:type="dxa" w:w="2016"/>
-            <w:vAlign w:val="center"/>
-            <w:tcMar>
-              <w:top w:w="100" w:type="dxa"/>
-              <w:left w:w="100" w:type="dxa"/>
-              <w:bottom w:w="100" w:type="dxa"/>
-              <w:right w:w="100" w:type="dxa"/>
-            </w:tcMar>
-            <w:shd w:fill="F4F8FB"/>
-          </w:tcPr>
-          <w:p>
-            <w:pPr>
-              <w:widowControl/>
-              <w:spacing w:after="40" w:before="40" w:line="250" w:lineRule="auto"/>
-            </w:pPr>
-            <w:r>
-              <w:rPr>
-                <w:b/>
-                <w:color w:val="000000"/>
-                <w:sz w:val="20"/>
-              </w:rPr>
-              <w:t>3 Optional move screen</w:t>
-            </w:r>
-          </w:p>
-        </w:tc>
-        <w:tc>
-          <w:tcPr>
-            <w:tcW w:type="dxa" w:w="4608"/>
-            <w:vAlign w:val="center"/>
-            <w:tcMar>
-              <w:top w:w="100" w:type="dxa"/>
-              <w:left w:w="100" w:type="dxa"/>
-              <w:bottom w:w="100" w:type="dxa"/>
-              <w:right w:w="100" w:type="dxa"/>
-            </w:tcMar>
-            <w:shd w:fill="F4F8FB"/>
-          </w:tcPr>
-          <w:p>
-            <w:pPr>
-              <w:widowControl/>
-              <w:spacing w:after="40" w:before="40" w:line="250" w:lineRule="auto"/>
-            </w:pPr>
-            <w:r>
-              <w:rPr>
-                <w:b w:val="0"/>
-                <w:color w:val="000000"/>
-                <w:sz w:val="20"/>
-              </w:rPr>
-              <w:t>LA base, LA plus sublist change, LA plus k-opt, LA plus ruin/recreate; each adds only its named family. Same 12 datasets, 5 seeds, 2 forks, reference budgets 10/60 seconds.</w:t>
-            </w:r>
-          </w:p>
-        </w:tc>
-        <w:tc>
-          <w:tcPr>
-            <w:tcW w:type="dxa" w:w="3456"/>
-            <w:vAlign w:val="center"/>
-            <w:tcMar>
-              <w:top w:w="100" w:type="dxa"/>
-              <w:left w:w="100" w:type="dxa"/>
-              <w:bottom w:w="100" w:type="dxa"/>
-              <w:right w:w="100" w:type="dxa"/>
-            </w:tcMar>
-            <w:shd w:fill="F4F8FB"/>
-          </w:tcPr>
-          <w:p>
-            <w:pPr>
-              <w:widowControl/>
-              <w:spacing w:after="40" w:before="40" w:line="250" w:lineRule="auto"/>
-            </w:pPr>
-            <w:r>
-              <w:rPr>
-                <w:b w:val="0"/>
-                <w:color w:val="000000"/>
-                <w:sz w:val="20"/>
-              </w:rPr>
-              <w:t>960 observations; 9 hours 20 minutes solving plus 16 minutes warmup across 16 batches.</w:t>
-            </w:r>
-          </w:p>
-        </w:tc>
-      </w:tr>
-      <w:tr>
-        <w:trPr>
-          <w:cantSplit/>
-        </w:trPr>
-        <w:tc>
-          <w:tcPr>
-            <w:tcW w:type="dxa" w:w="2016"/>
-            <w:vAlign w:val="center"/>
-            <w:tcMar>
-              <w:top w:w="100" w:type="dxa"/>
-              <w:left w:w="100" w:type="dxa"/>
-              <w:bottom w:w="100" w:type="dxa"/>
-              <w:right w:w="100" w:type="dxa"/>
-            </w:tcMar>
-            <w:shd w:fill="FFFFFF"/>
-          </w:tcPr>
-          <w:p>
-            <w:pPr>
-              <w:widowControl/>
-              <w:spacing w:after="40" w:before="40" w:line="250" w:lineRule="auto"/>
-            </w:pPr>
-            <w:r>
-              <w:rPr>
-                <w:b/>
-                <w:color w:val="000000"/>
-                <w:sz w:val="20"/>
-              </w:rPr>
-              <w:t>4 Sealed pipeline confirmation</w:t>
-            </w:r>
-          </w:p>
-        </w:tc>
-        <w:tc>
-          <w:tcPr>
-            <w:tcW w:type="dxa" w:w="4608"/>
-            <w:vAlign w:val="center"/>
-            <w:tcMar>
-              <w:top w:w="100" w:type="dxa"/>
-              <w:left w:w="100" w:type="dxa"/>
-              <w:bottom w:w="100" w:type="dxa"/>
-              <w:right w:w="100" w:type="dxa"/>
-            </w:tcMar>
-            <w:shd w:fill="FFFFFF"/>
-          </w:tcPr>
-          <w:p>
-            <w:pPr>
-              <w:widowControl/>
-              <w:spacing w:after="40" w:before="40" w:line="250" w:lineRule="auto"/>
-            </w:pPr>
-            <w:r>
-              <w:rPr>
-                <w:b w:val="0"/>
-                <w:color w:val="000000"/>
-                <w:sz w:val="20"/>
-              </w:rPr>
-              <w:t>TABU control and one finalist x 12 held-out datasets x 10 seeds x 3 forks x total pipeline budgets 15/60 seconds.</w:t>
-            </w:r>
-          </w:p>
-        </w:tc>
-        <w:tc>
-          <w:tcPr>
-            <w:tcW w:type="dxa" w:w="3456"/>
-            <w:vAlign w:val="center"/>
-            <w:tcMar>
-              <w:top w:w="100" w:type="dxa"/>
-              <w:left w:w="100" w:type="dxa"/>
-              <w:bottom w:w="100" w:type="dxa"/>
-              <w:right w:w="100" w:type="dxa"/>
-            </w:tcMar>
-            <w:shd w:fill="FFFFFF"/>
-          </w:tcPr>
-          <w:p>
-            <w:pPr>
-              <w:widowControl/>
-              <w:spacing w:after="40" w:before="40" w:line="250" w:lineRule="auto"/>
-            </w:pPr>
-            <w:r>
-              <w:rPr>
-                <w:b w:val="0"/>
-                <w:color w:val="000000"/>
-                <w:sz w:val="20"/>
-              </w:rPr>
-              <w:t>1,440 observations; 15 hours solving plus 12 minutes warmup across 12 batches.</w:t>
-            </w:r>
-          </w:p>
-        </w:tc>
-      </w:tr>
-      <w:tr>
-        <w:trPr>
-          <w:cantSplit/>
-        </w:trPr>
-        <w:tc>
-          <w:tcPr>
-            <w:tcW w:type="dxa" w:w="2016"/>
-            <w:vAlign w:val="center"/>
-            <w:tcMar>
-              <w:top w:w="100" w:type="dxa"/>
-              <w:left w:w="100" w:type="dxa"/>
-              <w:bottom w:w="100" w:type="dxa"/>
-              <w:right w:w="100" w:type="dxa"/>
-            </w:tcMar>
-            <w:shd w:fill="F4F8FB"/>
-          </w:tcPr>
-          <w:p>
-            <w:pPr>
-              <w:widowControl/>
-              <w:spacing w:after="40" w:before="40" w:line="250" w:lineRule="auto"/>
-            </w:pPr>
-            <w:r>
-              <w:rPr>
-                <w:b/>
-                <w:color w:val="000000"/>
-                <w:sz w:val="20"/>
-              </w:rPr>
-              <w:t>5 Booking application characterization</w:t>
-            </w:r>
-          </w:p>
-        </w:tc>
-        <w:tc>
-          <w:tcPr>
-            <w:tcW w:type="dxa" w:w="4608"/>
-            <w:vAlign w:val="center"/>
-            <w:tcMar>
-              <w:top w:w="100" w:type="dxa"/>
-              <w:left w:w="100" w:type="dxa"/>
-              <w:bottom w:w="100" w:type="dxa"/>
-              <w:right w:w="100" w:type="dxa"/>
-            </w:tcMar>
-            <w:shd w:fill="F4F8FB"/>
-          </w:tcPr>
-          <w:p>
-            <w:pPr>
-              <w:widowControl/>
-              <w:spacing w:after="40" w:before="40" w:line="250" w:lineRule="auto"/>
-            </w:pPr>
-            <w:r>
-              <w:rPr>
-                <w:b w:val="0"/>
-                <w:color w:val="000000"/>
-                <w:sz w:val="20"/>
-              </w:rPr>
-              <w:t>INSERTION/BOUNDED x fleets 20/50 x scheduler cold/warm x concurrency 1/5/10 x 3 fresh-service repetitions; 200 requests per case.</w:t>
-            </w:r>
-          </w:p>
-        </w:tc>
-        <w:tc>
-          <w:tcPr>
-            <w:tcW w:type="dxa" w:w="3456"/>
-            <w:vAlign w:val="center"/>
-            <w:tcMar>
-              <w:top w:w="100" w:type="dxa"/>
-              <w:left w:w="100" w:type="dxa"/>
-              <w:bottom w:w="100" w:type="dxa"/>
-              <w:right w:w="100" w:type="dxa"/>
-            </w:tcMar>
-            <w:shd w:fill="F4F8FB"/>
-          </w:tcPr>
-          <w:p>
-            <w:pPr>
-              <w:widowControl/>
-              <w:spacing w:after="40" w:before="40" w:line="250" w:lineRule="auto"/>
-            </w:pPr>
-            <w:r>
-              <w:rPr>
-                <w:b w:val="0"/>
-                <w:color w:val="000000"/>
-                <w:sz w:val="20"/>
-              </w:rPr>
-              <w:t>72 cases and 14,400 requests. Estimate wall time from an observed startup/load pilot; request concurrency does not imply linear speedup.</w:t>
+              <w:t>96 observations; 5,760 seconds solving + 2,880 seconds warmup + 384 seconds overhead = 9,024 seconds serial; optimistic 2-worker estimate 4,512 seconds or 75.2 minutes.</w:t>
             </w:r>
           </w:p>
         </w:tc>
@@ -4453,7 +5204,7 @@
         <w:keepLines w:val="0"/>
       </w:pPr>
       <w:r>
-        <w:t>Stages 2 and 3 use dataset seeds 101 and 202 for each fleet/scenario cell; confirmation uses 303 and 404. These are proposed generator inputs, not today's search-seed parameter. Stage 2 uses solver seeds 17, 23, 41, 59, and 83; Stage 4 adds 101, 127, 149, 173, and 199. Reuse the same effective seed schedule across paired treatments and process forks, recording native seed resolution. Stage 1 uses seed 17 and clustered-20 plus absence-50 calibration datasets from the tuning corpus. Forks are repeated execution of the same case, not new geography.</w:t>
+        <w:t>These worked examples are checked in campaign-design.json; they are not measured results or prescribed studies. A batch may amortize warmup across cases in one JVM, but its case grouping and process lifetime must be explicit and matched. Fairness experiments additionally freeze one independently validated control reference per dataset; their setup solves, warmup, and validation are separate estimated work. Booking duration depends on its explicit request count, load mode, startup, cache and timeout settings and needs an observed pilot rather than a fictitious linear concurrency formula.</w:t>
       </w:r>
     </w:p>
     <w:p>
@@ -4461,15 +5212,15 @@
         <w:keepLines w:val="0"/>
       </w:pPr>
       <w:r>
-        <w:t>In Stage 2, fairness references are frozen before measurement using the TABU control with seed 17 and a 60-second reference budget on each tuning dataset. This adds twelve setup solves and at least twelve minutes of search allowance, plus warmup, loading, and validation. Save those outputs even if the control finds no improvement, and use the validated baseline as reference where policy requires it. Setup time is separate from the table's measured campaign allowance.</w:t>
+        <w:t>A campaign cutoff is separate from solve termination. It stops dispatching new comparison blocks, with a block containing matched control/treatment cases and their required warmup. Finish an already dispatched block at its configured allowances; do not silently reduce a solve because the cutoff is near. The cutoff is therefore a dispatch boundary, not an exact stop time. User cancellation or failure may interrupt a block; preserve attempted, missing, failed, cancelled and incomplete rows. Resume completes eligible missing blocks in a new attempt while retaining original evidence and preventing duplicate paired observations.</w:t>
       </w:r>
     </w:p>
     <w:p>
       <w:pPr>
-        <w:keepLines w:val="0"/>
-      </w:pPr>
-      <w:r>
-        <w:t>Stage 3 retains LA history and forager settings throughout and uses an explicitly recorded weight of five for the added sublist/k-opt family and one for ruin/recreate, with existing safe size bounds. These are starting treatments, not established optima. Current nested SUBLIST/KOPT/RUIN_RECREATE variants remain a separate historical suite. SA, cold construction, infeasible repair, Enterprise, and framework changes each need their own follow-on question and cannot be folded into this screen without revising the registered matrix.</w:t>
+        <w:pStyle w:val="Heading2"/>
+      </w:pPr>
+      <w:r>
+        <w:t>Order the studies by the question they answer</w:t>
       </w:r>
     </w:p>
     <w:p>
@@ -4477,7 +5228,23 @@
         <w:keepLines w:val="0"/>
       </w:pPr>
       <w:r>
-        <w:t>Stage 4 keeps the two-thirds reference allocation and transfers actual remaining time to fairness, matching the existing benchmark policy, while recording validation overhead. The fifteen-second cohort is the primary production-budget comparison; sixty seconds is sensitivity analysis and cannot justify a fifteen-second claim. Stage 5 is closed-loop concurrency characterization for compatibility with the existing runner, not an arrival-rate capacity test. Follow it with a separately registered paced-arrival campaign and a daily API campaign before claiming deployment throughput. Browser/address-entry latency remains a separate user-flow measurement.</w:t>
+        <w:t>Begin with contract, independent-validation, assertion, configuration and failure/resume checks, followed by a small non-ranking smoke. Build the dataset, source/configuration receipts, shared-target fairness, deterministic matrix, importer, and uncertainty foundations before timing changes. Next calibrate warmup and outer concurrency for the declared deployment model and establish an allocation/throughput baseline. These are dependencies, not compulsory numbered campaign durations.</w:t>
+      </w:r>
+    </w:p>
+    <w:p>
+      <w:pPr>
+        <w:keepLines w:val="0"/>
+      </w:pPr>
+      <w:r>
+        <w:t>Use that baseline to evaluate termination by algorithm and phase under production allowances, with fixed-budget controls retained. Compare acceptance packages on matched moves; vary one move family when justified. Measure CR07 indexed lookup, score-only evaluation and primitive time arithmetic, TF13 invariant preparation, CR08 score representation, and TF12 reversible aggregates independently after their correctness contracts. Keep diagnostic profiling separate from quality runs when instrumentation differs. Hold out whole datasets, freeze the finalist, then confirm the complete policy pipeline and application behavior at the intended CPU/concurrency envelope.</w:t>
+      </w:r>
+    </w:p>
+    <w:p>
+      <w:pPr>
+        <w:keepLines w:val="0"/>
+      </w:pPr>
+      <w:r>
+        <w:t>Parallel independent JVM cases are preserved in all eligible solver studies. Calibrate P under bounded resources; serial and concurrent cohorts remain separate. Every JVM warms its measured paths, and native internal parallelism stays one. Application studies additionally cover controlled cold starts or warmed services, routing state, paced arrival load, queueing, cancellation, and observable overnight failures. Shadow-variable remodeling remains a later evidence-dependent option. Custom multithreaded move evaluation, solver forks, and Enterprise evaluation are not part of this sequence.</w:t>
       </w:r>
     </w:p>
     <w:p>
@@ -4513,7 +5280,7 @@
         <w:t xml:space="preserve">Quality gate: </w:t>
       </w:r>
       <w:r>
-        <w:t>Select one finalist on tuning data. On the untouched fifteen-second pipeline confirmation, require no additional failures or incomplete results and no overtime increase on any matched valid dataset. Report paired accepted-cost and fairness effects separately. For a cost-led default change, the upper bound of the 95 percent interval for candidate-minus-control accepted cost must be below zero, with no worse mean fairness in any predefined scenario family and no higher scenario-family mean cost. This is a conservative proposed project gate, not a vendor rule or proof of production benefit. A fairness-led change with higher accepted cost requires a separately specified business tradeoff before running that study.</w:t>
+        <w:t>Select one finalist on tuning data. On the untouched production-budget pipeline confirmation, require no additional failures or incomplete results and no overtime increase on any matched valid dataset. Report paired accepted-cost and fairness effects separately. For a cost-led default change, the upper bound of the 95 percent interval for candidate-minus-control accepted cost must be below zero, with no worse mean fairness in any predefined scenario family and no higher scenario-family mean cost. This is a conservative proposed project gate, not a vendor rule or proof of production benefit. A fairness-led change with higher accepted cost requires a separately specified business tradeoff before running that study.</w:t>
       </w:r>
     </w:p>
     <w:p>
@@ -4541,15 +5308,7 @@
         <w:t xml:space="preserve">Implementation sequence: </w:t>
       </w:r>
       <w:r>
-        <w:t>First implement the validated dataset contract, exact money, and independent acceptance boundaries. Second add schema version 2, corpus generation/export, canonical hashes, and a strict result importer. Third add the native adapter and warmed batch lifecycle with failure/resume tests. Fourth add shared-target fairness experiments, traces, and paired analysis. Fifth run calibration and tuning, lock the finalist, and run confirmation. Finally perform application load and cancellation studies. Change one behavior class per PR and preserve production defaults until its gate is met.</w:t>
-      </w:r>
-    </w:p>
-    <w:p>
-      <w:pPr>
-        <w:keepLines w:val="0"/>
-      </w:pPr>
-      <w:r>
-        <w:t>This sequence is better than beginning with a large solver matrix because it makes the matrix interpretable. Otherwise a faster candidate may be faster only because it omitted work, shared an incorrect cost calculation, received different fairness headroom, or ran after a different amount of JIT compilation.</w:t>
+        <w:t>Define CR09 indexed datasets before TF03 validation; resolve TF02/CR02 coverage, TF04 exact money, TF05/CR01 cooperative lifecycle, and independent acceptance. Align policy skips, weighting, overtime consequences, and overnight observability under CR03 through CR05 and TF11. Build the versioned Community configuration, datasets, native adapter, shared targets, import/resume checks, and uncertainty framework. Calibrate warmup/concurrency and profile a baseline before any hot-path optimization. Evaluate independently proven changes and algorithm/phase termination interactions, confirm one locked finalist on held-out production-budget inputs, then measure application load and cleanup. Preserve production defaults until the relevant gates pass and change one behavior class per implementation PR.</w:t>
       </w:r>
     </w:p>
     <w:p>
@@ -4955,7 +5714,7 @@
         <w:keepLines w:val="0"/>
       </w:pPr>
       <w:r>
-        <w:t>The seven audit characterization tests assert existing unsafe behavior. Their passing result reproduces the findings, not their remediation. This delivery also runs the Java nullability build and relevant report/experiment/web gates; exact outcomes and commands belong to the third-review verification receipt. No new performance measurements are used to rank algorithms in this rewrite.</w:t>
+        <w:t>The seven audit characterization tests assert existing unsafe behavior. Their passing result reproduces the findings, not their remediation. The previous edition ran Java nullability and report/experiment/web gates; its third-review receipts remain historical. This documentation revision records fresh helper, evidence, and relevant acceptance checks in fourth-review verification receipts, separately from prior findings. No new performance measurements are used to rank algorithms in this rewrite.</w:t>
       </w:r>
     </w:p>
     <w:p>
@@ -5463,7 +6222,7 @@
                 <w:color w:val="000000"/>
                 <w:sz w:val="20"/>
               </w:rPr>
-              <w:t>Medium: expanded into the benchmark redesign and staged campaigns.</w:t>
+              <w:t>Medium: expanded into configurable benchmark foundations and worked examples.</w:t>
             </w:r>
           </w:p>
         </w:tc>
@@ -5823,7 +6582,7 @@
                 <w:color w:val="000000"/>
                 <w:sz w:val="20"/>
               </w:rPr>
-              <w:t>Medium opportunity: hoist invariant route preparation first. Computation chapter.</w:t>
+              <w:t>Medium opportunity: profile invariant preparation separately from timing allocation. Computation chapter.</w:t>
             </w:r>
           </w:p>
         </w:tc>
@@ -5884,6 +6643,770 @@
                 <w:sz w:val="20"/>
               </w:rPr>
               <w:t>Medium opportunity: bounded expanded generation with search-order validation. Computation chapter.</w:t>
+            </w:r>
+          </w:p>
+        </w:tc>
+      </w:tr>
+    </w:tbl>
+    <w:p>
+      <w:pPr>
+        <w:spacing w:after="80" w:line="60" w:lineRule="exact"/>
+      </w:pPr>
+    </w:p>
+    <w:p>
+      <w:pPr>
+        <w:pStyle w:val="Heading2"/>
+      </w:pPr>
+      <w:r>
+        <w:t>Second review traceability</w:t>
+      </w:r>
+    </w:p>
+    <w:p>
+      <w:pPr>
+        <w:keepLines w:val="0"/>
+      </w:pPr>
+      <w:r>
+        <w:t>The supplied review is preserved unchanged. CR identifiers identify its source-confirmed observations or unmeasured opportunities, not new reproduced fixes. Recommendations below amend unsupported guarantees and commercial assumptions while retaining their traceability.</w:t>
+      </w:r>
+    </w:p>
+    <w:tbl>
+      <w:tblPr>
+        <w:tblW w:type="auto" w:w="0"/>
+        <w:jc w:val="center"/>
+        <w:tblLayout w:type="fixed"/>
+        <w:tblLook w:firstColumn="1" w:firstRow="1" w:lastColumn="0" w:lastRow="0" w:noHBand="0" w:noVBand="1" w:val="04A0"/>
+        <w:tblBorders>
+          <w:top w:val="single" w:sz="4" w:color="D9D9D9"/>
+          <w:left w:val="single" w:sz="4" w:color="D9D9D9"/>
+          <w:bottom w:val="single" w:sz="4" w:color="D9D9D9"/>
+          <w:right w:val="single" w:sz="4" w:color="D9D9D9"/>
+          <w:insideH w:val="single" w:sz="4" w:color="D9D9D9"/>
+          <w:insideV w:val="single" w:sz="4" w:color="D9D9D9"/>
+        </w:tblBorders>
+      </w:tblPr>
+      <w:tblGrid>
+        <w:gridCol w:w="1152"/>
+        <w:gridCol w:w="8928"/>
+      </w:tblGrid>
+      <w:tr>
+        <w:trPr>
+          <w:cantSplit/>
+          <w:tblHeader/>
+        </w:trPr>
+        <w:tc>
+          <w:tcPr>
+            <w:tcW w:type="dxa" w:w="1152"/>
+            <w:vAlign w:val="center"/>
+            <w:tcMar>
+              <w:top w:w="100" w:type="dxa"/>
+              <w:left w:w="100" w:type="dxa"/>
+              <w:bottom w:w="100" w:type="dxa"/>
+              <w:right w:w="100" w:type="dxa"/>
+            </w:tcMar>
+            <w:shd w:fill="DDEBF7"/>
+          </w:tcPr>
+          <w:p>
+            <w:pPr>
+              <w:keepNext/>
+              <w:widowControl/>
+              <w:spacing w:after="40" w:before="40" w:line="250" w:lineRule="auto"/>
+              <w:jc w:val="center"/>
+            </w:pPr>
+            <w:r>
+              <w:rPr>
+                <w:b/>
+                <w:color w:val="000000"/>
+                <w:sz w:val="20"/>
+              </w:rPr>
+              <w:t>Finding</w:t>
+            </w:r>
+          </w:p>
+        </w:tc>
+        <w:tc>
+          <w:tcPr>
+            <w:tcW w:type="dxa" w:w="8928"/>
+            <w:vAlign w:val="center"/>
+            <w:tcMar>
+              <w:top w:w="100" w:type="dxa"/>
+              <w:left w:w="100" w:type="dxa"/>
+              <w:bottom w:w="100" w:type="dxa"/>
+              <w:right w:w="100" w:type="dxa"/>
+            </w:tcMar>
+            <w:shd w:fill="DDEBF7"/>
+          </w:tcPr>
+          <w:p>
+            <w:pPr>
+              <w:keepNext/>
+              <w:widowControl/>
+              <w:spacing w:after="40" w:before="40" w:line="250" w:lineRule="auto"/>
+            </w:pPr>
+            <w:r>
+              <w:rPr>
+                <w:b/>
+                <w:color w:val="000000"/>
+                <w:sz w:val="20"/>
+              </w:rPr>
+              <w:t>Integrated recommendation</w:t>
+            </w:r>
+          </w:p>
+        </w:tc>
+      </w:tr>
+      <w:tr>
+        <w:trPr>
+          <w:cantSplit/>
+        </w:trPr>
+        <w:tc>
+          <w:tcPr>
+            <w:tcW w:type="dxa" w:w="1152"/>
+            <w:vAlign w:val="center"/>
+            <w:tcMar>
+              <w:top w:w="100" w:type="dxa"/>
+              <w:left w:w="100" w:type="dxa"/>
+              <w:bottom w:w="100" w:type="dxa"/>
+              <w:right w:w="100" w:type="dxa"/>
+            </w:tcMar>
+            <w:shd w:fill="FFFFFF"/>
+          </w:tcPr>
+          <w:p>
+            <w:pPr>
+              <w:widowControl/>
+              <w:spacing w:after="40" w:before="40" w:line="250" w:lineRule="auto"/>
+              <w:jc w:val="center"/>
+            </w:pPr>
+            <w:r>
+              <w:rPr>
+                <w:b/>
+                <w:color w:val="000000"/>
+                <w:sz w:val="20"/>
+              </w:rPr>
+              <w:t>CR01</w:t>
+            </w:r>
+          </w:p>
+        </w:tc>
+        <w:tc>
+          <w:tcPr>
+            <w:tcW w:type="dxa" w:w="8928"/>
+            <w:vAlign w:val="center"/>
+            <w:tcMar>
+              <w:top w:w="100" w:type="dxa"/>
+              <w:left w:w="100" w:type="dxa"/>
+              <w:bottom w:w="100" w:type="dxa"/>
+              <w:right w:w="100" w:type="dxa"/>
+            </w:tcMar>
+            <w:shd w:fill="FFFFFF"/>
+          </w:tcPr>
+          <w:p>
+            <w:pPr>
+              <w:widowControl/>
+              <w:spacing w:after="40" w:before="40" w:line="250" w:lineRule="auto"/>
+            </w:pPr>
+            <w:r>
+              <w:rPr>
+                <w:b w:val="0"/>
+                <w:color w:val="000000"/>
+                <w:sz w:val="20"/>
+              </w:rPr>
+              <w:t>TF05 lifecycle and score purity. See the corresponding CR section for current behavior, consequences, guidance, benefits, tradeoffs, and acceptance.</w:t>
+            </w:r>
+          </w:p>
+        </w:tc>
+      </w:tr>
+      <w:tr>
+        <w:trPr>
+          <w:cantSplit/>
+        </w:trPr>
+        <w:tc>
+          <w:tcPr>
+            <w:tcW w:type="dxa" w:w="1152"/>
+            <w:vAlign w:val="center"/>
+            <w:tcMar>
+              <w:top w:w="100" w:type="dxa"/>
+              <w:left w:w="100" w:type="dxa"/>
+              <w:bottom w:w="100" w:type="dxa"/>
+              <w:right w:w="100" w:type="dxa"/>
+            </w:tcMar>
+            <w:shd w:fill="F4F8FB"/>
+          </w:tcPr>
+          <w:p>
+            <w:pPr>
+              <w:widowControl/>
+              <w:spacing w:after="40" w:before="40" w:line="250" w:lineRule="auto"/>
+              <w:jc w:val="center"/>
+            </w:pPr>
+            <w:r>
+              <w:rPr>
+                <w:b/>
+                <w:color w:val="000000"/>
+                <w:sz w:val="20"/>
+              </w:rPr>
+              <w:t>CR02</w:t>
+            </w:r>
+          </w:p>
+        </w:tc>
+        <w:tc>
+          <w:tcPr>
+            <w:tcW w:type="dxa" w:w="8928"/>
+            <w:vAlign w:val="center"/>
+            <w:tcMar>
+              <w:top w:w="100" w:type="dxa"/>
+              <w:left w:w="100" w:type="dxa"/>
+              <w:bottom w:w="100" w:type="dxa"/>
+              <w:right w:w="100" w:type="dxa"/>
+            </w:tcMar>
+            <w:shd w:fill="F4F8FB"/>
+          </w:tcPr>
+          <w:p>
+            <w:pPr>
+              <w:widowControl/>
+              <w:spacing w:after="40" w:before="40" w:line="250" w:lineRule="auto"/>
+            </w:pPr>
+            <w:r>
+              <w:rPr>
+                <w:b w:val="0"/>
+                <w:color w:val="000000"/>
+                <w:sz w:val="20"/>
+              </w:rPr>
+              <w:t>TF02 and TF06 coverage and repair. See the corresponding CR section for current behavior, consequences, guidance, benefits, tradeoffs, and acceptance.</w:t>
+            </w:r>
+          </w:p>
+        </w:tc>
+      </w:tr>
+      <w:tr>
+        <w:trPr>
+          <w:cantSplit/>
+        </w:trPr>
+        <w:tc>
+          <w:tcPr>
+            <w:tcW w:type="dxa" w:w="1152"/>
+            <w:vAlign w:val="center"/>
+            <w:tcMar>
+              <w:top w:w="100" w:type="dxa"/>
+              <w:left w:w="100" w:type="dxa"/>
+              <w:bottom w:w="100" w:type="dxa"/>
+              <w:right w:w="100" w:type="dxa"/>
+            </w:tcMar>
+            <w:shd w:fill="FFFFFF"/>
+          </w:tcPr>
+          <w:p>
+            <w:pPr>
+              <w:widowControl/>
+              <w:spacing w:after="40" w:before="40" w:line="250" w:lineRule="auto"/>
+              <w:jc w:val="center"/>
+            </w:pPr>
+            <w:r>
+              <w:rPr>
+                <w:b/>
+                <w:color w:val="000000"/>
+                <w:sz w:val="20"/>
+              </w:rPr>
+              <w:t>CR03</w:t>
+            </w:r>
+          </w:p>
+        </w:tc>
+        <w:tc>
+          <w:tcPr>
+            <w:tcW w:type="dxa" w:w="8928"/>
+            <w:vAlign w:val="center"/>
+            <w:tcMar>
+              <w:top w:w="100" w:type="dxa"/>
+              <w:left w:w="100" w:type="dxa"/>
+              <w:bottom w:w="100" w:type="dxa"/>
+              <w:right w:w="100" w:type="dxa"/>
+            </w:tcMar>
+            <w:shd w:fill="FFFFFF"/>
+          </w:tcPr>
+          <w:p>
+            <w:pPr>
+              <w:widowControl/>
+              <w:spacing w:after="40" w:before="40" w:line="250" w:lineRule="auto"/>
+            </w:pPr>
+            <w:r>
+              <w:rPr>
+                <w:b w:val="0"/>
+                <w:color w:val="000000"/>
+                <w:sz w:val="20"/>
+              </w:rPr>
+              <w:t>TF11 policy skips and explicit target weighting. See the corresponding CR section for current behavior, consequences, guidance, benefits, tradeoffs, and acceptance.</w:t>
+            </w:r>
+          </w:p>
+        </w:tc>
+      </w:tr>
+      <w:tr>
+        <w:trPr>
+          <w:cantSplit/>
+        </w:trPr>
+        <w:tc>
+          <w:tcPr>
+            <w:tcW w:type="dxa" w:w="1152"/>
+            <w:vAlign w:val="center"/>
+            <w:tcMar>
+              <w:top w:w="100" w:type="dxa"/>
+              <w:left w:w="100" w:type="dxa"/>
+              <w:bottom w:w="100" w:type="dxa"/>
+              <w:right w:w="100" w:type="dxa"/>
+            </w:tcMar>
+            <w:shd w:fill="F4F8FB"/>
+          </w:tcPr>
+          <w:p>
+            <w:pPr>
+              <w:widowControl/>
+              <w:spacing w:after="40" w:before="40" w:line="250" w:lineRule="auto"/>
+              <w:jc w:val="center"/>
+            </w:pPr>
+            <w:r>
+              <w:rPr>
+                <w:b/>
+                <w:color w:val="000000"/>
+                <w:sz w:val="20"/>
+              </w:rPr>
+              <w:t>CR04</w:t>
+            </w:r>
+          </w:p>
+        </w:tc>
+        <w:tc>
+          <w:tcPr>
+            <w:tcW w:type="dxa" w:w="8928"/>
+            <w:vAlign w:val="center"/>
+            <w:tcMar>
+              <w:top w:w="100" w:type="dxa"/>
+              <w:left w:w="100" w:type="dxa"/>
+              <w:bottom w:w="100" w:type="dxa"/>
+              <w:right w:w="100" w:type="dxa"/>
+            </w:tcMar>
+            <w:shd w:fill="F4F8FB"/>
+          </w:tcPr>
+          <w:p>
+            <w:pPr>
+              <w:widowControl/>
+              <w:spacing w:after="40" w:before="40" w:line="250" w:lineRule="auto"/>
+            </w:pPr>
+            <w:r>
+              <w:rPr>
+                <w:b w:val="0"/>
+                <w:color w:val="000000"/>
+                <w:sz w:val="20"/>
+              </w:rPr>
+              <w:t>TF11 zero-overtime consequences. See the corresponding CR section for current behavior, consequences, guidance, benefits, tradeoffs, and acceptance.</w:t>
+            </w:r>
+          </w:p>
+        </w:tc>
+      </w:tr>
+      <w:tr>
+        <w:trPr>
+          <w:cantSplit/>
+        </w:trPr>
+        <w:tc>
+          <w:tcPr>
+            <w:tcW w:type="dxa" w:w="1152"/>
+            <w:vAlign w:val="center"/>
+            <w:tcMar>
+              <w:top w:w="100" w:type="dxa"/>
+              <w:left w:w="100" w:type="dxa"/>
+              <w:bottom w:w="100" w:type="dxa"/>
+              <w:right w:w="100" w:type="dxa"/>
+            </w:tcMar>
+            <w:shd w:fill="FFFFFF"/>
+          </w:tcPr>
+          <w:p>
+            <w:pPr>
+              <w:widowControl/>
+              <w:spacing w:after="40" w:before="40" w:line="250" w:lineRule="auto"/>
+              <w:jc w:val="center"/>
+            </w:pPr>
+            <w:r>
+              <w:rPr>
+                <w:b/>
+                <w:color w:val="000000"/>
+                <w:sz w:val="20"/>
+              </w:rPr>
+              <w:t>CR05</w:t>
+            </w:r>
+          </w:p>
+        </w:tc>
+        <w:tc>
+          <w:tcPr>
+            <w:tcW w:type="dxa" w:w="8928"/>
+            <w:vAlign w:val="center"/>
+            <w:tcMar>
+              <w:top w:w="100" w:type="dxa"/>
+              <w:left w:w="100" w:type="dxa"/>
+              <w:bottom w:w="100" w:type="dxa"/>
+              <w:right w:w="100" w:type="dxa"/>
+            </w:tcMar>
+            <w:shd w:fill="FFFFFF"/>
+          </w:tcPr>
+          <w:p>
+            <w:pPr>
+              <w:widowControl/>
+              <w:spacing w:after="40" w:before="40" w:line="250" w:lineRule="auto"/>
+            </w:pPr>
+            <w:r>
+              <w:rPr>
+                <w:b w:val="0"/>
+                <w:color w:val="000000"/>
+                <w:sz w:val="20"/>
+              </w:rPr>
+              <w:t>TF05 observable overnight failures. See the corresponding CR section for current behavior, consequences, guidance, benefits, tradeoffs, and acceptance.</w:t>
+            </w:r>
+          </w:p>
+        </w:tc>
+      </w:tr>
+      <w:tr>
+        <w:trPr>
+          <w:cantSplit/>
+        </w:trPr>
+        <w:tc>
+          <w:tcPr>
+            <w:tcW w:type="dxa" w:w="1152"/>
+            <w:vAlign w:val="center"/>
+            <w:tcMar>
+              <w:top w:w="100" w:type="dxa"/>
+              <w:left w:w="100" w:type="dxa"/>
+              <w:bottom w:w="100" w:type="dxa"/>
+              <w:right w:w="100" w:type="dxa"/>
+            </w:tcMar>
+            <w:shd w:fill="F4F8FB"/>
+          </w:tcPr>
+          <w:p>
+            <w:pPr>
+              <w:widowControl/>
+              <w:spacing w:after="40" w:before="40" w:line="250" w:lineRule="auto"/>
+              <w:jc w:val="center"/>
+            </w:pPr>
+            <w:r>
+              <w:rPr>
+                <w:b/>
+                <w:color w:val="000000"/>
+                <w:sz w:val="20"/>
+              </w:rPr>
+              <w:t>CR06</w:t>
+            </w:r>
+          </w:p>
+        </w:tc>
+        <w:tc>
+          <w:tcPr>
+            <w:tcW w:type="dxa" w:w="8928"/>
+            <w:vAlign w:val="center"/>
+            <w:tcMar>
+              <w:top w:w="100" w:type="dxa"/>
+              <w:left w:w="100" w:type="dxa"/>
+              <w:bottom w:w="100" w:type="dxa"/>
+              <w:right w:w="100" w:type="dxa"/>
+            </w:tcMar>
+            <w:shd w:fill="F4F8FB"/>
+          </w:tcPr>
+          <w:p>
+            <w:pPr>
+              <w:widowControl/>
+              <w:spacing w:after="40" w:before="40" w:line="250" w:lineRule="auto"/>
+            </w:pPr>
+            <w:r>
+              <w:rPr>
+                <w:b w:val="0"/>
+                <w:color w:val="000000"/>
+                <w:sz w:val="20"/>
+              </w:rPr>
+              <w:t>TF07 algorithm and phase termination studies. See the corresponding CR section for current behavior, consequences, guidance, benefits, tradeoffs, and acceptance.</w:t>
+            </w:r>
+          </w:p>
+        </w:tc>
+      </w:tr>
+      <w:tr>
+        <w:trPr>
+          <w:cantSplit/>
+        </w:trPr>
+        <w:tc>
+          <w:tcPr>
+            <w:tcW w:type="dxa" w:w="1152"/>
+            <w:vAlign w:val="center"/>
+            <w:tcMar>
+              <w:top w:w="100" w:type="dxa"/>
+              <w:left w:w="100" w:type="dxa"/>
+              <w:bottom w:w="100" w:type="dxa"/>
+              <w:right w:w="100" w:type="dxa"/>
+            </w:tcMar>
+            <w:shd w:fill="FFFFFF"/>
+          </w:tcPr>
+          <w:p>
+            <w:pPr>
+              <w:widowControl/>
+              <w:spacing w:after="40" w:before="40" w:line="250" w:lineRule="auto"/>
+              <w:jc w:val="center"/>
+            </w:pPr>
+            <w:r>
+              <w:rPr>
+                <w:b/>
+                <w:color w:val="000000"/>
+                <w:sz w:val="20"/>
+              </w:rPr>
+              <w:t>CR07</w:t>
+            </w:r>
+          </w:p>
+        </w:tc>
+        <w:tc>
+          <w:tcPr>
+            <w:tcW w:type="dxa" w:w="8928"/>
+            <w:vAlign w:val="center"/>
+            <w:tcMar>
+              <w:top w:w="100" w:type="dxa"/>
+              <w:left w:w="100" w:type="dxa"/>
+              <w:bottom w:w="100" w:type="dxa"/>
+              <w:right w:w="100" w:type="dxa"/>
+            </w:tcMar>
+            <w:shd w:fill="FFFFFF"/>
+          </w:tcPr>
+          <w:p>
+            <w:pPr>
+              <w:widowControl/>
+              <w:spacing w:after="40" w:before="40" w:line="250" w:lineRule="auto"/>
+            </w:pPr>
+            <w:r>
+              <w:rPr>
+                <w:b w:val="0"/>
+                <w:color w:val="000000"/>
+                <w:sz w:val="20"/>
+              </w:rPr>
+              <w:t>TF13 profiling and separate timing treatments. See the corresponding CR section for current behavior, consequences, guidance, benefits, tradeoffs, and acceptance.</w:t>
+            </w:r>
+          </w:p>
+        </w:tc>
+      </w:tr>
+      <w:tr>
+        <w:trPr>
+          <w:cantSplit/>
+        </w:trPr>
+        <w:tc>
+          <w:tcPr>
+            <w:tcW w:type="dxa" w:w="1152"/>
+            <w:vAlign w:val="center"/>
+            <w:tcMar>
+              <w:top w:w="100" w:type="dxa"/>
+              <w:left w:w="100" w:type="dxa"/>
+              <w:bottom w:w="100" w:type="dxa"/>
+              <w:right w:w="100" w:type="dxa"/>
+            </w:tcMar>
+            <w:shd w:fill="F4F8FB"/>
+          </w:tcPr>
+          <w:p>
+            <w:pPr>
+              <w:widowControl/>
+              <w:spacing w:after="40" w:before="40" w:line="250" w:lineRule="auto"/>
+              <w:jc w:val="center"/>
+            </w:pPr>
+            <w:r>
+              <w:rPr>
+                <w:b/>
+                <w:color w:val="000000"/>
+                <w:sz w:val="20"/>
+              </w:rPr>
+              <w:t>CR08</w:t>
+            </w:r>
+          </w:p>
+        </w:tc>
+        <w:tc>
+          <w:tcPr>
+            <w:tcW w:type="dxa" w:w="8928"/>
+            <w:vAlign w:val="center"/>
+            <w:tcMar>
+              <w:top w:w="100" w:type="dxa"/>
+              <w:left w:w="100" w:type="dxa"/>
+              <w:bottom w:w="100" w:type="dxa"/>
+              <w:right w:w="100" w:type="dxa"/>
+            </w:tcMar>
+            <w:shd w:fill="F4F8FB"/>
+          </w:tcPr>
+          <w:p>
+            <w:pPr>
+              <w:widowControl/>
+              <w:spacing w:after="40" w:before="40" w:line="250" w:lineRule="auto"/>
+            </w:pPr>
+            <w:r>
+              <w:rPr>
+                <w:b w:val="0"/>
+                <w:color w:val="000000"/>
+                <w:sz w:val="20"/>
+              </w:rPr>
+              <w:t>TF04 and TF12 score representation after numeric contract. See the corresponding CR section for current behavior, consequences, guidance, benefits, tradeoffs, and acceptance.</w:t>
+            </w:r>
+          </w:p>
+        </w:tc>
+      </w:tr>
+      <w:tr>
+        <w:trPr>
+          <w:cantSplit/>
+        </w:trPr>
+        <w:tc>
+          <w:tcPr>
+            <w:tcW w:type="dxa" w:w="1152"/>
+            <w:vAlign w:val="center"/>
+            <w:tcMar>
+              <w:top w:w="100" w:type="dxa"/>
+              <w:left w:w="100" w:type="dxa"/>
+              <w:bottom w:w="100" w:type="dxa"/>
+              <w:right w:w="100" w:type="dxa"/>
+            </w:tcMar>
+            <w:shd w:fill="FFFFFF"/>
+          </w:tcPr>
+          <w:p>
+            <w:pPr>
+              <w:widowControl/>
+              <w:spacing w:after="40" w:before="40" w:line="250" w:lineRule="auto"/>
+              <w:jc w:val="center"/>
+            </w:pPr>
+            <w:r>
+              <w:rPr>
+                <w:b/>
+                <w:color w:val="000000"/>
+                <w:sz w:val="20"/>
+              </w:rPr>
+              <w:t>CR09</w:t>
+            </w:r>
+          </w:p>
+        </w:tc>
+        <w:tc>
+          <w:tcPr>
+            <w:tcW w:type="dxa" w:w="8928"/>
+            <w:vAlign w:val="center"/>
+            <w:tcMar>
+              <w:top w:w="100" w:type="dxa"/>
+              <w:left w:w="100" w:type="dxa"/>
+              <w:bottom w:w="100" w:type="dxa"/>
+              <w:right w:w="100" w:type="dxa"/>
+            </w:tcMar>
+            <w:shd w:fill="FFFFFF"/>
+          </w:tcPr>
+          <w:p>
+            <w:pPr>
+              <w:widowControl/>
+              <w:spacing w:after="40" w:before="40" w:line="250" w:lineRule="auto"/>
+            </w:pPr>
+            <w:r>
+              <w:rPr>
+                <w:b w:val="0"/>
+                <w:color w:val="000000"/>
+                <w:sz w:val="20"/>
+              </w:rPr>
+              <w:t>TF01 and TF03 indexed payload before validation. See the corresponding CR section for current behavior, consequences, guidance, benefits, tradeoffs, and acceptance.</w:t>
+            </w:r>
+          </w:p>
+        </w:tc>
+      </w:tr>
+      <w:tr>
+        <w:trPr>
+          <w:cantSplit/>
+        </w:trPr>
+        <w:tc>
+          <w:tcPr>
+            <w:tcW w:type="dxa" w:w="1152"/>
+            <w:vAlign w:val="center"/>
+            <w:tcMar>
+              <w:top w:w="100" w:type="dxa"/>
+              <w:left w:w="100" w:type="dxa"/>
+              <w:bottom w:w="100" w:type="dxa"/>
+              <w:right w:w="100" w:type="dxa"/>
+            </w:tcMar>
+            <w:shd w:fill="F4F8FB"/>
+          </w:tcPr>
+          <w:p>
+            <w:pPr>
+              <w:widowControl/>
+              <w:spacing w:after="40" w:before="40" w:line="250" w:lineRule="auto"/>
+              <w:jc w:val="center"/>
+            </w:pPr>
+            <w:r>
+              <w:rPr>
+                <w:b/>
+                <w:color w:val="000000"/>
+                <w:sz w:val="20"/>
+              </w:rPr>
+              <w:t>CR10</w:t>
+            </w:r>
+          </w:p>
+        </w:tc>
+        <w:tc>
+          <w:tcPr>
+            <w:tcW w:type="dxa" w:w="8928"/>
+            <w:vAlign w:val="center"/>
+            <w:tcMar>
+              <w:top w:w="100" w:type="dxa"/>
+              <w:left w:w="100" w:type="dxa"/>
+              <w:bottom w:w="100" w:type="dxa"/>
+              <w:right w:w="100" w:type="dxa"/>
+            </w:tcMar>
+            <w:shd w:fill="F4F8FB"/>
+          </w:tcPr>
+          <w:p>
+            <w:pPr>
+              <w:widowControl/>
+              <w:spacing w:after="40" w:before="40" w:line="250" w:lineRule="auto"/>
+            </w:pPr>
+            <w:r>
+              <w:rPr>
+                <w:b w:val="0"/>
+                <w:color w:val="000000"/>
+                <w:sz w:val="20"/>
+              </w:rPr>
+              <w:t>TF09 and TF14 Community alternatives and API status. See the corresponding CR section for current behavior, consequences, guidance, benefits, tradeoffs, and acceptance.</w:t>
+            </w:r>
+          </w:p>
+        </w:tc>
+      </w:tr>
+      <w:tr>
+        <w:trPr>
+          <w:cantSplit/>
+        </w:trPr>
+        <w:tc>
+          <w:tcPr>
+            <w:tcW w:type="dxa" w:w="1152"/>
+            <w:vAlign w:val="center"/>
+            <w:tcMar>
+              <w:top w:w="100" w:type="dxa"/>
+              <w:left w:w="100" w:type="dxa"/>
+              <w:bottom w:w="100" w:type="dxa"/>
+              <w:right w:w="100" w:type="dxa"/>
+            </w:tcMar>
+            <w:shd w:fill="FFFFFF"/>
+          </w:tcPr>
+          <w:p>
+            <w:pPr>
+              <w:widowControl/>
+              <w:spacing w:after="40" w:before="40" w:line="250" w:lineRule="auto"/>
+              <w:jc w:val="center"/>
+            </w:pPr>
+            <w:r>
+              <w:rPr>
+                <w:b/>
+                <w:color w:val="000000"/>
+                <w:sz w:val="20"/>
+              </w:rPr>
+              <w:t>CR11</w:t>
+            </w:r>
+          </w:p>
+        </w:tc>
+        <w:tc>
+          <w:tcPr>
+            <w:tcW w:type="dxa" w:w="8928"/>
+            <w:vAlign w:val="center"/>
+            <w:tcMar>
+              <w:top w:w="100" w:type="dxa"/>
+              <w:left w:w="100" w:type="dxa"/>
+              <w:bottom w:w="100" w:type="dxa"/>
+              <w:right w:w="100" w:type="dxa"/>
+            </w:tcMar>
+            <w:shd w:fill="FFFFFF"/>
+          </w:tcPr>
+          <w:p>
+            <w:pPr>
+              <w:widowControl/>
+              <w:spacing w:after="40" w:before="40" w:line="250" w:lineRule="auto"/>
+            </w:pPr>
+            <w:r>
+              <w:rPr>
+                <w:b w:val="0"/>
+                <w:color w:val="000000"/>
+                <w:sz w:val="20"/>
+              </w:rPr>
+              <w:t>TF13 later shadow variable remodeling. See the corresponding CR section for current behavior, consequences, guidance, benefits, tradeoffs, and acceptance.</w:t>
             </w:r>
           </w:p>
         </w:tc>
@@ -6731,7 +8254,7 @@
                 <w:sz w:val="20"/>
               </w:rPr>
             </w:r>
-            <w:hyperlink r:id="rId23">
+            <w:hyperlink r:id="rId24">
               <w:r>
                 <w:rPr>
                   <w:color w:val="205781"/>
@@ -6805,7 +8328,7 @@
                 <w:sz w:val="20"/>
               </w:rPr>
             </w:r>
-            <w:hyperlink r:id="rId24">
+            <w:hyperlink r:id="rId25">
               <w:r>
                 <w:rPr>
                   <w:color w:val="205781"/>
@@ -6879,7 +8402,7 @@
                 <w:sz w:val="20"/>
               </w:rPr>
             </w:r>
-            <w:hyperlink r:id="rId25">
+            <w:hyperlink r:id="rId26">
               <w:r>
                 <w:rPr>
                   <w:color w:val="205781"/>
@@ -6953,7 +8476,7 @@
                 <w:sz w:val="20"/>
               </w:rPr>
             </w:r>
-            <w:hyperlink r:id="rId26">
+            <w:hyperlink r:id="rId27">
               <w:r>
                 <w:rPr>
                   <w:color w:val="205781"/>
@@ -7027,7 +8550,7 @@
                 <w:sz w:val="20"/>
               </w:rPr>
             </w:r>
-            <w:hyperlink r:id="rId27">
+            <w:hyperlink r:id="rId28">
               <w:r>
                 <w:rPr>
                   <w:color w:val="205781"/>
@@ -7101,7 +8624,7 @@
                 <w:sz w:val="20"/>
               </w:rPr>
             </w:r>
-            <w:hyperlink r:id="rId28">
+            <w:hyperlink r:id="rId29">
               <w:r>
                 <w:rPr>
                   <w:color w:val="205781"/>
@@ -7175,7 +8698,7 @@
                 <w:sz w:val="20"/>
               </w:rPr>
             </w:r>
-            <w:hyperlink r:id="rId29">
+            <w:hyperlink r:id="rId30">
               <w:r>
                 <w:rPr>
                   <w:color w:val="205781"/>
@@ -7249,7 +8772,7 @@
                 <w:sz w:val="20"/>
               </w:rPr>
             </w:r>
-            <w:hyperlink r:id="rId30">
+            <w:hyperlink r:id="rId31">
               <w:r>
                 <w:rPr>
                   <w:color w:val="205781"/>
@@ -7266,7 +8789,7 @@
               </w:rPr>
               <w:t xml:space="preserve"> and </w:t>
             </w:r>
-            <w:hyperlink r:id="rId31">
+            <w:hyperlink r:id="rId32">
               <w:r>
                 <w:rPr>
                   <w:color w:val="205781"/>
@@ -7340,7 +8863,7 @@
                 <w:sz w:val="20"/>
               </w:rPr>
             </w:r>
-            <w:hyperlink r:id="rId32">
+            <w:hyperlink r:id="rId33">
               <w:r>
                 <w:rPr>
                   <w:color w:val="205781"/>
@@ -7414,7 +8937,7 @@
                 <w:sz w:val="20"/>
               </w:rPr>
             </w:r>
-            <w:hyperlink r:id="rId33">
+            <w:hyperlink r:id="rId34">
               <w:r>
                 <w:rPr>
                   <w:color w:val="205781"/>
@@ -7488,7 +9011,7 @@
                 <w:sz w:val="20"/>
               </w:rPr>
             </w:r>
-            <w:hyperlink r:id="rId34">
+            <w:hyperlink r:id="rId35">
               <w:r>
                 <w:rPr>
                   <w:color w:val="205781"/>
@@ -7505,7 +9028,7 @@
               </w:rPr>
               <w:t xml:space="preserve"> and </w:t>
             </w:r>
-            <w:hyperlink r:id="rId35">
+            <w:hyperlink r:id="rId36">
               <w:r>
                 <w:rPr>
                   <w:color w:val="205781"/>
@@ -7579,7 +9102,7 @@
                 <w:sz w:val="20"/>
               </w:rPr>
             </w:r>
-            <w:hyperlink r:id="rId36">
+            <w:hyperlink r:id="rId37">
               <w:r>
                 <w:rPr>
                   <w:color w:val="205781"/>
@@ -7653,7 +9176,7 @@
                 <w:sz w:val="20"/>
               </w:rPr>
             </w:r>
-            <w:hyperlink r:id="rId37">
+            <w:hyperlink r:id="rId38">
               <w:r>
                 <w:rPr>
                   <w:color w:val="205781"/>
@@ -7727,7 +9250,7 @@
                 <w:sz w:val="20"/>
               </w:rPr>
             </w:r>
-            <w:hyperlink r:id="rId38">
+            <w:hyperlink r:id="rId39">
               <w:r>
                 <w:rPr>
                   <w:color w:val="205781"/>
@@ -7744,7 +9267,7 @@
               </w:rPr>
               <w:t xml:space="preserve"> and </w:t>
             </w:r>
-            <w:hyperlink r:id="rId39">
+            <w:hyperlink r:id="rId40">
               <w:r>
                 <w:rPr>
                   <w:color w:val="205781"/>
@@ -7818,7 +9341,7 @@
                 <w:sz w:val="20"/>
               </w:rPr>
             </w:r>
-            <w:hyperlink r:id="rId40">
+            <w:hyperlink r:id="rId41">
               <w:r>
                 <w:rPr>
                   <w:color w:val="205781"/>
@@ -7892,7 +9415,7 @@
                 <w:sz w:val="20"/>
               </w:rPr>
             </w:r>
-            <w:hyperlink r:id="rId41">
+            <w:hyperlink r:id="rId42">
               <w:r>
                 <w:rPr>
                   <w:color w:val="205781"/>
@@ -7966,7 +9489,7 @@
                 <w:sz w:val="20"/>
               </w:rPr>
             </w:r>
-            <w:hyperlink r:id="rId42">
+            <w:hyperlink r:id="rId43">
               <w:r>
                 <w:rPr>
                   <w:color w:val="205781"/>
@@ -8040,7 +9563,7 @@
                 <w:sz w:val="20"/>
               </w:rPr>
             </w:r>
-            <w:hyperlink r:id="rId43">
+            <w:hyperlink r:id="rId44">
               <w:r>
                 <w:rPr>
                   <w:color w:val="205781"/>
@@ -8114,7 +9637,7 @@
                 <w:sz w:val="20"/>
               </w:rPr>
             </w:r>
-            <w:hyperlink r:id="rId44">
+            <w:hyperlink r:id="rId45">
               <w:r>
                 <w:rPr>
                   <w:color w:val="205781"/>
@@ -8131,7 +9654,7 @@
               </w:rPr>
               <w:t xml:space="preserve"> and </w:t>
             </w:r>
-            <w:hyperlink r:id="rId45">
+            <w:hyperlink r:id="rId46">
               <w:r>
                 <w:rPr>
                   <w:color w:val="205781"/>
@@ -8205,7 +9728,7 @@
                 <w:sz w:val="20"/>
               </w:rPr>
             </w:r>
-            <w:hyperlink r:id="rId46">
+            <w:hyperlink r:id="rId47">
               <w:r>
                 <w:rPr>
                   <w:color w:val="205781"/>
@@ -8235,7 +9758,7 @@
         <w:pStyle w:val="Heading2"/>
       </w:pPr>
       <w:r>
-        <w:t>Delivery evidence</w:t>
+        <w:t>Second review code references</w:t>
       </w:r>
     </w:p>
     <w:p>
@@ -8243,15 +9766,1541 @@
         <w:keepLines w:val="0"/>
       </w:pPr>
       <w:r>
-        <w:t>The third-review directory contains source-register.json, campaign-design.json, verification.json, visual-qa.json, and manifest.json. The campaign-design file is a checked specification with calculated counts, not an executable experiment configuration. The verifier validates it independently and ensures that report counts agree. The manifest excludes itself and its final verification output to avoid circular hashes.</w:t>
-      </w:r>
+        <w:t>These references retain the same immutable production baseline as C01 through C20.</w:t>
+      </w:r>
+    </w:p>
+    <w:tbl>
+      <w:tblPr>
+        <w:tblW w:type="auto" w:w="0"/>
+        <w:jc w:val="center"/>
+        <w:tblLayout w:type="fixed"/>
+        <w:tblLook w:firstColumn="1" w:firstRow="1" w:lastColumn="0" w:lastRow="0" w:noHBand="0" w:noVBand="1" w:val="04A0"/>
+        <w:tblBorders>
+          <w:top w:val="single" w:sz="4" w:color="D9D9D9"/>
+          <w:left w:val="single" w:sz="4" w:color="D9D9D9"/>
+          <w:bottom w:val="single" w:sz="4" w:color="D9D9D9"/>
+          <w:right w:val="single" w:sz="4" w:color="D9D9D9"/>
+          <w:insideH w:val="single" w:sz="4" w:color="D9D9D9"/>
+          <w:insideV w:val="single" w:sz="4" w:color="D9D9D9"/>
+        </w:tblBorders>
+      </w:tblPr>
+      <w:tblGrid>
+        <w:gridCol w:w="1008"/>
+        <w:gridCol w:w="9072"/>
+      </w:tblGrid>
+      <w:tr>
+        <w:trPr>
+          <w:cantSplit/>
+          <w:tblHeader/>
+        </w:trPr>
+        <w:tc>
+          <w:tcPr>
+            <w:tcW w:type="dxa" w:w="1008"/>
+            <w:vAlign w:val="center"/>
+            <w:tcMar>
+              <w:top w:w="100" w:type="dxa"/>
+              <w:left w:w="100" w:type="dxa"/>
+              <w:bottom w:w="100" w:type="dxa"/>
+              <w:right w:w="100" w:type="dxa"/>
+            </w:tcMar>
+            <w:shd w:fill="DDEBF7"/>
+          </w:tcPr>
+          <w:p>
+            <w:pPr>
+              <w:keepNext/>
+              <w:widowControl/>
+              <w:spacing w:after="40" w:before="40" w:line="250" w:lineRule="auto"/>
+            </w:pPr>
+            <w:r>
+              <w:rPr>
+                <w:b/>
+                <w:color w:val="000000"/>
+                <w:sz w:val="20"/>
+              </w:rPr>
+              <w:t>Source</w:t>
+            </w:r>
+          </w:p>
+        </w:tc>
+        <w:tc>
+          <w:tcPr>
+            <w:tcW w:type="dxa" w:w="9072"/>
+            <w:vAlign w:val="center"/>
+            <w:tcMar>
+              <w:top w:w="100" w:type="dxa"/>
+              <w:left w:w="100" w:type="dxa"/>
+              <w:bottom w:w="100" w:type="dxa"/>
+              <w:right w:w="100" w:type="dxa"/>
+            </w:tcMar>
+            <w:shd w:fill="DDEBF7"/>
+          </w:tcPr>
+          <w:p>
+            <w:pPr>
+              <w:keepNext/>
+              <w:widowControl/>
+              <w:spacing w:after="40" w:before="40" w:line="250" w:lineRule="auto"/>
+            </w:pPr>
+            <w:r>
+              <w:rPr>
+                <w:b/>
+                <w:color w:val="000000"/>
+                <w:sz w:val="20"/>
+              </w:rPr>
+              <w:t>Reviewed implementation</w:t>
+            </w:r>
+          </w:p>
+        </w:tc>
+      </w:tr>
+      <w:tr>
+        <w:trPr>
+          <w:cantSplit/>
+        </w:trPr>
+        <w:tc>
+          <w:tcPr>
+            <w:tcW w:type="dxa" w:w="1008"/>
+            <w:vAlign w:val="center"/>
+            <w:tcMar>
+              <w:top w:w="100" w:type="dxa"/>
+              <w:left w:w="100" w:type="dxa"/>
+              <w:bottom w:w="100" w:type="dxa"/>
+              <w:right w:w="100" w:type="dxa"/>
+            </w:tcMar>
+            <w:shd w:fill="FFFFFF"/>
+          </w:tcPr>
+          <w:p>
+            <w:pPr>
+              <w:widowControl/>
+              <w:spacing w:after="40" w:before="40" w:line="250" w:lineRule="auto"/>
+            </w:pPr>
+            <w:r>
+              <w:rPr>
+                <w:b/>
+                <w:color w:val="000000"/>
+                <w:sz w:val="20"/>
+              </w:rPr>
+              <w:t>R01</w:t>
+            </w:r>
+          </w:p>
+        </w:tc>
+        <w:tc>
+          <w:tcPr>
+            <w:tcW w:type="dxa" w:w="9072"/>
+            <w:vAlign w:val="center"/>
+            <w:tcMar>
+              <w:top w:w="100" w:type="dxa"/>
+              <w:left w:w="100" w:type="dxa"/>
+              <w:bottom w:w="100" w:type="dxa"/>
+              <w:right w:w="100" w:type="dxa"/>
+            </w:tcMar>
+            <w:shd w:fill="FFFFFF"/>
+          </w:tcPr>
+          <w:p>
+            <w:pPr>
+              <w:widowControl/>
+              <w:spacing w:after="40" w:before="40" w:line="250" w:lineRule="auto"/>
+            </w:pPr>
+            <w:r>
+              <w:rPr>
+                <w:b w:val="0"/>
+                <w:color w:val="000000"/>
+                <w:sz w:val="20"/>
+              </w:rPr>
+            </w:r>
+            <w:hyperlink r:id="rId48">
+              <w:r>
+                <w:rPr>
+                  <w:color w:val="205781"/>
+                  <w:sz w:val="20"/>
+                </w:rPr>
+                <w:t>RouteTimingSearch deadline checkpoints and leg keys</w:t>
+              </w:r>
+            </w:hyperlink>
+            <w:r>
+              <w:rPr>
+                <w:b w:val="0"/>
+                <w:color w:val="000000"/>
+                <w:sz w:val="20"/>
+              </w:rPr>
+            </w:r>
+          </w:p>
+        </w:tc>
+      </w:tr>
+      <w:tr>
+        <w:trPr>
+          <w:cantSplit/>
+        </w:trPr>
+        <w:tc>
+          <w:tcPr>
+            <w:tcW w:type="dxa" w:w="1008"/>
+            <w:vAlign w:val="center"/>
+            <w:tcMar>
+              <w:top w:w="100" w:type="dxa"/>
+              <w:left w:w="100" w:type="dxa"/>
+              <w:bottom w:w="100" w:type="dxa"/>
+              <w:right w:w="100" w:type="dxa"/>
+            </w:tcMar>
+            <w:shd w:fill="F4F8FB"/>
+          </w:tcPr>
+          <w:p>
+            <w:pPr>
+              <w:widowControl/>
+              <w:spacing w:after="40" w:before="40" w:line="250" w:lineRule="auto"/>
+            </w:pPr>
+            <w:r>
+              <w:rPr>
+                <w:b/>
+                <w:color w:val="000000"/>
+                <w:sz w:val="20"/>
+              </w:rPr>
+              <w:t>R02</w:t>
+            </w:r>
+          </w:p>
+        </w:tc>
+        <w:tc>
+          <w:tcPr>
+            <w:tcW w:type="dxa" w:w="9072"/>
+            <w:vAlign w:val="center"/>
+            <w:tcMar>
+              <w:top w:w="100" w:type="dxa"/>
+              <w:left w:w="100" w:type="dxa"/>
+              <w:bottom w:w="100" w:type="dxa"/>
+              <w:right w:w="100" w:type="dxa"/>
+            </w:tcMar>
+            <w:shd w:fill="F4F8FB"/>
+          </w:tcPr>
+          <w:p>
+            <w:pPr>
+              <w:widowControl/>
+              <w:spacing w:after="40" w:before="40" w:line="250" w:lineRule="auto"/>
+            </w:pPr>
+            <w:r>
+              <w:rPr>
+                <w:b w:val="0"/>
+                <w:color w:val="000000"/>
+                <w:sz w:val="20"/>
+              </w:rPr>
+            </w:r>
+            <w:hyperlink r:id="rId49">
+              <w:r>
+                <w:rPr>
+                  <w:color w:val="205781"/>
+                  <w:sz w:val="20"/>
+                </w:rPr>
+                <w:t>SearchDeadline exploration reserve and checkpoint</w:t>
+              </w:r>
+            </w:hyperlink>
+            <w:r>
+              <w:rPr>
+                <w:b w:val="0"/>
+                <w:color w:val="000000"/>
+                <w:sz w:val="20"/>
+              </w:rPr>
+            </w:r>
+          </w:p>
+        </w:tc>
+      </w:tr>
+      <w:tr>
+        <w:trPr>
+          <w:cantSplit/>
+        </w:trPr>
+        <w:tc>
+          <w:tcPr>
+            <w:tcW w:type="dxa" w:w="1008"/>
+            <w:vAlign w:val="center"/>
+            <w:tcMar>
+              <w:top w:w="100" w:type="dxa"/>
+              <w:left w:w="100" w:type="dxa"/>
+              <w:bottom w:w="100" w:type="dxa"/>
+              <w:right w:w="100" w:type="dxa"/>
+            </w:tcMar>
+            <w:shd w:fill="FFFFFF"/>
+          </w:tcPr>
+          <w:p>
+            <w:pPr>
+              <w:widowControl/>
+              <w:spacing w:after="40" w:before="40" w:line="250" w:lineRule="auto"/>
+            </w:pPr>
+            <w:r>
+              <w:rPr>
+                <w:b/>
+                <w:color w:val="000000"/>
+                <w:sz w:val="20"/>
+              </w:rPr>
+              <w:t>R03</w:t>
+            </w:r>
+          </w:p>
+        </w:tc>
+        <w:tc>
+          <w:tcPr>
+            <w:tcW w:type="dxa" w:w="9072"/>
+            <w:vAlign w:val="center"/>
+            <w:tcMar>
+              <w:top w:w="100" w:type="dxa"/>
+              <w:left w:w="100" w:type="dxa"/>
+              <w:bottom w:w="100" w:type="dxa"/>
+              <w:right w:w="100" w:type="dxa"/>
+            </w:tcMar>
+            <w:shd w:fill="FFFFFF"/>
+          </w:tcPr>
+          <w:p>
+            <w:pPr>
+              <w:widowControl/>
+              <w:spacing w:after="40" w:before="40" w:line="250" w:lineRule="auto"/>
+            </w:pPr>
+            <w:r>
+              <w:rPr>
+                <w:b w:val="0"/>
+                <w:color w:val="000000"/>
+                <w:sz w:val="20"/>
+              </w:rPr>
+            </w:r>
+            <w:hyperlink r:id="rId50">
+              <w:r>
+                <w:rPr>
+                  <w:color w:val="205781"/>
+                  <w:sz w:val="20"/>
+                </w:rPr>
+                <w:t>OptimizationService preview admission deadline</w:t>
+              </w:r>
+            </w:hyperlink>
+            <w:r>
+              <w:rPr>
+                <w:b w:val="0"/>
+                <w:color w:val="000000"/>
+                <w:sz w:val="20"/>
+              </w:rPr>
+            </w:r>
+          </w:p>
+        </w:tc>
+      </w:tr>
+      <w:tr>
+        <w:trPr>
+          <w:cantSplit/>
+        </w:trPr>
+        <w:tc>
+          <w:tcPr>
+            <w:tcW w:type="dxa" w:w="1008"/>
+            <w:vAlign w:val="center"/>
+            <w:tcMar>
+              <w:top w:w="100" w:type="dxa"/>
+              <w:left w:w="100" w:type="dxa"/>
+              <w:bottom w:w="100" w:type="dxa"/>
+              <w:right w:w="100" w:type="dxa"/>
+            </w:tcMar>
+            <w:shd w:fill="F4F8FB"/>
+          </w:tcPr>
+          <w:p>
+            <w:pPr>
+              <w:widowControl/>
+              <w:spacing w:after="40" w:before="40" w:line="250" w:lineRule="auto"/>
+            </w:pPr>
+            <w:r>
+              <w:rPr>
+                <w:b/>
+                <w:color w:val="000000"/>
+                <w:sz w:val="20"/>
+              </w:rPr>
+              <w:t>R04</w:t>
+            </w:r>
+          </w:p>
+        </w:tc>
+        <w:tc>
+          <w:tcPr>
+            <w:tcW w:type="dxa" w:w="9072"/>
+            <w:vAlign w:val="center"/>
+            <w:tcMar>
+              <w:top w:w="100" w:type="dxa"/>
+              <w:left w:w="100" w:type="dxa"/>
+              <w:bottom w:w="100" w:type="dxa"/>
+              <w:right w:w="100" w:type="dxa"/>
+            </w:tcMar>
+            <w:shd w:fill="F4F8FB"/>
+          </w:tcPr>
+          <w:p>
+            <w:pPr>
+              <w:widowControl/>
+              <w:spacing w:after="40" w:before="40" w:line="250" w:lineRule="auto"/>
+            </w:pPr>
+            <w:r>
+              <w:rPr>
+                <w:b w:val="0"/>
+                <w:color w:val="000000"/>
+                <w:sz w:val="20"/>
+              </w:rPr>
+            </w:r>
+            <w:hyperlink r:id="rId51">
+              <w:r>
+                <w:rPr>
+                  <w:color w:val="205781"/>
+                  <w:sz w:val="20"/>
+                </w:rPr>
+                <w:t>TechRoute list variable</w:t>
+              </w:r>
+            </w:hyperlink>
+            <w:r>
+              <w:rPr>
+                <w:b w:val="0"/>
+                <w:color w:val="000000"/>
+                <w:sz w:val="20"/>
+              </w:rPr>
+            </w:r>
+          </w:p>
+        </w:tc>
+      </w:tr>
+      <w:tr>
+        <w:trPr>
+          <w:cantSplit/>
+        </w:trPr>
+        <w:tc>
+          <w:tcPr>
+            <w:tcW w:type="dxa" w:w="1008"/>
+            <w:vAlign w:val="center"/>
+            <w:tcMar>
+              <w:top w:w="100" w:type="dxa"/>
+              <w:left w:w="100" w:type="dxa"/>
+              <w:bottom w:w="100" w:type="dxa"/>
+              <w:right w:w="100" w:type="dxa"/>
+            </w:tcMar>
+            <w:shd w:fill="FFFFFF"/>
+          </w:tcPr>
+          <w:p>
+            <w:pPr>
+              <w:widowControl/>
+              <w:spacing w:after="40" w:before="40" w:line="250" w:lineRule="auto"/>
+            </w:pPr>
+            <w:r>
+              <w:rPr>
+                <w:b/>
+                <w:color w:val="000000"/>
+                <w:sz w:val="20"/>
+              </w:rPr>
+              <w:t>R05</w:t>
+            </w:r>
+          </w:p>
+        </w:tc>
+        <w:tc>
+          <w:tcPr>
+            <w:tcW w:type="dxa" w:w="9072"/>
+            <w:vAlign w:val="center"/>
+            <w:tcMar>
+              <w:top w:w="100" w:type="dxa"/>
+              <w:left w:w="100" w:type="dxa"/>
+              <w:bottom w:w="100" w:type="dxa"/>
+              <w:right w:w="100" w:type="dxa"/>
+            </w:tcMar>
+            <w:shd w:fill="FFFFFF"/>
+          </w:tcPr>
+          <w:p>
+            <w:pPr>
+              <w:widowControl/>
+              <w:spacing w:after="40" w:before="40" w:line="250" w:lineRule="auto"/>
+            </w:pPr>
+            <w:r>
+              <w:rPr>
+                <w:b w:val="0"/>
+                <w:color w:val="000000"/>
+                <w:sz w:val="20"/>
+              </w:rPr>
+            </w:r>
+            <w:hyperlink r:id="rId52">
+              <w:r>
+                <w:rPr>
+                  <w:color w:val="205781"/>
+                  <w:sz w:val="20"/>
+                </w:rPr>
+                <w:t>DayConstraintProvider constraints</w:t>
+              </w:r>
+            </w:hyperlink>
+            <w:r>
+              <w:rPr>
+                <w:b w:val="0"/>
+                <w:color w:val="000000"/>
+                <w:sz w:val="20"/>
+              </w:rPr>
+            </w:r>
+          </w:p>
+        </w:tc>
+      </w:tr>
+      <w:tr>
+        <w:trPr>
+          <w:cantSplit/>
+        </w:trPr>
+        <w:tc>
+          <w:tcPr>
+            <w:tcW w:type="dxa" w:w="1008"/>
+            <w:vAlign w:val="center"/>
+            <w:tcMar>
+              <w:top w:w="100" w:type="dxa"/>
+              <w:left w:w="100" w:type="dxa"/>
+              <w:bottom w:w="100" w:type="dxa"/>
+              <w:right w:w="100" w:type="dxa"/>
+            </w:tcMar>
+            <w:shd w:fill="F4F8FB"/>
+          </w:tcPr>
+          <w:p>
+            <w:pPr>
+              <w:widowControl/>
+              <w:spacing w:after="40" w:before="40" w:line="250" w:lineRule="auto"/>
+            </w:pPr>
+            <w:r>
+              <w:rPr>
+                <w:b/>
+                <w:color w:val="000000"/>
+                <w:sz w:val="20"/>
+              </w:rPr>
+              <w:t>R06</w:t>
+            </w:r>
+          </w:p>
+        </w:tc>
+        <w:tc>
+          <w:tcPr>
+            <w:tcW w:type="dxa" w:w="9072"/>
+            <w:vAlign w:val="center"/>
+            <w:tcMar>
+              <w:top w:w="100" w:type="dxa"/>
+              <w:left w:w="100" w:type="dxa"/>
+              <w:bottom w:w="100" w:type="dxa"/>
+              <w:right w:w="100" w:type="dxa"/>
+            </w:tcMar>
+            <w:shd w:fill="F4F8FB"/>
+          </w:tcPr>
+          <w:p>
+            <w:pPr>
+              <w:widowControl/>
+              <w:spacing w:after="40" w:before="40" w:line="250" w:lineRule="auto"/>
+            </w:pPr>
+            <w:r>
+              <w:rPr>
+                <w:b w:val="0"/>
+                <w:color w:val="000000"/>
+                <w:sz w:val="20"/>
+              </w:rPr>
+            </w:r>
+            <w:hyperlink r:id="rId53">
+              <w:r>
+                <w:rPr>
+                  <w:color w:val="205781"/>
+                  <w:sz w:val="20"/>
+                </w:rPr>
+                <w:t>RouteTimeline infeasible fallback</w:t>
+              </w:r>
+            </w:hyperlink>
+            <w:r>
+              <w:rPr>
+                <w:b w:val="0"/>
+                <w:color w:val="000000"/>
+                <w:sz w:val="20"/>
+              </w:rPr>
+            </w:r>
+          </w:p>
+        </w:tc>
+      </w:tr>
+      <w:tr>
+        <w:trPr>
+          <w:cantSplit/>
+        </w:trPr>
+        <w:tc>
+          <w:tcPr>
+            <w:tcW w:type="dxa" w:w="1008"/>
+            <w:vAlign w:val="center"/>
+            <w:tcMar>
+              <w:top w:w="100" w:type="dxa"/>
+              <w:left w:w="100" w:type="dxa"/>
+              <w:bottom w:w="100" w:type="dxa"/>
+              <w:right w:w="100" w:type="dxa"/>
+            </w:tcMar>
+            <w:shd w:fill="FFFFFF"/>
+          </w:tcPr>
+          <w:p>
+            <w:pPr>
+              <w:widowControl/>
+              <w:spacing w:after="40" w:before="40" w:line="250" w:lineRule="auto"/>
+            </w:pPr>
+            <w:r>
+              <w:rPr>
+                <w:b/>
+                <w:color w:val="000000"/>
+                <w:sz w:val="20"/>
+              </w:rPr>
+              <w:t>R07</w:t>
+            </w:r>
+          </w:p>
+        </w:tc>
+        <w:tc>
+          <w:tcPr>
+            <w:tcW w:type="dxa" w:w="9072"/>
+            <w:vAlign w:val="center"/>
+            <w:tcMar>
+              <w:top w:w="100" w:type="dxa"/>
+              <w:left w:w="100" w:type="dxa"/>
+              <w:bottom w:w="100" w:type="dxa"/>
+              <w:right w:w="100" w:type="dxa"/>
+            </w:tcMar>
+            <w:shd w:fill="FFFFFF"/>
+          </w:tcPr>
+          <w:p>
+            <w:pPr>
+              <w:widowControl/>
+              <w:spacing w:after="40" w:before="40" w:line="250" w:lineRule="auto"/>
+            </w:pPr>
+            <w:r>
+              <w:rPr>
+                <w:b w:val="0"/>
+                <w:color w:val="000000"/>
+                <w:sz w:val="20"/>
+              </w:rPr>
+            </w:r>
+            <w:hyperlink r:id="rId54">
+              <w:r>
+                <w:rPr>
+                  <w:color w:val="205781"/>
+                  <w:sz w:val="20"/>
+                </w:rPr>
+                <w:t>OptimizationService reference, fairness, and repair phases</w:t>
+              </w:r>
+            </w:hyperlink>
+            <w:r>
+              <w:rPr>
+                <w:b w:val="0"/>
+                <w:color w:val="000000"/>
+                <w:sz w:val="20"/>
+              </w:rPr>
+            </w:r>
+          </w:p>
+        </w:tc>
+      </w:tr>
+      <w:tr>
+        <w:trPr>
+          <w:cantSplit/>
+        </w:trPr>
+        <w:tc>
+          <w:tcPr>
+            <w:tcW w:type="dxa" w:w="1008"/>
+            <w:vAlign w:val="center"/>
+            <w:tcMar>
+              <w:top w:w="100" w:type="dxa"/>
+              <w:left w:w="100" w:type="dxa"/>
+              <w:bottom w:w="100" w:type="dxa"/>
+              <w:right w:w="100" w:type="dxa"/>
+            </w:tcMar>
+            <w:shd w:fill="F4F8FB"/>
+          </w:tcPr>
+          <w:p>
+            <w:pPr>
+              <w:widowControl/>
+              <w:spacing w:after="40" w:before="40" w:line="250" w:lineRule="auto"/>
+            </w:pPr>
+            <w:r>
+              <w:rPr>
+                <w:b/>
+                <w:color w:val="000000"/>
+                <w:sz w:val="20"/>
+              </w:rPr>
+              <w:t>R08</w:t>
+            </w:r>
+          </w:p>
+        </w:tc>
+        <w:tc>
+          <w:tcPr>
+            <w:tcW w:type="dxa" w:w="9072"/>
+            <w:vAlign w:val="center"/>
+            <w:tcMar>
+              <w:top w:w="100" w:type="dxa"/>
+              <w:left w:w="100" w:type="dxa"/>
+              <w:bottom w:w="100" w:type="dxa"/>
+              <w:right w:w="100" w:type="dxa"/>
+            </w:tcMar>
+            <w:shd w:fill="F4F8FB"/>
+          </w:tcPr>
+          <w:p>
+            <w:pPr>
+              <w:widowControl/>
+              <w:spacing w:after="40" w:before="40" w:line="250" w:lineRule="auto"/>
+            </w:pPr>
+            <w:r>
+              <w:rPr>
+                <w:b w:val="0"/>
+                <w:color w:val="000000"/>
+                <w:sz w:val="20"/>
+              </w:rPr>
+            </w:r>
+            <w:hyperlink r:id="rId55">
+              <w:r>
+                <w:rPr>
+                  <w:color w:val="205781"/>
+                  <w:sz w:val="20"/>
+                </w:rPr>
+                <w:t>SchedulingPolicy.compare overtime prohibition</w:t>
+              </w:r>
+            </w:hyperlink>
+            <w:r>
+              <w:rPr>
+                <w:b w:val="0"/>
+                <w:color w:val="000000"/>
+                <w:sz w:val="20"/>
+              </w:rPr>
+            </w:r>
+          </w:p>
+        </w:tc>
+      </w:tr>
+      <w:tr>
+        <w:trPr>
+          <w:cantSplit/>
+        </w:trPr>
+        <w:tc>
+          <w:tcPr>
+            <w:tcW w:type="dxa" w:w="1008"/>
+            <w:vAlign w:val="center"/>
+            <w:tcMar>
+              <w:top w:w="100" w:type="dxa"/>
+              <w:left w:w="100" w:type="dxa"/>
+              <w:bottom w:w="100" w:type="dxa"/>
+              <w:right w:w="100" w:type="dxa"/>
+            </w:tcMar>
+            <w:shd w:fill="FFFFFF"/>
+          </w:tcPr>
+          <w:p>
+            <w:pPr>
+              <w:widowControl/>
+              <w:spacing w:after="40" w:before="40" w:line="250" w:lineRule="auto"/>
+            </w:pPr>
+            <w:r>
+              <w:rPr>
+                <w:b/>
+                <w:color w:val="000000"/>
+                <w:sz w:val="20"/>
+              </w:rPr>
+              <w:t>R09</w:t>
+            </w:r>
+          </w:p>
+        </w:tc>
+        <w:tc>
+          <w:tcPr>
+            <w:tcW w:type="dxa" w:w="9072"/>
+            <w:vAlign w:val="center"/>
+            <w:tcMar>
+              <w:top w:w="100" w:type="dxa"/>
+              <w:left w:w="100" w:type="dxa"/>
+              <w:bottom w:w="100" w:type="dxa"/>
+              <w:right w:w="100" w:type="dxa"/>
+            </w:tcMar>
+            <w:shd w:fill="FFFFFF"/>
+          </w:tcPr>
+          <w:p>
+            <w:pPr>
+              <w:widowControl/>
+              <w:spacing w:after="40" w:before="40" w:line="250" w:lineRule="auto"/>
+            </w:pPr>
+            <w:r>
+              <w:rPr>
+                <w:b w:val="0"/>
+                <w:color w:val="000000"/>
+                <w:sz w:val="20"/>
+              </w:rPr>
+            </w:r>
+            <w:hyperlink r:id="rId56">
+              <w:r>
+                <w:rPr>
+                  <w:color w:val="205781"/>
+                  <w:sz w:val="20"/>
+                </w:rPr>
+                <w:t>RouteScoringFacts target violation</w:t>
+              </w:r>
+            </w:hyperlink>
+            <w:r>
+              <w:rPr>
+                <w:b w:val="0"/>
+                <w:color w:val="000000"/>
+                <w:sz w:val="20"/>
+              </w:rPr>
+            </w:r>
+          </w:p>
+        </w:tc>
+      </w:tr>
+      <w:tr>
+        <w:trPr>
+          <w:cantSplit/>
+        </w:trPr>
+        <w:tc>
+          <w:tcPr>
+            <w:tcW w:type="dxa" w:w="1008"/>
+            <w:vAlign w:val="center"/>
+            <w:tcMar>
+              <w:top w:w="100" w:type="dxa"/>
+              <w:left w:w="100" w:type="dxa"/>
+              <w:bottom w:w="100" w:type="dxa"/>
+              <w:right w:w="100" w:type="dxa"/>
+            </w:tcMar>
+            <w:shd w:fill="F4F8FB"/>
+          </w:tcPr>
+          <w:p>
+            <w:pPr>
+              <w:widowControl/>
+              <w:spacing w:after="40" w:before="40" w:line="250" w:lineRule="auto"/>
+            </w:pPr>
+            <w:r>
+              <w:rPr>
+                <w:b/>
+                <w:color w:val="000000"/>
+                <w:sz w:val="20"/>
+              </w:rPr>
+              <w:t>R10</w:t>
+            </w:r>
+          </w:p>
+        </w:tc>
+        <w:tc>
+          <w:tcPr>
+            <w:tcW w:type="dxa" w:w="9072"/>
+            <w:vAlign w:val="center"/>
+            <w:tcMar>
+              <w:top w:w="100" w:type="dxa"/>
+              <w:left w:w="100" w:type="dxa"/>
+              <w:bottom w:w="100" w:type="dxa"/>
+              <w:right w:w="100" w:type="dxa"/>
+            </w:tcMar>
+            <w:shd w:fill="F4F8FB"/>
+          </w:tcPr>
+          <w:p>
+            <w:pPr>
+              <w:widowControl/>
+              <w:spacing w:after="40" w:before="40" w:line="250" w:lineRule="auto"/>
+            </w:pPr>
+            <w:r>
+              <w:rPr>
+                <w:b w:val="0"/>
+                <w:color w:val="000000"/>
+                <w:sz w:val="20"/>
+              </w:rPr>
+            </w:r>
+            <w:hyperlink r:id="rId57">
+              <w:r>
+                <w:rPr>
+                  <w:color w:val="205781"/>
+                  <w:sz w:val="20"/>
+                </w:rPr>
+                <w:t>SolverExperiment configuration and solve</w:t>
+              </w:r>
+            </w:hyperlink>
+            <w:r>
+              <w:rPr>
+                <w:b w:val="0"/>
+                <w:color w:val="000000"/>
+                <w:sz w:val="20"/>
+              </w:rPr>
+              <w:t xml:space="preserve"> and </w:t>
+            </w:r>
+            <w:hyperlink r:id="rId58">
+              <w:r>
+                <w:rPr>
+                  <w:color w:val="205781"/>
+                  <w:sz w:val="20"/>
+                </w:rPr>
+                <w:t>DailySolver factory reuse</w:t>
+              </w:r>
+            </w:hyperlink>
+            <w:r>
+              <w:rPr>
+                <w:b w:val="0"/>
+                <w:color w:val="000000"/>
+                <w:sz w:val="20"/>
+              </w:rPr>
+            </w:r>
+          </w:p>
+        </w:tc>
+      </w:tr>
+      <w:tr>
+        <w:trPr>
+          <w:cantSplit/>
+        </w:trPr>
+        <w:tc>
+          <w:tcPr>
+            <w:tcW w:type="dxa" w:w="1008"/>
+            <w:vAlign w:val="center"/>
+            <w:tcMar>
+              <w:top w:w="100" w:type="dxa"/>
+              <w:left w:w="100" w:type="dxa"/>
+              <w:bottom w:w="100" w:type="dxa"/>
+              <w:right w:w="100" w:type="dxa"/>
+            </w:tcMar>
+            <w:shd w:fill="FFFFFF"/>
+          </w:tcPr>
+          <w:p>
+            <w:pPr>
+              <w:widowControl/>
+              <w:spacing w:after="40" w:before="40" w:line="250" w:lineRule="auto"/>
+            </w:pPr>
+            <w:r>
+              <w:rPr>
+                <w:b/>
+                <w:color w:val="000000"/>
+                <w:sz w:val="20"/>
+              </w:rPr>
+              <w:t>R11</w:t>
+            </w:r>
+          </w:p>
+        </w:tc>
+        <w:tc>
+          <w:tcPr>
+            <w:tcW w:type="dxa" w:w="9072"/>
+            <w:vAlign w:val="center"/>
+            <w:tcMar>
+              <w:top w:w="100" w:type="dxa"/>
+              <w:left w:w="100" w:type="dxa"/>
+              <w:bottom w:w="100" w:type="dxa"/>
+              <w:right w:w="100" w:type="dxa"/>
+            </w:tcMar>
+            <w:shd w:fill="FFFFFF"/>
+          </w:tcPr>
+          <w:p>
+            <w:pPr>
+              <w:widowControl/>
+              <w:spacing w:after="40" w:before="40" w:line="250" w:lineRule="auto"/>
+            </w:pPr>
+            <w:r>
+              <w:rPr>
+                <w:b w:val="0"/>
+                <w:color w:val="000000"/>
+                <w:sz w:val="20"/>
+              </w:rPr>
+            </w:r>
+            <w:hyperlink r:id="rId59">
+              <w:r>
+                <w:rPr>
+                  <w:color w:val="205781"/>
+                  <w:sz w:val="20"/>
+                </w:rPr>
+                <w:t>OptimizationService overnight batch</w:t>
+              </w:r>
+            </w:hyperlink>
+            <w:r>
+              <w:rPr>
+                <w:b w:val="0"/>
+                <w:color w:val="000000"/>
+                <w:sz w:val="20"/>
+              </w:rPr>
+            </w:r>
+          </w:p>
+        </w:tc>
+      </w:tr>
+      <w:tr>
+        <w:trPr>
+          <w:cantSplit/>
+        </w:trPr>
+        <w:tc>
+          <w:tcPr>
+            <w:tcW w:type="dxa" w:w="1008"/>
+            <w:vAlign w:val="center"/>
+            <w:tcMar>
+              <w:top w:w="100" w:type="dxa"/>
+              <w:left w:w="100" w:type="dxa"/>
+              <w:bottom w:w="100" w:type="dxa"/>
+              <w:right w:w="100" w:type="dxa"/>
+            </w:tcMar>
+            <w:shd w:fill="F4F8FB"/>
+          </w:tcPr>
+          <w:p>
+            <w:pPr>
+              <w:widowControl/>
+              <w:spacing w:after="40" w:before="40" w:line="250" w:lineRule="auto"/>
+            </w:pPr>
+            <w:r>
+              <w:rPr>
+                <w:b/>
+                <w:color w:val="000000"/>
+                <w:sz w:val="20"/>
+              </w:rPr>
+              <w:t>R12</w:t>
+            </w:r>
+          </w:p>
+        </w:tc>
+        <w:tc>
+          <w:tcPr>
+            <w:tcW w:type="dxa" w:w="9072"/>
+            <w:vAlign w:val="center"/>
+            <w:tcMar>
+              <w:top w:w="100" w:type="dxa"/>
+              <w:left w:w="100" w:type="dxa"/>
+              <w:bottom w:w="100" w:type="dxa"/>
+              <w:right w:w="100" w:type="dxa"/>
+            </w:tcMar>
+            <w:shd w:fill="F4F8FB"/>
+          </w:tcPr>
+          <w:p>
+            <w:pPr>
+              <w:widowControl/>
+              <w:spacing w:after="40" w:before="40" w:line="250" w:lineRule="auto"/>
+            </w:pPr>
+            <w:r>
+              <w:rPr>
+                <w:b w:val="0"/>
+                <w:color w:val="000000"/>
+                <w:sz w:val="20"/>
+              </w:rPr>
+            </w:r>
+            <w:hyperlink r:id="rId60">
+              <w:r>
+                <w:rPr>
+                  <w:color w:val="205781"/>
+                  <w:sz w:val="20"/>
+                </w:rPr>
+                <w:t>Legacy solverConfig termination</w:t>
+              </w:r>
+            </w:hyperlink>
+            <w:r>
+              <w:rPr>
+                <w:b w:val="0"/>
+                <w:color w:val="000000"/>
+                <w:sz w:val="20"/>
+              </w:rPr>
+            </w:r>
+          </w:p>
+        </w:tc>
+      </w:tr>
+      <w:tr>
+        <w:trPr>
+          <w:cantSplit/>
+        </w:trPr>
+        <w:tc>
+          <w:tcPr>
+            <w:tcW w:type="dxa" w:w="1008"/>
+            <w:vAlign w:val="center"/>
+            <w:tcMar>
+              <w:top w:w="100" w:type="dxa"/>
+              <w:left w:w="100" w:type="dxa"/>
+              <w:bottom w:w="100" w:type="dxa"/>
+              <w:right w:w="100" w:type="dxa"/>
+            </w:tcMar>
+            <w:shd w:fill="FFFFFF"/>
+          </w:tcPr>
+          <w:p>
+            <w:pPr>
+              <w:widowControl/>
+              <w:spacing w:after="40" w:before="40" w:line="250" w:lineRule="auto"/>
+            </w:pPr>
+            <w:r>
+              <w:rPr>
+                <w:b/>
+                <w:color w:val="000000"/>
+                <w:sz w:val="20"/>
+              </w:rPr>
+              <w:t>R13</w:t>
+            </w:r>
+          </w:p>
+        </w:tc>
+        <w:tc>
+          <w:tcPr>
+            <w:tcW w:type="dxa" w:w="9072"/>
+            <w:vAlign w:val="center"/>
+            <w:tcMar>
+              <w:top w:w="100" w:type="dxa"/>
+              <w:left w:w="100" w:type="dxa"/>
+              <w:bottom w:w="100" w:type="dxa"/>
+              <w:right w:w="100" w:type="dxa"/>
+            </w:tcMar>
+            <w:shd w:fill="FFFFFF"/>
+          </w:tcPr>
+          <w:p>
+            <w:pPr>
+              <w:widowControl/>
+              <w:spacing w:after="40" w:before="40" w:line="250" w:lineRule="auto"/>
+            </w:pPr>
+            <w:r>
+              <w:rPr>
+                <w:b w:val="0"/>
+                <w:color w:val="000000"/>
+                <w:sz w:val="20"/>
+              </w:rPr>
+            </w:r>
+            <w:hyperlink r:id="rId61">
+              <w:r>
+                <w:rPr>
+                  <w:color w:val="205781"/>
+                  <w:sz w:val="20"/>
+                </w:rPr>
+                <w:t>RouteTimeline evaluate and leg lookups</w:t>
+              </w:r>
+            </w:hyperlink>
+            <w:r>
+              <w:rPr>
+                <w:b w:val="0"/>
+                <w:color w:val="000000"/>
+                <w:sz w:val="20"/>
+              </w:rPr>
+            </w:r>
+          </w:p>
+        </w:tc>
+      </w:tr>
+      <w:tr>
+        <w:trPr>
+          <w:cantSplit/>
+        </w:trPr>
+        <w:tc>
+          <w:tcPr>
+            <w:tcW w:type="dxa" w:w="1008"/>
+            <w:vAlign w:val="center"/>
+            <w:tcMar>
+              <w:top w:w="100" w:type="dxa"/>
+              <w:left w:w="100" w:type="dxa"/>
+              <w:bottom w:w="100" w:type="dxa"/>
+              <w:right w:w="100" w:type="dxa"/>
+            </w:tcMar>
+            <w:shd w:fill="F4F8FB"/>
+          </w:tcPr>
+          <w:p>
+            <w:pPr>
+              <w:widowControl/>
+              <w:spacing w:after="40" w:before="40" w:line="250" w:lineRule="auto"/>
+            </w:pPr>
+            <w:r>
+              <w:rPr>
+                <w:b/>
+                <w:color w:val="000000"/>
+                <w:sz w:val="20"/>
+              </w:rPr>
+              <w:t>R14</w:t>
+            </w:r>
+          </w:p>
+        </w:tc>
+        <w:tc>
+          <w:tcPr>
+            <w:tcW w:type="dxa" w:w="9072"/>
+            <w:vAlign w:val="center"/>
+            <w:tcMar>
+              <w:top w:w="100" w:type="dxa"/>
+              <w:left w:w="100" w:type="dxa"/>
+              <w:bottom w:w="100" w:type="dxa"/>
+              <w:right w:w="100" w:type="dxa"/>
+            </w:tcMar>
+            <w:shd w:fill="F4F8FB"/>
+          </w:tcPr>
+          <w:p>
+            <w:pPr>
+              <w:widowControl/>
+              <w:spacing w:after="40" w:before="40" w:line="250" w:lineRule="auto"/>
+            </w:pPr>
+            <w:r>
+              <w:rPr>
+                <w:b w:val="0"/>
+                <w:color w:val="000000"/>
+                <w:sz w:val="20"/>
+              </w:rPr>
+            </w:r>
+            <w:hyperlink r:id="rId62">
+              <w:r>
+                <w:rPr>
+                  <w:color w:val="205781"/>
+                  <w:sz w:val="20"/>
+                </w:rPr>
+                <w:t>RouteScoringFacts per-route evaluation</w:t>
+              </w:r>
+            </w:hyperlink>
+            <w:r>
+              <w:rPr>
+                <w:b w:val="0"/>
+                <w:color w:val="000000"/>
+                <w:sz w:val="20"/>
+              </w:rPr>
+            </w:r>
+          </w:p>
+        </w:tc>
+      </w:tr>
+      <w:tr>
+        <w:trPr>
+          <w:cantSplit/>
+        </w:trPr>
+        <w:tc>
+          <w:tcPr>
+            <w:tcW w:type="dxa" w:w="1008"/>
+            <w:vAlign w:val="center"/>
+            <w:tcMar>
+              <w:top w:w="100" w:type="dxa"/>
+              <w:left w:w="100" w:type="dxa"/>
+              <w:bottom w:w="100" w:type="dxa"/>
+              <w:right w:w="100" w:type="dxa"/>
+            </w:tcMar>
+            <w:shd w:fill="FFFFFF"/>
+          </w:tcPr>
+          <w:p>
+            <w:pPr>
+              <w:widowControl/>
+              <w:spacing w:after="40" w:before="40" w:line="250" w:lineRule="auto"/>
+            </w:pPr>
+            <w:r>
+              <w:rPr>
+                <w:b/>
+                <w:color w:val="000000"/>
+                <w:sz w:val="20"/>
+              </w:rPr>
+              <w:t>R15</w:t>
+            </w:r>
+          </w:p>
+        </w:tc>
+        <w:tc>
+          <w:tcPr>
+            <w:tcW w:type="dxa" w:w="9072"/>
+            <w:vAlign w:val="center"/>
+            <w:tcMar>
+              <w:top w:w="100" w:type="dxa"/>
+              <w:left w:w="100" w:type="dxa"/>
+              <w:bottom w:w="100" w:type="dxa"/>
+              <w:right w:w="100" w:type="dxa"/>
+            </w:tcMar>
+            <w:shd w:fill="FFFFFF"/>
+          </w:tcPr>
+          <w:p>
+            <w:pPr>
+              <w:widowControl/>
+              <w:spacing w:after="40" w:before="40" w:line="250" w:lineRule="auto"/>
+            </w:pPr>
+            <w:r>
+              <w:rPr>
+                <w:b w:val="0"/>
+                <w:color w:val="000000"/>
+                <w:sz w:val="20"/>
+              </w:rPr>
+            </w:r>
+            <w:hyperlink r:id="rId63">
+              <w:r>
+                <w:rPr>
+                  <w:color w:val="205781"/>
+                  <w:sz w:val="20"/>
+                </w:rPr>
+                <w:t>DayPlan score declaration</w:t>
+              </w:r>
+            </w:hyperlink>
+            <w:r>
+              <w:rPr>
+                <w:b w:val="0"/>
+                <w:color w:val="000000"/>
+                <w:sz w:val="20"/>
+              </w:rPr>
+            </w:r>
+          </w:p>
+        </w:tc>
+      </w:tr>
+      <w:tr>
+        <w:trPr>
+          <w:cantSplit/>
+        </w:trPr>
+        <w:tc>
+          <w:tcPr>
+            <w:tcW w:type="dxa" w:w="1008"/>
+            <w:vAlign w:val="center"/>
+            <w:tcMar>
+              <w:top w:w="100" w:type="dxa"/>
+              <w:left w:w="100" w:type="dxa"/>
+              <w:bottom w:w="100" w:type="dxa"/>
+              <w:right w:w="100" w:type="dxa"/>
+            </w:tcMar>
+            <w:shd w:fill="F4F8FB"/>
+          </w:tcPr>
+          <w:p>
+            <w:pPr>
+              <w:widowControl/>
+              <w:spacing w:after="40" w:before="40" w:line="250" w:lineRule="auto"/>
+            </w:pPr>
+            <w:r>
+              <w:rPr>
+                <w:b/>
+                <w:color w:val="000000"/>
+                <w:sz w:val="20"/>
+              </w:rPr>
+              <w:t>R16</w:t>
+            </w:r>
+          </w:p>
+        </w:tc>
+        <w:tc>
+          <w:tcPr>
+            <w:tcW w:type="dxa" w:w="9072"/>
+            <w:vAlign w:val="center"/>
+            <w:tcMar>
+              <w:top w:w="100" w:type="dxa"/>
+              <w:left w:w="100" w:type="dxa"/>
+              <w:bottom w:w="100" w:type="dxa"/>
+              <w:right w:w="100" w:type="dxa"/>
+            </w:tcMar>
+            <w:shd w:fill="F4F8FB"/>
+          </w:tcPr>
+          <w:p>
+            <w:pPr>
+              <w:widowControl/>
+              <w:spacing w:after="40" w:before="40" w:line="250" w:lineRule="auto"/>
+            </w:pPr>
+            <w:r>
+              <w:rPr>
+                <w:b w:val="0"/>
+                <w:color w:val="000000"/>
+                <w:sz w:val="20"/>
+              </w:rPr>
+            </w:r>
+            <w:hyperlink r:id="rId64">
+              <w:r>
+                <w:rPr>
+                  <w:color w:val="205781"/>
+                  <w:sz w:val="20"/>
+                </w:rPr>
+                <w:t>SchedulingPolicy fairness variance</w:t>
+              </w:r>
+            </w:hyperlink>
+            <w:r>
+              <w:rPr>
+                <w:b w:val="0"/>
+                <w:color w:val="000000"/>
+                <w:sz w:val="20"/>
+              </w:rPr>
+            </w:r>
+          </w:p>
+        </w:tc>
+      </w:tr>
+      <w:tr>
+        <w:trPr>
+          <w:cantSplit/>
+        </w:trPr>
+        <w:tc>
+          <w:tcPr>
+            <w:tcW w:type="dxa" w:w="1008"/>
+            <w:vAlign w:val="center"/>
+            <w:tcMar>
+              <w:top w:w="100" w:type="dxa"/>
+              <w:left w:w="100" w:type="dxa"/>
+              <w:bottom w:w="100" w:type="dxa"/>
+              <w:right w:w="100" w:type="dxa"/>
+            </w:tcMar>
+            <w:shd w:fill="FFFFFF"/>
+          </w:tcPr>
+          <w:p>
+            <w:pPr>
+              <w:widowControl/>
+              <w:spacing w:after="40" w:before="40" w:line="250" w:lineRule="auto"/>
+            </w:pPr>
+            <w:r>
+              <w:rPr>
+                <w:b/>
+                <w:color w:val="000000"/>
+                <w:sz w:val="20"/>
+              </w:rPr>
+              <w:t>R17</w:t>
+            </w:r>
+          </w:p>
+        </w:tc>
+        <w:tc>
+          <w:tcPr>
+            <w:tcW w:type="dxa" w:w="9072"/>
+            <w:vAlign w:val="center"/>
+            <w:tcMar>
+              <w:top w:w="100" w:type="dxa"/>
+              <w:left w:w="100" w:type="dxa"/>
+              <w:bottom w:w="100" w:type="dxa"/>
+              <w:right w:w="100" w:type="dxa"/>
+            </w:tcMar>
+            <w:shd w:fill="FFFFFF"/>
+          </w:tcPr>
+          <w:p>
+            <w:pPr>
+              <w:widowControl/>
+              <w:spacing w:after="40" w:before="40" w:line="250" w:lineRule="auto"/>
+            </w:pPr>
+            <w:r>
+              <w:rPr>
+                <w:b w:val="0"/>
+                <w:color w:val="000000"/>
+                <w:sz w:val="20"/>
+              </w:rPr>
+            </w:r>
+            <w:hyperlink r:id="rId65">
+              <w:r>
+                <w:rPr>
+                  <w:color w:val="205781"/>
+                  <w:sz w:val="20"/>
+                </w:rPr>
+                <w:t>OptimizationService location and matrix preparation</w:t>
+              </w:r>
+            </w:hyperlink>
+            <w:r>
+              <w:rPr>
+                <w:b w:val="0"/>
+                <w:color w:val="000000"/>
+                <w:sz w:val="20"/>
+              </w:rPr>
+            </w:r>
+          </w:p>
+        </w:tc>
+      </w:tr>
+      <w:tr>
+        <w:trPr>
+          <w:cantSplit/>
+        </w:trPr>
+        <w:tc>
+          <w:tcPr>
+            <w:tcW w:type="dxa" w:w="1008"/>
+            <w:vAlign w:val="center"/>
+            <w:tcMar>
+              <w:top w:w="100" w:type="dxa"/>
+              <w:left w:w="100" w:type="dxa"/>
+              <w:bottom w:w="100" w:type="dxa"/>
+              <w:right w:w="100" w:type="dxa"/>
+            </w:tcMar>
+            <w:shd w:fill="F4F8FB"/>
+          </w:tcPr>
+          <w:p>
+            <w:pPr>
+              <w:widowControl/>
+              <w:spacing w:after="40" w:before="40" w:line="250" w:lineRule="auto"/>
+            </w:pPr>
+            <w:r>
+              <w:rPr>
+                <w:b/>
+                <w:color w:val="000000"/>
+                <w:sz w:val="20"/>
+              </w:rPr>
+              <w:t>R18</w:t>
+            </w:r>
+          </w:p>
+        </w:tc>
+        <w:tc>
+          <w:tcPr>
+            <w:tcW w:type="dxa" w:w="9072"/>
+            <w:vAlign w:val="center"/>
+            <w:tcMar>
+              <w:top w:w="100" w:type="dxa"/>
+              <w:left w:w="100" w:type="dxa"/>
+              <w:bottom w:w="100" w:type="dxa"/>
+              <w:right w:w="100" w:type="dxa"/>
+            </w:tcMar>
+            <w:shd w:fill="F4F8FB"/>
+          </w:tcPr>
+          <w:p>
+            <w:pPr>
+              <w:widowControl/>
+              <w:spacing w:after="40" w:before="40" w:line="250" w:lineRule="auto"/>
+            </w:pPr>
+            <w:r>
+              <w:rPr>
+                <w:b w:val="0"/>
+                <w:color w:val="000000"/>
+                <w:sz w:val="20"/>
+              </w:rPr>
+            </w:r>
+            <w:hyperlink r:id="rId66">
+              <w:r>
+                <w:rPr>
+                  <w:color w:val="205781"/>
+                  <w:sz w:val="20"/>
+                </w:rPr>
+                <w:t>RoadClient all-pairs matrix</w:t>
+              </w:r>
+            </w:hyperlink>
+            <w:r>
+              <w:rPr>
+                <w:b w:val="0"/>
+                <w:color w:val="000000"/>
+                <w:sz w:val="20"/>
+              </w:rPr>
+            </w:r>
+          </w:p>
+        </w:tc>
+      </w:tr>
+      <w:tr>
+        <w:trPr>
+          <w:cantSplit/>
+        </w:trPr>
+        <w:tc>
+          <w:tcPr>
+            <w:tcW w:type="dxa" w:w="1008"/>
+            <w:vAlign w:val="center"/>
+            <w:tcMar>
+              <w:top w:w="100" w:type="dxa"/>
+              <w:left w:w="100" w:type="dxa"/>
+              <w:bottom w:w="100" w:type="dxa"/>
+              <w:right w:w="100" w:type="dxa"/>
+            </w:tcMar>
+            <w:shd w:fill="FFFFFF"/>
+          </w:tcPr>
+          <w:p>
+            <w:pPr>
+              <w:widowControl/>
+              <w:spacing w:after="40" w:before="40" w:line="250" w:lineRule="auto"/>
+            </w:pPr>
+            <w:r>
+              <w:rPr>
+                <w:b/>
+                <w:color w:val="000000"/>
+                <w:sz w:val="20"/>
+              </w:rPr>
+              <w:t>R19</w:t>
+            </w:r>
+          </w:p>
+        </w:tc>
+        <w:tc>
+          <w:tcPr>
+            <w:tcW w:type="dxa" w:w="9072"/>
+            <w:vAlign w:val="center"/>
+            <w:tcMar>
+              <w:top w:w="100" w:type="dxa"/>
+              <w:left w:w="100" w:type="dxa"/>
+              <w:bottom w:w="100" w:type="dxa"/>
+              <w:right w:w="100" w:type="dxa"/>
+            </w:tcMar>
+            <w:shd w:fill="FFFFFF"/>
+          </w:tcPr>
+          <w:p>
+            <w:pPr>
+              <w:widowControl/>
+              <w:spacing w:after="40" w:before="40" w:line="250" w:lineRule="auto"/>
+            </w:pPr>
+            <w:r>
+              <w:rPr>
+                <w:b w:val="0"/>
+                <w:color w:val="000000"/>
+                <w:sz w:val="20"/>
+              </w:rPr>
+            </w:r>
+            <w:hyperlink r:id="rId67">
+              <w:r>
+                <w:rPr>
+                  <w:color w:val="205781"/>
+                  <w:sz w:val="20"/>
+                </w:rPr>
+                <w:t>Constraint Streams route map node</w:t>
+              </w:r>
+            </w:hyperlink>
+            <w:r>
+              <w:rPr>
+                <w:b w:val="0"/>
+                <w:color w:val="000000"/>
+                <w:sz w:val="20"/>
+              </w:rPr>
+            </w:r>
+          </w:p>
+        </w:tc>
+      </w:tr>
+    </w:tbl>
+    <w:p>
+      <w:pPr>
+        <w:spacing w:after="80" w:line="60" w:lineRule="exact"/>
+      </w:pPr>
     </w:p>
     <w:p>
       <w:pPr>
+        <w:pStyle w:val="Heading2"/>
+      </w:pPr>
+      <w:r>
+        <w:t>Delivery evidence</w:t>
+      </w:r>
+    </w:p>
+    <w:p>
+      <w:pPr>
         <w:keepLines w:val="0"/>
       </w:pPr>
       <w:r>
-        <w:t>Historical original and second-review files remain byte-identical in Git. Their report and authoring artifacts are verified against the retained baseline commit; new report and helper hashes are verified against the third-review manifest. This preserves the old evidence without requiring the rewritten report to match an obsolete content hash. The PR includes the supplied Markdown guide, PDF, and 113 figure assets. Git preserves the source Markdown bytes, including its original line endings.</w:t>
+        <w:t>The fourth-review directory contains new source, campaign-example, campaign-design, verification, visual-QA and manifest receipts. The example JSON is a checked proposed Community parameter inventory and the design file checks worked arithmetic; neither is accepted by the current runner. The manifest excludes itself and the final verification output to avoid circular hashes.</w:t>
+      </w:r>
+    </w:p>
+    <w:p>
+      <w:pPr>
+        <w:keepLines w:val="0"/>
+      </w:pPr>
+      <w:r>
+        <w:t>Original, second-review and third-review evidence remains byte-identical in Git. Historical report/helper identities are verified against their retained commits. The supplied Timefold_Second_Review.md and .docx are preserved byte for byte and hashed separately. Fresh report and helper hashes belong to fourth-review receipts. Source Markdown, PDF and 113 figures remain included with their original provenance. No historical failure is overwritten and no old measurement is relabeled as new verification.</w:t>
       </w:r>
     </w:p>
     <w:sectPr>

</xml_diff>